<commit_message>
fixed styles in docx input files
</commit_message>
<xml_diff>
--- a/input/ISO_15622.docx
+++ b/input/ISO_15622.docx
@@ -1,10 +1,10 @@
 
 <file path=word/document.xml><?xml version="1.0" encoding="utf-8"?>
-<w:document xmlns:wpc="http://schemas.microsoft.com/office/word/2010/wordprocessingCanvas" xmlns:cx="http://schemas.microsoft.com/office/drawing/2014/chartex" xmlns:cx1="http://schemas.microsoft.com/office/drawing/2015/9/8/chartex" xmlns:mc="http://schemas.openxmlformats.org/markup-compatibility/2006" xmlns:o="urn:schemas-microsoft-com:office:office" xmlns:r="http://schemas.openxmlformats.org/officeDocument/2006/relationships" xmlns:m="http://schemas.openxmlformats.org/officeDocument/2006/math" xmlns:v="urn:schemas-microsoft-com:vml" xmlns:wp14="http://schemas.microsoft.com/office/word/2010/wordprocessingDrawing" xmlns:wp="http://schemas.openxmlformats.org/drawingml/2006/wordprocessingDrawing" xmlns:w10="urn:schemas-microsoft-com:office:word" xmlns:w="http://schemas.openxmlformats.org/wordprocessingml/2006/main" xmlns:w14="http://schemas.microsoft.com/office/word/2010/wordml" xmlns:w15="http://schemas.microsoft.com/office/word/2012/wordml" xmlns:w16se="http://schemas.microsoft.com/office/word/2015/wordml/symex" xmlns:wpg="http://schemas.microsoft.com/office/word/2010/wordprocessingGroup" xmlns:wpi="http://schemas.microsoft.com/office/word/2010/wordprocessingInk" xmlns:wne="http://schemas.microsoft.com/office/word/2006/wordml" xmlns:wps="http://schemas.microsoft.com/office/word/2010/wordprocessingShape" mc:Ignorable="w14 w15 w16se wp14">
+<w:document xmlns:wpc="http://schemas.microsoft.com/office/word/2010/wordprocessingCanvas" xmlns:cx="http://schemas.microsoft.com/office/drawing/2014/chartex" xmlns:cx1="http://schemas.microsoft.com/office/drawing/2015/9/8/chartex" xmlns:cx2="http://schemas.microsoft.com/office/drawing/2015/10/21/chartex" xmlns:cx3="http://schemas.microsoft.com/office/drawing/2016/5/9/chartex" xmlns:cx4="http://schemas.microsoft.com/office/drawing/2016/5/10/chartex" xmlns:cx5="http://schemas.microsoft.com/office/drawing/2016/5/11/chartex" xmlns:cx6="http://schemas.microsoft.com/office/drawing/2016/5/12/chartex" xmlns:cx7="http://schemas.microsoft.com/office/drawing/2016/5/13/chartex" xmlns:cx8="http://schemas.microsoft.com/office/drawing/2016/5/14/chartex" xmlns:mc="http://schemas.openxmlformats.org/markup-compatibility/2006" xmlns:aink="http://schemas.microsoft.com/office/drawing/2016/ink" xmlns:am3d="http://schemas.microsoft.com/office/drawing/2017/model3d" xmlns:o="urn:schemas-microsoft-com:office:office" xmlns:oel="http://schemas.microsoft.com/office/2019/extlst" xmlns:r="http://schemas.openxmlformats.org/officeDocument/2006/relationships" xmlns:m="http://schemas.openxmlformats.org/officeDocument/2006/math" xmlns:v="urn:schemas-microsoft-com:vml" xmlns:wp14="http://schemas.microsoft.com/office/word/2010/wordprocessingDrawing" xmlns:wp="http://schemas.openxmlformats.org/drawingml/2006/wordprocessingDrawing" xmlns:w10="urn:schemas-microsoft-com:office:word" xmlns:w="http://schemas.openxmlformats.org/wordprocessingml/2006/main" xmlns:w14="http://schemas.microsoft.com/office/word/2010/wordml" xmlns:w15="http://schemas.microsoft.com/office/word/2012/wordml" xmlns:w16cex="http://schemas.microsoft.com/office/word/2018/wordml/cex" xmlns:w16cid="http://schemas.microsoft.com/office/word/2016/wordml/cid" xmlns:w16="http://schemas.microsoft.com/office/word/2018/wordml" xmlns:w16du="http://schemas.microsoft.com/office/word/2023/wordml/word16du" xmlns:w16sdtdh="http://schemas.microsoft.com/office/word/2020/wordml/sdtdatahash" xmlns:w16sdtfl="http://schemas.microsoft.com/office/word/2024/wordml/sdtformatlock" xmlns:w16se="http://schemas.microsoft.com/office/word/2015/wordml/symex" xmlns:wpg="http://schemas.microsoft.com/office/word/2010/wordprocessingGroup" xmlns:wpi="http://schemas.microsoft.com/office/word/2010/wordprocessingInk" xmlns:wne="http://schemas.microsoft.com/office/word/2006/wordml" xmlns:wps="http://schemas.microsoft.com/office/word/2010/wordprocessingShape" mc:Ignorable="w14 w15 w16se w16cid w16 w16cex w16sdtdh w16sdtfl w16du wp14">
   <w:body>
     <w:p>
       <w:pPr>
-        <w:pStyle w:val="Nzev"/>
+        <w:pStyle w:val="Title"/>
         <w:spacing w:before="0" w:line="276" w:lineRule="auto"/>
         <w:outlineLvl w:val="9"/>
         <w:rPr>
@@ -555,7 +555,7 @@
     </w:tbl>
     <w:p>
       <w:pPr>
-        <w:pStyle w:val="Titulek"/>
+        <w:pStyle w:val="Caption"/>
         <w:jc w:val="right"/>
         <w:rPr>
           <w:lang w:val="en-GB"/>
@@ -666,7 +666,7 @@
     </w:p>
     <w:p>
       <w:pPr>
-        <w:pStyle w:val="Nadpis1"/>
+        <w:pStyle w:val="Heading1"/>
       </w:pPr>
       <w:bookmarkStart w:id="1" w:name="_Toc359251365"/>
       <w:bookmarkStart w:id="2" w:name="_Toc359251523"/>
@@ -699,7 +699,7 @@
     </w:p>
     <w:p>
       <w:pPr>
-        <w:pStyle w:val="Nadpis1"/>
+        <w:pStyle w:val="Heading1"/>
       </w:pPr>
       <w:r>
         <w:t>Introduction</w:t>
@@ -1157,7 +1157,7 @@
     </w:p>
     <w:p>
       <w:pPr>
-        <w:pStyle w:val="Nadpis1"/>
+        <w:pStyle w:val="Heading1"/>
       </w:pPr>
       <w:r>
         <w:t>Usage</w:t>
@@ -1180,7 +1180,7 @@
     </w:p>
     <w:p>
       <w:pPr>
-        <w:pStyle w:val="Nadpis1"/>
+        <w:pStyle w:val="Heading1"/>
       </w:pPr>
       <w:r>
         <w:lastRenderedPageBreak/>
@@ -1246,7 +1246,7 @@
     </w:p>
     <w:p>
       <w:pPr>
-        <w:pStyle w:val="Nadpis1"/>
+        <w:pStyle w:val="Heading1"/>
       </w:pPr>
       <w:r>
         <w:t>Related Documents</w:t>
@@ -1356,7 +1356,7 @@
     </w:p>
     <w:p>
       <w:pPr>
-        <w:pStyle w:val="Nadpis1"/>
+        <w:pStyle w:val="Heading1"/>
       </w:pPr>
       <w:bookmarkStart w:id="30" w:name="_Toc473558467"/>
       <w:bookmarkEnd w:id="29"/>
@@ -1456,29 +1456,42 @@
           <w:lang w:val="en-GB"/>
         </w:rPr>
       </w:pPr>
-      <w:proofErr w:type="gramStart"/>
       <w:r>
         <w:rPr>
           <w:b/>
           <w:bCs/>
           <w:lang w:val="en-GB"/>
         </w:rPr>
-        <w:t>active</w:t>
-      </w:r>
-      <w:proofErr w:type="gramEnd"/>
+        <w:t>active brake control</w:t>
+      </w:r>
+      <w:r>
+        <w:rPr>
+          <w:lang w:val="en-GB"/>
+        </w:rPr>
+        <w:t xml:space="preserve"> — function that causes application of the brake(s), not applied by the driver, in this case controlled by the ACC system.</w:t>
+      </w:r>
+    </w:p>
+    <w:p>
+      <w:pPr>
+        <w:pStyle w:val="Textnormy"/>
+        <w:spacing w:line="276" w:lineRule="auto"/>
+        <w:rPr>
+          <w:lang w:val="en-GB"/>
+        </w:rPr>
+      </w:pPr>
       <w:r>
         <w:rPr>
           <w:b/>
           <w:bCs/>
           <w:lang w:val="en-GB"/>
         </w:rPr>
-        <w:t xml:space="preserve"> brake control</w:t>
-      </w:r>
-      <w:r>
-        <w:rPr>
-          <w:lang w:val="en-GB"/>
-        </w:rPr>
-        <w:t xml:space="preserve"> — function that causes application of the brake(s), not applied by the driver, in this case controlled by the ACC system.</w:t>
+        <w:t>Adaptive Cruise Control (ACC)</w:t>
+      </w:r>
+      <w:r>
+        <w:rPr>
+          <w:lang w:val="en-GB"/>
+        </w:rPr>
+        <w:t xml:space="preserve"> — enhancement to conventional cruise control systems that allows the subject vehicle to follow a forward vehicle at an appropriate distance by controlling the engine and/or power train and potentially the brake.</w:t>
       </w:r>
     </w:p>
     <w:p>
@@ -1495,13 +1508,25 @@
           <w:bCs/>
           <w:lang w:val="en-GB"/>
         </w:rPr>
-        <w:t>Adaptive Cruise Control (ACC)</w:t>
-      </w:r>
-      <w:r>
-        <w:rPr>
-          <w:lang w:val="en-GB"/>
-        </w:rPr>
-        <w:t xml:space="preserve"> — enhancement to conventional cruise control systems that allows the subject vehicle to follow a forward vehicle at an appropriate distance by controlling the engine and/or power train and potentially the brake.</w:t>
+        <w:t>brake</w:t>
+      </w:r>
+      <w:r>
+        <w:rPr>
+          <w:lang w:val="en-GB"/>
+        </w:rPr>
+        <w:t xml:space="preserve"> </w:t>
+      </w:r>
+      <w:r>
+        <w:rPr>
+          <w:lang w:val="en-GB"/>
+        </w:rPr>
+        <w:t>–</w:t>
+      </w:r>
+      <w:r>
+        <w:rPr>
+          <w:lang w:val="en-GB"/>
+        </w:rPr>
+        <w:t xml:space="preserve"> part in which the forces opposing the movement of the vehicle develop.</w:t>
       </w:r>
     </w:p>
     <w:p>
@@ -1512,16 +1537,14 @@
           <w:lang w:val="en-GB"/>
         </w:rPr>
       </w:pPr>
-      <w:proofErr w:type="gramStart"/>
       <w:r>
         <w:rPr>
           <w:b/>
           <w:bCs/>
           <w:lang w:val="en-GB"/>
         </w:rPr>
-        <w:t>brake</w:t>
-      </w:r>
-      <w:proofErr w:type="gramEnd"/>
+        <w:t>clearance</w:t>
+      </w:r>
       <w:r>
         <w:rPr>
           <w:lang w:val="en-GB"/>
@@ -1538,7 +1561,7 @@
         <w:rPr>
           <w:lang w:val="en-GB"/>
         </w:rPr>
-        <w:t xml:space="preserve"> part in which the forces opposing the movement of the vehicle develop.</w:t>
+        <w:t xml:space="preserve"> distance from the forward vehicle’s trailing surface to the subject vehicle’s leading surface.</w:t>
       </w:r>
     </w:p>
     <w:p>
@@ -1549,33 +1572,25 @@
           <w:lang w:val="en-GB"/>
         </w:rPr>
       </w:pPr>
-      <w:proofErr w:type="gramStart"/>
       <w:r>
         <w:rPr>
           <w:b/>
           <w:bCs/>
           <w:lang w:val="en-GB"/>
         </w:rPr>
-        <w:t>clearance</w:t>
-      </w:r>
-      <w:proofErr w:type="gramEnd"/>
-      <w:r>
-        <w:rPr>
-          <w:lang w:val="en-GB"/>
-        </w:rPr>
-        <w:t xml:space="preserve"> </w:t>
-      </w:r>
-      <w:r>
-        <w:rPr>
-          <w:lang w:val="en-GB"/>
-        </w:rPr>
-        <w:t>–</w:t>
-      </w:r>
-      <w:r>
-        <w:rPr>
-          <w:lang w:val="en-GB"/>
-        </w:rPr>
-        <w:t xml:space="preserve"> distance from the forward vehicle’s trailing surface to the subject vehicle’s leading surface.</w:t>
+        <w:t>time gap (τ)</w:t>
+      </w:r>
+      <w:r>
+        <w:rPr>
+          <w:lang w:val="en-GB"/>
+        </w:rPr>
+        <w:t xml:space="preserve"> –</w:t>
+      </w:r>
+      <w:r>
+        <w:rPr>
+          <w:lang w:val="en-GB"/>
+        </w:rPr>
+        <w:t xml:space="preserve"> time gap calculated as clearance divided by vehicle speed.</w:t>
       </w:r>
     </w:p>
     <w:p>
@@ -1586,23 +1601,48 @@
           <w:lang w:val="en-GB"/>
         </w:rPr>
       </w:pPr>
-      <w:proofErr w:type="gramStart"/>
       <w:r>
         <w:rPr>
           <w:b/>
           <w:bCs/>
           <w:lang w:val="en-GB"/>
         </w:rPr>
-        <w:t>time</w:t>
-      </w:r>
-      <w:proofErr w:type="gramEnd"/>
+        <w:t>subject vehicle</w:t>
+      </w:r>
+      <w:r>
+        <w:rPr>
+          <w:lang w:val="en-GB"/>
+        </w:rPr>
+        <w:t xml:space="preserve"> </w:t>
+      </w:r>
+      <w:r>
+        <w:rPr>
+          <w:lang w:val="en-GB"/>
+        </w:rPr>
+        <w:t>–</w:t>
+      </w:r>
+      <w:r>
+        <w:rPr>
+          <w:lang w:val="en-GB"/>
+        </w:rPr>
+        <w:t xml:space="preserve"> vehicle equipped with the ACC system in question.</w:t>
+      </w:r>
+    </w:p>
+    <w:p>
+      <w:pPr>
+        <w:pStyle w:val="Textnormy"/>
+        <w:spacing w:line="276" w:lineRule="auto"/>
+        <w:rPr>
+          <w:lang w:val="en-GB"/>
+        </w:rPr>
+      </w:pPr>
       <w:r>
         <w:rPr>
           <w:b/>
           <w:bCs/>
           <w:lang w:val="en-GB"/>
         </w:rPr>
-        <w:t xml:space="preserve"> gap (τ)</w:t>
+        <w:t>target vehicle</w:t>
       </w:r>
       <w:r>
         <w:rPr>
@@ -1614,7 +1654,7 @@
         <w:rPr>
           <w:lang w:val="en-GB"/>
         </w:rPr>
-        <w:t xml:space="preserve"> time gap calculated as clearance divided by vehicle speed.</w:t>
+        <w:t xml:space="preserve"> vehicle followed by the subject vehicle.</w:t>
       </w:r>
     </w:p>
     <w:p>
@@ -1625,23 +1665,42 @@
           <w:lang w:val="en-GB"/>
         </w:rPr>
       </w:pPr>
-      <w:proofErr w:type="gramStart"/>
       <w:r>
         <w:rPr>
           <w:b/>
           <w:bCs/>
           <w:lang w:val="en-GB"/>
         </w:rPr>
-        <w:t>subject</w:t>
-      </w:r>
-      <w:proofErr w:type="gramEnd"/>
+        <w:t>Full Speed Range Adaptive Cruise Control (FSRA)</w:t>
+      </w:r>
+      <w:r>
+        <w:rPr>
+          <w:lang w:val="en-GB"/>
+        </w:rPr>
+        <w:t xml:space="preserve"> –</w:t>
+      </w:r>
+      <w:r>
+        <w:rPr>
+          <w:lang w:val="en-GB"/>
+        </w:rPr>
+        <w:t xml:space="preserve"> class of ACC systems allowing the subject vehicle to follow a forward vehicle by controlling the engine, power train and brake down to standstill.</w:t>
+      </w:r>
+    </w:p>
+    <w:p>
+      <w:pPr>
+        <w:pStyle w:val="Textnormy"/>
+        <w:spacing w:line="276" w:lineRule="auto"/>
+        <w:rPr>
+          <w:lang w:val="en-GB"/>
+        </w:rPr>
+      </w:pPr>
       <w:r>
         <w:rPr>
           <w:b/>
           <w:bCs/>
           <w:lang w:val="en-GB"/>
         </w:rPr>
-        <w:t xml:space="preserve"> vehicle</w:t>
+        <w:t>Limited Speed Range Adaptive Cruise Control (LSRA)</w:t>
       </w:r>
       <w:r>
         <w:rPr>
@@ -1659,7 +1718,7 @@
         <w:rPr>
           <w:lang w:val="en-GB"/>
         </w:rPr>
-        <w:t xml:space="preserve"> vehicle equipped with the ACC system in question.</w:t>
+        <w:t xml:space="preserve"> class of ACC systems allowing adaptive following only above a defined minimum operational speed.</w:t>
       </w:r>
     </w:p>
     <w:p>
@@ -1670,133 +1729,16 @@
           <w:lang w:val="en-GB"/>
         </w:rPr>
       </w:pPr>
-      <w:proofErr w:type="gramStart"/>
-      <w:r>
-        <w:rPr>
-          <w:b/>
-          <w:bCs/>
-          <w:lang w:val="en-GB"/>
-        </w:rPr>
-        <w:t>target</w:t>
-      </w:r>
-      <w:proofErr w:type="gramEnd"/>
-      <w:r>
-        <w:rPr>
-          <w:b/>
-          <w:bCs/>
-          <w:lang w:val="en-GB"/>
-        </w:rPr>
-        <w:t xml:space="preserve"> vehicle</w:t>
-      </w:r>
-      <w:r>
-        <w:rPr>
-          <w:lang w:val="en-GB"/>
-        </w:rPr>
-        <w:t xml:space="preserve"> –</w:t>
-      </w:r>
-      <w:r>
-        <w:rPr>
-          <w:lang w:val="en-GB"/>
-        </w:rPr>
-        <w:t xml:space="preserve"> vehicle followed by the subject vehicle.</w:t>
+      <w:r>
+        <w:rPr>
+          <w:lang w:val="en-GB"/>
+        </w:rPr>
+        <w:t>Additional ITS-related terminology may be found in dedicated ITS terminology databases.</w:t>
       </w:r>
     </w:p>
     <w:p>
       <w:pPr>
-        <w:pStyle w:val="Textnormy"/>
-        <w:spacing w:line="276" w:lineRule="auto"/>
-        <w:rPr>
-          <w:lang w:val="en-GB"/>
-        </w:rPr>
-      </w:pPr>
-      <w:r>
-        <w:rPr>
-          <w:b/>
-          <w:bCs/>
-          <w:lang w:val="en-GB"/>
-        </w:rPr>
-        <w:t>Full Speed Range Adaptive Cruise Control (FSRA)</w:t>
-      </w:r>
-      <w:r>
-        <w:rPr>
-          <w:lang w:val="en-GB"/>
-        </w:rPr>
-        <w:t xml:space="preserve"> –</w:t>
-      </w:r>
-      <w:r>
-        <w:rPr>
-          <w:lang w:val="en-GB"/>
-        </w:rPr>
-        <w:t xml:space="preserve"> class of ACC systems allowing the subject vehicle to follow a forward vehicle by controlling the engine, power train and brake down to standstill.</w:t>
-      </w:r>
-    </w:p>
-    <w:p>
-      <w:pPr>
-        <w:pStyle w:val="Textnormy"/>
-        <w:spacing w:line="276" w:lineRule="auto"/>
-        <w:rPr>
-          <w:lang w:val="en-GB"/>
-        </w:rPr>
-      </w:pPr>
-      <w:r>
-        <w:rPr>
-          <w:b/>
-          <w:bCs/>
-          <w:lang w:val="en-GB"/>
-        </w:rPr>
-        <w:t>Limited Speed Range Adaptive Cruise Control (LSRA)</w:t>
-      </w:r>
-      <w:r>
-        <w:rPr>
-          <w:lang w:val="en-GB"/>
-        </w:rPr>
-        <w:t xml:space="preserve"> </w:t>
-      </w:r>
-      <w:r>
-        <w:rPr>
-          <w:lang w:val="en-GB"/>
-        </w:rPr>
-        <w:t>–</w:t>
-      </w:r>
-      <w:r>
-        <w:rPr>
-          <w:lang w:val="en-GB"/>
-        </w:rPr>
-        <w:t xml:space="preserve"> class of ACC systems allowing adaptive following only above a defined minimum operational speed.</w:t>
-      </w:r>
-    </w:p>
-    <w:p>
-      <w:pPr>
-        <w:pStyle w:val="Textnormy"/>
-        <w:spacing w:line="276" w:lineRule="auto"/>
-        <w:rPr>
-          <w:lang w:val="en-GB"/>
-        </w:rPr>
-      </w:pPr>
-      <w:r>
-        <w:rPr>
-          <w:lang w:val="en-GB"/>
-        </w:rPr>
-        <w:t xml:space="preserve">Additional </w:t>
-      </w:r>
-      <w:proofErr w:type="gramStart"/>
-      <w:r>
-        <w:rPr>
-          <w:lang w:val="en-GB"/>
-        </w:rPr>
-        <w:t>ITS-</w:t>
-      </w:r>
-      <w:proofErr w:type="gramEnd"/>
-      <w:r>
-        <w:rPr>
-          <w:lang w:val="en-GB"/>
-        </w:rPr>
-        <w:t>related terminology may be found in dedicated ITS terminology databases.</w:t>
-      </w:r>
-    </w:p>
-    <w:p>
-      <w:pPr>
-        <w:pStyle w:val="Nadpis1"/>
+        <w:pStyle w:val="Heading1"/>
       </w:pPr>
       <w:r>
         <w:t>4</w:t>
@@ -1972,7 +1914,7 @@
       <w:hyperlink r:id="rId9" w:tooltip="http://www.itsterminology.org" w:history="1">
         <w:r>
           <w:rPr>
-            <w:rStyle w:val="Hypertextovodkaz"/>
+            <w:rStyle w:val="Hyperlink"/>
           </w:rPr>
           <w:t>www.itsterminology.org</w:t>
         </w:r>
@@ -1988,12 +1930,14 @@
       <w:r>
         <w:t xml:space="preserve"> </w:t>
       </w:r>
+      <w:proofErr w:type="spellStart"/>
       <w:r>
         <w:rPr>
           <w:i/>
         </w:rPr>
         <w:t>StandardLand</w:t>
       </w:r>
+      <w:proofErr w:type="spellEnd"/>
       <w:r>
         <w:t xml:space="preserve"> </w:t>
       </w:r>
@@ -2008,7 +1952,7 @@
       <w:hyperlink r:id="rId10" w:tooltip="http://www.standardland.cz" w:history="1">
         <w:r>
           <w:rPr>
-            <w:rStyle w:val="Hypertextovodkaz"/>
+            <w:rStyle w:val="Hyperlink"/>
           </w:rPr>
           <w:t>www.standardland.cz</w:t>
         </w:r>
@@ -2052,7 +1996,7 @@
       <w:hyperlink r:id="rId11" w:tooltip="http://www.iso.org/obp" w:history="1">
         <w:r>
           <w:rPr>
-            <w:rStyle w:val="Hypertextovodkaz"/>
+            <w:rStyle w:val="Hyperlink"/>
           </w:rPr>
           <w:t>www.iso.org/obp</w:t>
         </w:r>
@@ -2063,7 +2007,7 @@
     </w:p>
     <w:p>
       <w:pPr>
-        <w:pStyle w:val="Nadpis1"/>
+        <w:pStyle w:val="Heading1"/>
       </w:pPr>
       <w:r>
         <w:t>5</w:t>
@@ -2078,13 +2022,8 @@
       <w:bookmarkEnd w:id="57"/>
       <w:bookmarkEnd w:id="58"/>
       <w:r>
-        <w:t xml:space="preserve"> </w:t>
-      </w:r>
-      <w:proofErr w:type="spellStart"/>
-      <w:r>
-        <w:t>Classification</w:t>
-      </w:r>
-      <w:proofErr w:type="spellEnd"/>
+        <w:t xml:space="preserve"> Classification</w:t>
+      </w:r>
     </w:p>
     <w:p>
       <w:pPr>
@@ -2223,7 +2162,7 @@
     </w:p>
     <w:p>
       <w:pPr>
-        <w:pStyle w:val="Nadpis1"/>
+        <w:pStyle w:val="Heading1"/>
       </w:pPr>
       <w:r>
         <w:t>6</w:t>
@@ -2264,7 +2203,7 @@
     </w:p>
     <w:p>
       <w:pPr>
-        <w:pStyle w:val="Nadpis2"/>
+        <w:pStyle w:val="Heading2"/>
       </w:pPr>
       <w:r>
         <w:t>6</w:t>
@@ -2281,16 +2220,13 @@
     </w:p>
     <w:p>
       <w:pPr>
-        <w:pStyle w:val="Nadpislnku"/>
-        <w:spacing w:line="276" w:lineRule="auto"/>
-        <w:rPr>
-          <w:b w:val="0"/>
-          <w:lang w:val="en-GB"/>
-        </w:rPr>
-      </w:pPr>
-      <w:r>
-        <w:rPr>
-          <w:b w:val="0"/>
+        <w:rPr>
+          <w:b/>
+          <w:lang w:val="en-GB"/>
+        </w:rPr>
+      </w:pPr>
+      <w:r>
+        <w:rPr>
           <w:lang w:val="en-GB"/>
         </w:rPr>
         <w:t>ACC systems shall provide the following minimum control behaviour and state transitions:</w:t>
@@ -2298,21 +2234,18 @@
     </w:p>
     <w:p>
       <w:pPr>
-        <w:pStyle w:val="Nadpislnku"/>
+        <w:pStyle w:val="ListParagraph"/>
         <w:numPr>
           <w:ilvl w:val="0"/>
-          <w:numId w:val="31"/>
+          <w:numId w:val="39"/>
         </w:numPr>
-        <w:spacing w:before="0" w:after="0" w:line="276" w:lineRule="auto"/>
-        <w:ind w:left="714" w:hanging="357"/>
-        <w:rPr>
-          <w:b w:val="0"/>
-          <w:lang w:val="en-GB"/>
-        </w:rPr>
-      </w:pPr>
-      <w:r>
-        <w:rPr>
-          <w:b w:val="0"/>
+        <w:rPr>
+          <w:b/>
+          <w:lang w:val="en-GB"/>
+        </w:rPr>
+      </w:pPr>
+      <w:r>
+        <w:rPr>
           <w:lang w:val="en-GB"/>
         </w:rPr>
         <w:t>when ACC is active, vehicle speed shall be controlled automatically either to maintain clearance to a forward vehicle or to maintain the set speed, whichever is lower;</w:t>
@@ -2320,21 +2253,18 @@
     </w:p>
     <w:p>
       <w:pPr>
-        <w:pStyle w:val="Nadpislnku"/>
+        <w:pStyle w:val="ListParagraph"/>
         <w:numPr>
           <w:ilvl w:val="0"/>
-          <w:numId w:val="31"/>
+          <w:numId w:val="39"/>
         </w:numPr>
-        <w:spacing w:before="0" w:after="0" w:line="276" w:lineRule="auto"/>
-        <w:ind w:left="714" w:hanging="357"/>
-        <w:rPr>
-          <w:b w:val="0"/>
-          <w:lang w:val="en-GB"/>
-        </w:rPr>
-      </w:pPr>
-      <w:r>
-        <w:rPr>
-          <w:b w:val="0"/>
+        <w:rPr>
+          <w:b/>
+          <w:lang w:val="en-GB"/>
+        </w:rPr>
+      </w:pPr>
+      <w:r>
+        <w:rPr>
           <w:lang w:val="en-GB"/>
         </w:rPr>
         <w:t>transition between speed-control and following-control modes shall be performed automatically by the ACC system;</w:t>
@@ -2342,21 +2272,18 @@
     </w:p>
     <w:p>
       <w:pPr>
-        <w:pStyle w:val="Nadpislnku"/>
+        <w:pStyle w:val="ListParagraph"/>
         <w:numPr>
           <w:ilvl w:val="0"/>
-          <w:numId w:val="31"/>
+          <w:numId w:val="39"/>
         </w:numPr>
-        <w:spacing w:before="0" w:after="0" w:line="276" w:lineRule="auto"/>
-        <w:ind w:left="714" w:hanging="357"/>
-        <w:rPr>
-          <w:b w:val="0"/>
-          <w:lang w:val="en-GB"/>
-        </w:rPr>
-      </w:pPr>
-      <w:r>
-        <w:rPr>
-          <w:b w:val="0"/>
+        <w:rPr>
+          <w:b/>
+          <w:lang w:val="en-GB"/>
+        </w:rPr>
+      </w:pPr>
+      <w:r>
+        <w:rPr>
           <w:lang w:val="en-GB"/>
         </w:rPr>
         <w:t>the steady-state clearance may be adjustable either by the system or by the driver;</w:t>
@@ -2364,21 +2291,18 @@
     </w:p>
     <w:p>
       <w:pPr>
-        <w:pStyle w:val="Nadpislnku"/>
+        <w:pStyle w:val="ListParagraph"/>
         <w:numPr>
           <w:ilvl w:val="0"/>
-          <w:numId w:val="31"/>
+          <w:numId w:val="39"/>
         </w:numPr>
-        <w:spacing w:before="0" w:after="0" w:line="276" w:lineRule="auto"/>
-        <w:ind w:left="714" w:hanging="357"/>
-        <w:rPr>
-          <w:b w:val="0"/>
-          <w:lang w:val="en-GB"/>
-        </w:rPr>
-      </w:pPr>
-      <w:r>
-        <w:rPr>
-          <w:b w:val="0"/>
+        <w:rPr>
+          <w:b/>
+          <w:lang w:val="en-GB"/>
+        </w:rPr>
+      </w:pPr>
+      <w:r>
+        <w:rPr>
           <w:lang w:val="en-GB"/>
         </w:rPr>
         <w:t>if more than one forward vehicle is present, the target vehicle shall be selected automatically;</w:t>
@@ -2386,21 +2310,18 @@
     </w:p>
     <w:p>
       <w:pPr>
-        <w:pStyle w:val="Nadpislnku"/>
+        <w:pStyle w:val="ListParagraph"/>
         <w:numPr>
           <w:ilvl w:val="0"/>
-          <w:numId w:val="31"/>
+          <w:numId w:val="39"/>
         </w:numPr>
-        <w:spacing w:before="0" w:after="0" w:line="276" w:lineRule="auto"/>
-        <w:ind w:left="714" w:hanging="357"/>
-        <w:rPr>
-          <w:b w:val="0"/>
-          <w:lang w:val="en-GB"/>
-        </w:rPr>
-      </w:pPr>
-      <w:r>
-        <w:rPr>
-          <w:b w:val="0"/>
+        <w:rPr>
+          <w:b/>
+          <w:lang w:val="en-GB"/>
+        </w:rPr>
+      </w:pPr>
+      <w:r>
+        <w:rPr>
           <w:lang w:val="en-GB"/>
         </w:rPr>
         <w:t>for FSRA systems, transition from following control to hold state shall occur after vehicle standstill;</w:t>
@@ -2408,47 +2329,32 @@
     </w:p>
     <w:p>
       <w:pPr>
-        <w:pStyle w:val="Nadpislnku"/>
+        <w:pStyle w:val="ListParagraph"/>
         <w:numPr>
           <w:ilvl w:val="0"/>
-          <w:numId w:val="31"/>
+          <w:numId w:val="39"/>
         </w:numPr>
-        <w:spacing w:before="0" w:after="0" w:line="276" w:lineRule="auto"/>
-        <w:ind w:left="714" w:hanging="357"/>
-        <w:rPr>
-          <w:b w:val="0"/>
-          <w:lang w:val="en-GB"/>
-        </w:rPr>
-      </w:pPr>
-      <w:proofErr w:type="gramStart"/>
-      <w:r>
-        <w:rPr>
-          <w:b w:val="0"/>
-          <w:lang w:val="en-GB"/>
-        </w:rPr>
-        <w:t>for</w:t>
-      </w:r>
-      <w:proofErr w:type="gramEnd"/>
-      <w:r>
-        <w:rPr>
-          <w:b w:val="0"/>
-          <w:lang w:val="en-GB"/>
-        </w:rPr>
-        <w:t xml:space="preserve"> LSRA systems, activation of ACC shall be inhibited below the minimum operational speed.</w:t>
+        <w:rPr>
+          <w:b/>
+          <w:lang w:val="en-GB"/>
+        </w:rPr>
+      </w:pPr>
+      <w:r>
+        <w:rPr>
+          <w:lang w:val="en-GB"/>
+        </w:rPr>
+        <w:t>for LSRA systems, activation of ACC shall be inhibited below the minimum operational speed.</w:t>
       </w:r>
     </w:p>
     <w:p>
       <w:pPr>
-        <w:pStyle w:val="Nadpislnku"/>
-        <w:spacing w:line="276" w:lineRule="auto"/>
-        <w:rPr>
-          <w:b w:val="0"/>
-          <w:lang w:val="en-GB"/>
-        </w:rPr>
-      </w:pPr>
-      <w:r>
-        <w:rPr>
-          <w:b w:val="0"/>
+        <w:rPr>
+          <w:b/>
+          <w:lang w:val="en-GB"/>
+        </w:rPr>
+      </w:pPr>
+      <w:r>
+        <w:rPr>
           <w:lang w:val="en-GB"/>
         </w:rPr>
         <w:t>The standard also defines ACC system states and transitions between “ACC off”, “ACC stand-by”, “ACC speed control”, “ACC following control” and “FSRA hold” states (see Figure 2).</w:t>
@@ -2535,7 +2441,7 @@
     </w:p>
     <w:p>
       <w:pPr>
-        <w:pStyle w:val="Nadpis2"/>
+        <w:pStyle w:val="Heading2"/>
       </w:pPr>
       <w:r>
         <w:t>6</w:t>
@@ -2638,21 +2544,12 @@
         </w:rPr>
         <w:t xml:space="preserve">describes </w:t>
       </w:r>
-      <w:proofErr w:type="gramStart"/>
       <w:r>
         <w:rPr>
           <w:b/>
           <w:lang w:val="en-GB"/>
         </w:rPr>
-        <w:t>Following</w:t>
-      </w:r>
-      <w:proofErr w:type="gramEnd"/>
-      <w:r>
-        <w:rPr>
-          <w:b/>
-          <w:lang w:val="en-GB"/>
-        </w:rPr>
-        <w:t xml:space="preserve"> capability</w:t>
+        <w:t>Following capability</w:t>
       </w:r>
       <w:r>
         <w:rPr>
@@ -2748,10 +2645,9 @@
     </w:p>
     <w:p>
       <w:pPr>
-        <w:pStyle w:val="Nadpis2"/>
-      </w:pPr>
-      <w:r>
-        <w:lastRenderedPageBreak/>
+        <w:pStyle w:val="Heading2"/>
+      </w:pPr>
+      <w:r>
         <w:t>6.3</w:t>
       </w:r>
       <w:r>
@@ -2766,7 +2662,7 @@
     </w:p>
     <w:p>
       <w:pPr>
-        <w:pStyle w:val="Nadpis3"/>
+        <w:pStyle w:val="Heading3"/>
         <w:rPr>
           <w:lang w:val="en-GB"/>
         </w:rPr>
@@ -2820,7 +2716,6 @@
         </w:rPr>
         <w:t xml:space="preserve"> </w:t>
       </w:r>
-      <w:proofErr w:type="spellStart"/>
       <w:r>
         <w:rPr>
           <w:b/>
@@ -2835,7 +2730,6 @@
         </w:rPr>
         <w:t>clauses</w:t>
       </w:r>
-      <w:proofErr w:type="spellEnd"/>
       <w:r>
         <w:rPr>
           <w:b/>
@@ -2853,21 +2747,18 @@
     </w:p>
     <w:p>
       <w:pPr>
-        <w:pStyle w:val="Nadpislnku"/>
+        <w:pStyle w:val="ListParagraph"/>
         <w:numPr>
           <w:ilvl w:val="0"/>
-          <w:numId w:val="31"/>
+          <w:numId w:val="40"/>
         </w:numPr>
-        <w:spacing w:before="0" w:after="0" w:line="276" w:lineRule="auto"/>
-        <w:ind w:left="714" w:hanging="357"/>
-        <w:rPr>
-          <w:b w:val="0"/>
-          <w:lang w:val="en-GB"/>
-        </w:rPr>
-      </w:pPr>
-      <w:r>
-        <w:rPr>
-          <w:b w:val="0"/>
+        <w:rPr>
+          <w:b/>
+          <w:lang w:val="en-GB"/>
+        </w:rPr>
+      </w:pPr>
+      <w:r>
+        <w:rPr>
           <w:lang w:val="en-GB"/>
         </w:rPr>
         <w:t>the ACC system shall provide means for the driver to select a desired set speed;</w:t>
@@ -2875,43 +2766,38 @@
     </w:p>
     <w:p>
       <w:pPr>
-        <w:pStyle w:val="Nadpislnku"/>
+        <w:pStyle w:val="ListParagraph"/>
         <w:numPr>
           <w:ilvl w:val="0"/>
-          <w:numId w:val="31"/>
+          <w:numId w:val="40"/>
         </w:numPr>
-        <w:spacing w:before="0" w:after="0" w:line="276" w:lineRule="auto"/>
-        <w:ind w:left="714" w:hanging="357"/>
-        <w:rPr>
-          <w:b w:val="0"/>
-          <w:lang w:val="en-GB"/>
-        </w:rPr>
-      </w:pPr>
-      <w:r>
-        <w:rPr>
-          <w:b w:val="0"/>
-          <w:lang w:val="en-GB"/>
-        </w:rPr>
+        <w:rPr>
+          <w:b/>
+          <w:lang w:val="en-GB"/>
+        </w:rPr>
+      </w:pPr>
+      <w:r>
+        <w:rPr>
+          <w:lang w:val="en-GB"/>
+        </w:rPr>
+        <w:lastRenderedPageBreak/>
         <w:t>driver braking input shall deactivate ACC functionality if the driver braking demand exceeds the ACC braking demand;</w:t>
       </w:r>
     </w:p>
     <w:p>
       <w:pPr>
-        <w:pStyle w:val="Nadpislnku"/>
+        <w:pStyle w:val="ListParagraph"/>
         <w:numPr>
           <w:ilvl w:val="0"/>
-          <w:numId w:val="31"/>
+          <w:numId w:val="40"/>
         </w:numPr>
-        <w:spacing w:before="0" w:after="0" w:line="276" w:lineRule="auto"/>
-        <w:ind w:left="714" w:hanging="357"/>
-        <w:rPr>
-          <w:b w:val="0"/>
-          <w:lang w:val="en-GB"/>
-        </w:rPr>
-      </w:pPr>
-      <w:r>
-        <w:rPr>
-          <w:b w:val="0"/>
+        <w:rPr>
+          <w:b/>
+          <w:lang w:val="en-GB"/>
+        </w:rPr>
+      </w:pPr>
+      <w:r>
+        <w:rPr>
           <w:lang w:val="en-GB"/>
         </w:rPr>
         <w:t>accelerator override by the driver shall always have priority over ACC engine power control;</w:t>
@@ -2919,21 +2805,18 @@
     </w:p>
     <w:p>
       <w:pPr>
-        <w:pStyle w:val="Nadpislnku"/>
+        <w:pStyle w:val="ListParagraph"/>
         <w:numPr>
           <w:ilvl w:val="0"/>
-          <w:numId w:val="31"/>
+          <w:numId w:val="40"/>
         </w:numPr>
-        <w:spacing w:before="0" w:after="0" w:line="276" w:lineRule="auto"/>
-        <w:ind w:left="714" w:hanging="357"/>
-        <w:rPr>
-          <w:b w:val="0"/>
-          <w:lang w:val="en-GB"/>
-        </w:rPr>
-      </w:pPr>
-      <w:r>
-        <w:rPr>
-          <w:b w:val="0"/>
+        <w:rPr>
+          <w:b/>
+          <w:lang w:val="en-GB"/>
+        </w:rPr>
+      </w:pPr>
+      <w:r>
+        <w:rPr>
           <w:lang w:val="en-GB"/>
         </w:rPr>
         <w:t>ACC systems may automatically adjust the selected time gap according to environmental conditions such as poor weather;</w:t>
@@ -2941,38 +2824,26 @@
     </w:p>
     <w:p>
       <w:pPr>
-        <w:pStyle w:val="Nadpislnku"/>
+        <w:pStyle w:val="ListParagraph"/>
         <w:numPr>
           <w:ilvl w:val="0"/>
-          <w:numId w:val="31"/>
+          <w:numId w:val="40"/>
         </w:numPr>
-        <w:spacing w:before="0" w:after="0" w:line="276" w:lineRule="auto"/>
-        <w:ind w:left="714" w:hanging="357"/>
-        <w:rPr>
-          <w:b w:val="0"/>
-          <w:lang w:val="en-GB"/>
-        </w:rPr>
-      </w:pPr>
-      <w:proofErr w:type="gramStart"/>
-      <w:r>
-        <w:rPr>
-          <w:b w:val="0"/>
-          <w:lang w:val="en-GB"/>
-        </w:rPr>
-        <w:t>if</w:t>
-      </w:r>
-      <w:proofErr w:type="gramEnd"/>
-      <w:r>
-        <w:rPr>
-          <w:b w:val="0"/>
-          <w:lang w:val="en-GB"/>
-        </w:rPr>
-        <w:t xml:space="preserve"> both conventional cruise control and ACC are available, automatic switching between these systems shall not occur.</w:t>
+        <w:rPr>
+          <w:b/>
+          <w:lang w:val="en-GB"/>
+        </w:rPr>
+      </w:pPr>
+      <w:r>
+        <w:rPr>
+          <w:lang w:val="en-GB"/>
+        </w:rPr>
+        <w:t>if both conventional cruise control and ACC are available, automatic switching between these systems shall not occur.</w:t>
       </w:r>
     </w:p>
     <w:p>
       <w:pPr>
-        <w:pStyle w:val="Nadpis3"/>
+        <w:pStyle w:val="Heading3"/>
         <w:rPr>
           <w:lang w:val="en-GB"/>
         </w:rPr>
@@ -3102,7 +2973,7 @@
     </w:p>
     <w:p>
       <w:pPr>
-        <w:pStyle w:val="Nadpis2"/>
+        <w:pStyle w:val="Heading2"/>
       </w:pPr>
       <w:r>
         <w:t>6.4</w:t>
@@ -3131,21 +3002,18 @@
     </w:p>
     <w:p>
       <w:pPr>
-        <w:pStyle w:val="Nadpislnku"/>
+        <w:pStyle w:val="ListParagraph"/>
         <w:numPr>
           <w:ilvl w:val="0"/>
-          <w:numId w:val="31"/>
+          <w:numId w:val="41"/>
         </w:numPr>
-        <w:spacing w:before="0" w:after="0" w:line="276" w:lineRule="auto"/>
-        <w:ind w:left="714" w:hanging="357"/>
-        <w:rPr>
-          <w:b w:val="0"/>
-          <w:lang w:val="en-GB"/>
-        </w:rPr>
-      </w:pPr>
-      <w:r>
-        <w:rPr>
-          <w:b w:val="0"/>
+        <w:rPr>
+          <w:b/>
+          <w:lang w:val="en-GB"/>
+        </w:rPr>
+      </w:pPr>
+      <w:r>
+        <w:rPr>
           <w:lang w:val="en-GB"/>
         </w:rPr>
         <w:t>minimum operational speed;</w:t>
@@ -3153,21 +3021,18 @@
     </w:p>
     <w:p>
       <w:pPr>
-        <w:pStyle w:val="Nadpislnku"/>
+        <w:pStyle w:val="ListParagraph"/>
         <w:numPr>
           <w:ilvl w:val="0"/>
-          <w:numId w:val="31"/>
+          <w:numId w:val="41"/>
         </w:numPr>
-        <w:spacing w:before="0" w:after="0" w:line="276" w:lineRule="auto"/>
-        <w:ind w:left="714" w:hanging="357"/>
-        <w:rPr>
-          <w:b w:val="0"/>
-          <w:lang w:val="en-GB"/>
-        </w:rPr>
-      </w:pPr>
-      <w:r>
-        <w:rPr>
-          <w:b w:val="0"/>
+        <w:rPr>
+          <w:b/>
+          <w:lang w:val="en-GB"/>
+        </w:rPr>
+      </w:pPr>
+      <w:r>
+        <w:rPr>
           <w:lang w:val="en-GB"/>
         </w:rPr>
         <w:t>maximum automatic acceleration;</w:t>
@@ -3175,21 +3040,18 @@
     </w:p>
     <w:p>
       <w:pPr>
-        <w:pStyle w:val="Nadpislnku"/>
+        <w:pStyle w:val="ListParagraph"/>
         <w:numPr>
           <w:ilvl w:val="0"/>
-          <w:numId w:val="31"/>
+          <w:numId w:val="41"/>
         </w:numPr>
-        <w:spacing w:before="0" w:after="0" w:line="276" w:lineRule="auto"/>
-        <w:ind w:left="714" w:hanging="357"/>
-        <w:rPr>
-          <w:b w:val="0"/>
-          <w:lang w:val="en-GB"/>
-        </w:rPr>
-      </w:pPr>
-      <w:r>
-        <w:rPr>
-          <w:b w:val="0"/>
+        <w:rPr>
+          <w:b/>
+          <w:lang w:val="en-GB"/>
+        </w:rPr>
+      </w:pPr>
+      <w:r>
+        <w:rPr>
           <w:lang w:val="en-GB"/>
         </w:rPr>
         <w:t>maximum automatic deceleration;</w:t>
@@ -3197,21 +3059,18 @@
     </w:p>
     <w:p>
       <w:pPr>
-        <w:pStyle w:val="Nadpislnku"/>
+        <w:pStyle w:val="ListParagraph"/>
         <w:numPr>
           <w:ilvl w:val="0"/>
-          <w:numId w:val="31"/>
+          <w:numId w:val="41"/>
         </w:numPr>
-        <w:spacing w:before="0" w:after="0" w:line="276" w:lineRule="auto"/>
-        <w:ind w:left="714" w:hanging="357"/>
-        <w:rPr>
-          <w:b w:val="0"/>
-          <w:lang w:val="en-GB"/>
-        </w:rPr>
-      </w:pPr>
-      <w:r>
-        <w:rPr>
-          <w:b w:val="0"/>
+        <w:rPr>
+          <w:b/>
+          <w:lang w:val="en-GB"/>
+        </w:rPr>
+      </w:pPr>
+      <w:r>
+        <w:rPr>
           <w:lang w:val="en-GB"/>
         </w:rPr>
         <w:t>maximum negative jerk;</w:t>
@@ -3219,38 +3078,26 @@
     </w:p>
     <w:p>
       <w:pPr>
-        <w:pStyle w:val="Nadpislnku"/>
+        <w:pStyle w:val="ListParagraph"/>
         <w:numPr>
           <w:ilvl w:val="0"/>
-          <w:numId w:val="31"/>
+          <w:numId w:val="41"/>
         </w:numPr>
-        <w:spacing w:before="0" w:after="0" w:line="276" w:lineRule="auto"/>
-        <w:ind w:left="714" w:hanging="357"/>
-        <w:rPr>
-          <w:b w:val="0"/>
-          <w:lang w:val="en-GB"/>
-        </w:rPr>
-      </w:pPr>
-      <w:proofErr w:type="gramStart"/>
-      <w:r>
-        <w:rPr>
-          <w:b w:val="0"/>
-          <w:lang w:val="en-GB"/>
-        </w:rPr>
-        <w:t>behaviour</w:t>
-      </w:r>
-      <w:proofErr w:type="gramEnd"/>
-      <w:r>
-        <w:rPr>
-          <w:b w:val="0"/>
-          <w:lang w:val="en-GB"/>
-        </w:rPr>
-        <w:t xml:space="preserve"> at very short distances to the target vehicle.</w:t>
+        <w:rPr>
+          <w:b/>
+          <w:lang w:val="en-GB"/>
+        </w:rPr>
+      </w:pPr>
+      <w:r>
+        <w:rPr>
+          <w:lang w:val="en-GB"/>
+        </w:rPr>
+        <w:t>behaviour at very short distances to the target vehicle.</w:t>
       </w:r>
     </w:p>
     <w:p>
       <w:pPr>
-        <w:pStyle w:val="Nadpis2"/>
+        <w:pStyle w:val="Heading2"/>
       </w:pPr>
       <w:r>
         <w:t>6.5</w:t>
@@ -3273,14 +3120,12 @@
           <w:lang w:val="en-GB"/>
         </w:rPr>
       </w:pPr>
-      <w:proofErr w:type="gramStart"/>
       <w:r>
         <w:rPr>
           <w:lang w:val="en-GB"/>
         </w:rPr>
         <w:t>defines</w:t>
       </w:r>
-      <w:proofErr w:type="gramEnd"/>
       <w:r>
         <w:rPr>
           <w:lang w:val="en-GB"/>
@@ -3308,7 +3153,7 @@
     </w:p>
     <w:p>
       <w:pPr>
-        <w:pStyle w:val="Nadpis2"/>
+        <w:pStyle w:val="Heading2"/>
       </w:pPr>
       <w:r>
         <w:t>6.6</w:t>
@@ -3476,10 +3321,9 @@
     </w:p>
     <w:p>
       <w:pPr>
-        <w:pStyle w:val="Nadpis1"/>
-      </w:pPr>
-      <w:r>
-        <w:lastRenderedPageBreak/>
+        <w:pStyle w:val="Heading1"/>
+      </w:pPr>
+      <w:r>
         <w:t>7</w:t>
       </w:r>
       <w:r>
@@ -3515,7 +3359,7 @@
     </w:p>
     <w:p>
       <w:pPr>
-        <w:pStyle w:val="Nadpis2"/>
+        <w:pStyle w:val="Heading2"/>
       </w:pPr>
       <w:r>
         <w:t>7.1</w:t>
@@ -3544,9 +3388,10 @@
     </w:p>
     <w:p>
       <w:pPr>
-        <w:pStyle w:val="Nadpis2"/>
-      </w:pPr>
-      <w:r>
+        <w:pStyle w:val="Heading2"/>
+      </w:pPr>
+      <w:r>
+        <w:lastRenderedPageBreak/>
         <w:t>7.2</w:t>
       </w:r>
       <w:r>
@@ -3573,21 +3418,18 @@
     </w:p>
     <w:p>
       <w:pPr>
-        <w:pStyle w:val="Nadpislnku"/>
+        <w:pStyle w:val="ListParagraph"/>
         <w:numPr>
           <w:ilvl w:val="0"/>
-          <w:numId w:val="31"/>
+          <w:numId w:val="42"/>
         </w:numPr>
-        <w:spacing w:before="0" w:after="60" w:line="276" w:lineRule="auto"/>
-        <w:ind w:left="714" w:hanging="357"/>
-        <w:rPr>
-          <w:b w:val="0"/>
-          <w:lang w:val="en-GB"/>
-        </w:rPr>
-      </w:pPr>
-      <w:r>
-        <w:rPr>
-          <w:b w:val="0"/>
+        <w:rPr>
+          <w:b/>
+          <w:lang w:val="en-GB"/>
+        </w:rPr>
+      </w:pPr>
+      <w:r>
+        <w:rPr>
           <w:lang w:val="en-GB"/>
         </w:rPr>
         <w:t>infrared LIDAR systems;</w:t>
@@ -3595,33 +3437,21 @@
     </w:p>
     <w:p>
       <w:pPr>
-        <w:pStyle w:val="Nadpislnku"/>
+        <w:pStyle w:val="ListParagraph"/>
         <w:numPr>
           <w:ilvl w:val="0"/>
-          <w:numId w:val="31"/>
+          <w:numId w:val="42"/>
         </w:numPr>
-        <w:spacing w:before="0" w:after="60" w:line="276" w:lineRule="auto"/>
-        <w:ind w:left="714" w:hanging="357"/>
-        <w:rPr>
-          <w:b w:val="0"/>
-          <w:lang w:val="en-GB"/>
-        </w:rPr>
-      </w:pPr>
-      <w:proofErr w:type="gramStart"/>
-      <w:r>
-        <w:rPr>
-          <w:b w:val="0"/>
-          <w:lang w:val="en-GB"/>
-        </w:rPr>
-        <w:t>millimetre-wave</w:t>
-      </w:r>
-      <w:proofErr w:type="gramEnd"/>
-      <w:r>
-        <w:rPr>
-          <w:b w:val="0"/>
-          <w:lang w:val="en-GB"/>
-        </w:rPr>
-        <w:t xml:space="preserve"> RADAR systems.</w:t>
+        <w:rPr>
+          <w:b/>
+          <w:lang w:val="en-GB"/>
+        </w:rPr>
+      </w:pPr>
+      <w:r>
+        <w:rPr>
+          <w:lang w:val="en-GB"/>
+        </w:rPr>
+        <w:t>millimetre-wave RADAR systems.</w:t>
       </w:r>
     </w:p>
     <w:p>
@@ -3641,7 +3471,7 @@
     </w:p>
     <w:p>
       <w:pPr>
-        <w:pStyle w:val="Nadpis2"/>
+        <w:pStyle w:val="Heading2"/>
       </w:pPr>
       <w:r>
         <w:t>7.3</w:t>
@@ -3670,7 +3500,7 @@
     </w:p>
     <w:p>
       <w:pPr>
-        <w:pStyle w:val="Nadpis2"/>
+        <w:pStyle w:val="Heading2"/>
       </w:pPr>
       <w:r>
         <w:t>7.4</w:t>
@@ -3759,7 +3589,7 @@
     </w:p>
     <w:p>
       <w:pPr>
-        <w:pStyle w:val="Nadpis2"/>
+        <w:pStyle w:val="Heading2"/>
       </w:pPr>
       <w:r>
         <w:t>7.5</w:t>
@@ -4001,7 +3831,6 @@
         <w:t xml:space="preserve"> </w:t>
       </w:r>
       <w:proofErr w:type="spellStart"/>
-      <w:proofErr w:type="gramStart"/>
       <w:r>
         <w:t>clause</w:t>
       </w:r>
@@ -4014,7 +3843,6 @@
         <w:t>is</w:t>
       </w:r>
       <w:proofErr w:type="spellEnd"/>
-      <w:proofErr w:type="gramEnd"/>
       <w:r>
         <w:t xml:space="preserve"> </w:t>
       </w:r>
@@ -4151,15 +3979,7 @@
       </w:r>
       <w:proofErr w:type="spellEnd"/>
       <w:r>
-        <w:t xml:space="preserve"> </w:t>
-      </w:r>
-      <w:proofErr w:type="spellStart"/>
-      <w:r>
-        <w:t>positioning</w:t>
-      </w:r>
-      <w:proofErr w:type="spellEnd"/>
-      <w:r>
-        <w:t xml:space="preserve"> and </w:t>
+        <w:t xml:space="preserve"> positioning and </w:t>
       </w:r>
       <w:proofErr w:type="spellStart"/>
       <w:r>
@@ -4212,7 +4032,7 @@
     </w:p>
     <w:p>
       <w:pPr>
-        <w:pStyle w:val="Nadpis2"/>
+        <w:pStyle w:val="Heading2"/>
       </w:pPr>
       <w:r>
         <w:t>7.6</w:t>
@@ -4220,8 +4040,6 @@
       <w:r>
         <w:t> </w:t>
       </w:r>
-      <w:bookmarkStart w:id="59" w:name="_GoBack"/>
-      <w:bookmarkEnd w:id="59"/>
       <w:r>
         <w:t>Curve capability test</w:t>
       </w:r>
@@ -4243,7 +4061,7 @@
     </w:p>
     <w:p>
       <w:pPr>
-        <w:pStyle w:val="Nadpis1"/>
+        <w:pStyle w:val="Heading1"/>
       </w:pPr>
       <w:r>
         <w:t xml:space="preserve">Annex A (normative) — Technical information </w:t>
@@ -4279,21 +4097,7 @@
         <w:rPr>
           <w:lang w:val="en-GB"/>
         </w:rPr>
-        <w:t xml:space="preserve">and includes the </w:t>
-      </w:r>
-      <w:proofErr w:type="spellStart"/>
-      <w:r>
-        <w:rPr>
-          <w:lang w:val="en-GB"/>
-        </w:rPr>
-        <w:t>subclauses</w:t>
-      </w:r>
-      <w:proofErr w:type="spellEnd"/>
-      <w:r>
-        <w:rPr>
-          <w:lang w:val="en-GB"/>
-        </w:rPr>
-        <w:t xml:space="preserve"> A.1.1 General, A.1.2 Reflector geometry, A.1.3 Reflectivity characteristics, and A.1.4 Coefficient for Test Target (CTT). Annex A.2 describes technical information related to RADAR Cross Section (RCS) characteristics for millimetre-wave RADAR systems and explains representative target properties for vehicle detection. Annex A.3 contains additional explanatory information</w:t>
+        <w:t>and includes the subclauses A.1.1 General, A.1.2 Reflector geometry, A.1.3 Reflectivity characteristics, and A.1.4 Coefficient for Test Target (CTT). Annex A.2 describes technical information related to RADAR Cross Section (RCS) characteristics for millimetre-wave RADAR systems and explains representative target properties for vehicle detection. Annex A.3 contains additional explanatory information</w:t>
       </w:r>
       <w:r>
         <w:rPr>
@@ -4316,7 +4120,7 @@
     </w:p>
     <w:p>
       <w:pPr>
-        <w:pStyle w:val="Nadpis1"/>
+        <w:pStyle w:val="Heading1"/>
       </w:pPr>
       <w:r>
         <w:t>Bibliography</w:t>
@@ -4364,7 +4168,7 @@
 </file>
 
 <file path=word/endnotes.xml><?xml version="1.0" encoding="utf-8"?>
-<w:endnotes xmlns:wpc="http://schemas.microsoft.com/office/word/2010/wordprocessingCanvas" xmlns:cx="http://schemas.microsoft.com/office/drawing/2014/chartex" xmlns:cx1="http://schemas.microsoft.com/office/drawing/2015/9/8/chartex" xmlns:mc="http://schemas.openxmlformats.org/markup-compatibility/2006" xmlns:o="urn:schemas-microsoft-com:office:office" xmlns:r="http://schemas.openxmlformats.org/officeDocument/2006/relationships" xmlns:m="http://schemas.openxmlformats.org/officeDocument/2006/math" xmlns:v="urn:schemas-microsoft-com:vml" xmlns:wp14="http://schemas.microsoft.com/office/word/2010/wordprocessingDrawing" xmlns:wp="http://schemas.openxmlformats.org/drawingml/2006/wordprocessingDrawing" xmlns:w10="urn:schemas-microsoft-com:office:word" xmlns:w="http://schemas.openxmlformats.org/wordprocessingml/2006/main" xmlns:w14="http://schemas.microsoft.com/office/word/2010/wordml" xmlns:w15="http://schemas.microsoft.com/office/word/2012/wordml" xmlns:w16se="http://schemas.microsoft.com/office/word/2015/wordml/symex" xmlns:wpg="http://schemas.microsoft.com/office/word/2010/wordprocessingGroup" xmlns:wpi="http://schemas.microsoft.com/office/word/2010/wordprocessingInk" xmlns:wne="http://schemas.microsoft.com/office/word/2006/wordml" xmlns:wps="http://schemas.microsoft.com/office/word/2010/wordprocessingShape" mc:Ignorable="w14 w15 w16se wp14">
+<w:endnotes xmlns:wpc="http://schemas.microsoft.com/office/word/2010/wordprocessingCanvas" xmlns:cx="http://schemas.microsoft.com/office/drawing/2014/chartex" xmlns:cx1="http://schemas.microsoft.com/office/drawing/2015/9/8/chartex" xmlns:cx2="http://schemas.microsoft.com/office/drawing/2015/10/21/chartex" xmlns:cx3="http://schemas.microsoft.com/office/drawing/2016/5/9/chartex" xmlns:cx4="http://schemas.microsoft.com/office/drawing/2016/5/10/chartex" xmlns:cx5="http://schemas.microsoft.com/office/drawing/2016/5/11/chartex" xmlns:cx6="http://schemas.microsoft.com/office/drawing/2016/5/12/chartex" xmlns:cx7="http://schemas.microsoft.com/office/drawing/2016/5/13/chartex" xmlns:cx8="http://schemas.microsoft.com/office/drawing/2016/5/14/chartex" xmlns:mc="http://schemas.openxmlformats.org/markup-compatibility/2006" xmlns:aink="http://schemas.microsoft.com/office/drawing/2016/ink" xmlns:am3d="http://schemas.microsoft.com/office/drawing/2017/model3d" xmlns:o="urn:schemas-microsoft-com:office:office" xmlns:oel="http://schemas.microsoft.com/office/2019/extlst" xmlns:r="http://schemas.openxmlformats.org/officeDocument/2006/relationships" xmlns:m="http://schemas.openxmlformats.org/officeDocument/2006/math" xmlns:v="urn:schemas-microsoft-com:vml" xmlns:wp14="http://schemas.microsoft.com/office/word/2010/wordprocessingDrawing" xmlns:wp="http://schemas.openxmlformats.org/drawingml/2006/wordprocessingDrawing" xmlns:w10="urn:schemas-microsoft-com:office:word" xmlns:w="http://schemas.openxmlformats.org/wordprocessingml/2006/main" xmlns:w14="http://schemas.microsoft.com/office/word/2010/wordml" xmlns:w15="http://schemas.microsoft.com/office/word/2012/wordml" xmlns:w16cex="http://schemas.microsoft.com/office/word/2018/wordml/cex" xmlns:w16cid="http://schemas.microsoft.com/office/word/2016/wordml/cid" xmlns:w16="http://schemas.microsoft.com/office/word/2018/wordml" xmlns:w16du="http://schemas.microsoft.com/office/word/2023/wordml/word16du" xmlns:w16sdtdh="http://schemas.microsoft.com/office/word/2020/wordml/sdtdatahash" xmlns:w16sdtfl="http://schemas.microsoft.com/office/word/2024/wordml/sdtformatlock" xmlns:w16se="http://schemas.microsoft.com/office/word/2015/wordml/symex" xmlns:wpg="http://schemas.microsoft.com/office/word/2010/wordprocessingGroup" xmlns:wpi="http://schemas.microsoft.com/office/word/2010/wordprocessingInk" xmlns:wne="http://schemas.microsoft.com/office/word/2006/wordml" xmlns:wps="http://schemas.microsoft.com/office/word/2010/wordprocessingShape" mc:Ignorable="w14 w15 w16se w16cid w16 w16cex w16sdtdh w16sdtfl w16du wp14">
   <w:endnote w:type="separator" w:id="-1">
     <w:p>
       <w:r>
@@ -4383,40 +4187,40 @@
 </file>
 
 <file path=word/footer1.xml><?xml version="1.0" encoding="utf-8"?>
-<w:ftr xmlns:wpc="http://schemas.microsoft.com/office/word/2010/wordprocessingCanvas" xmlns:cx="http://schemas.microsoft.com/office/drawing/2014/chartex" xmlns:cx1="http://schemas.microsoft.com/office/drawing/2015/9/8/chartex" xmlns:mc="http://schemas.openxmlformats.org/markup-compatibility/2006" xmlns:o="urn:schemas-microsoft-com:office:office" xmlns:r="http://schemas.openxmlformats.org/officeDocument/2006/relationships" xmlns:m="http://schemas.openxmlformats.org/officeDocument/2006/math" xmlns:v="urn:schemas-microsoft-com:vml" xmlns:wp14="http://schemas.microsoft.com/office/word/2010/wordprocessingDrawing" xmlns:wp="http://schemas.openxmlformats.org/drawingml/2006/wordprocessingDrawing" xmlns:w10="urn:schemas-microsoft-com:office:word" xmlns:w="http://schemas.openxmlformats.org/wordprocessingml/2006/main" xmlns:w14="http://schemas.microsoft.com/office/word/2010/wordml" xmlns:w15="http://schemas.microsoft.com/office/word/2012/wordml" xmlns:w16se="http://schemas.microsoft.com/office/word/2015/wordml/symex" xmlns:wpg="http://schemas.microsoft.com/office/word/2010/wordprocessingGroup" xmlns:wpi="http://schemas.microsoft.com/office/word/2010/wordprocessingInk" xmlns:wne="http://schemas.microsoft.com/office/word/2006/wordml" xmlns:wps="http://schemas.microsoft.com/office/word/2010/wordprocessingShape" mc:Ignorable="w14 w15 w16se wp14">
+<w:ftr xmlns:wpc="http://schemas.microsoft.com/office/word/2010/wordprocessingCanvas" xmlns:cx="http://schemas.microsoft.com/office/drawing/2014/chartex" xmlns:cx1="http://schemas.microsoft.com/office/drawing/2015/9/8/chartex" xmlns:cx2="http://schemas.microsoft.com/office/drawing/2015/10/21/chartex" xmlns:cx3="http://schemas.microsoft.com/office/drawing/2016/5/9/chartex" xmlns:cx4="http://schemas.microsoft.com/office/drawing/2016/5/10/chartex" xmlns:cx5="http://schemas.microsoft.com/office/drawing/2016/5/11/chartex" xmlns:cx6="http://schemas.microsoft.com/office/drawing/2016/5/12/chartex" xmlns:cx7="http://schemas.microsoft.com/office/drawing/2016/5/13/chartex" xmlns:cx8="http://schemas.microsoft.com/office/drawing/2016/5/14/chartex" xmlns:mc="http://schemas.openxmlformats.org/markup-compatibility/2006" xmlns:aink="http://schemas.microsoft.com/office/drawing/2016/ink" xmlns:am3d="http://schemas.microsoft.com/office/drawing/2017/model3d" xmlns:o="urn:schemas-microsoft-com:office:office" xmlns:oel="http://schemas.microsoft.com/office/2019/extlst" xmlns:r="http://schemas.openxmlformats.org/officeDocument/2006/relationships" xmlns:m="http://schemas.openxmlformats.org/officeDocument/2006/math" xmlns:v="urn:schemas-microsoft-com:vml" xmlns:wp14="http://schemas.microsoft.com/office/word/2010/wordprocessingDrawing" xmlns:wp="http://schemas.openxmlformats.org/drawingml/2006/wordprocessingDrawing" xmlns:w10="urn:schemas-microsoft-com:office:word" xmlns:w="http://schemas.openxmlformats.org/wordprocessingml/2006/main" xmlns:w14="http://schemas.microsoft.com/office/word/2010/wordml" xmlns:w15="http://schemas.microsoft.com/office/word/2012/wordml" xmlns:w16cex="http://schemas.microsoft.com/office/word/2018/wordml/cex" xmlns:w16cid="http://schemas.microsoft.com/office/word/2016/wordml/cid" xmlns:w16="http://schemas.microsoft.com/office/word/2018/wordml" xmlns:w16du="http://schemas.microsoft.com/office/word/2023/wordml/word16du" xmlns:w16sdtdh="http://schemas.microsoft.com/office/word/2020/wordml/sdtdatahash" xmlns:w16sdtfl="http://schemas.microsoft.com/office/word/2024/wordml/sdtformatlock" xmlns:w16se="http://schemas.microsoft.com/office/word/2015/wordml/symex" xmlns:wpg="http://schemas.microsoft.com/office/word/2010/wordprocessingGroup" xmlns:wpi="http://schemas.microsoft.com/office/word/2010/wordprocessingInk" xmlns:wne="http://schemas.microsoft.com/office/word/2006/wordml" xmlns:wps="http://schemas.microsoft.com/office/word/2010/wordprocessingShape" mc:Ignorable="w14 w15 w16se w16cid w16 w16cex w16sdtdh w16sdtfl w16du wp14">
   <w:p>
     <w:pPr>
-      <w:pStyle w:val="Zpat"/>
+      <w:pStyle w:val="Footer"/>
       <w:ind w:right="360" w:firstLine="360"/>
     </w:pPr>
     <w:r>
       <w:rPr>
-        <w:rStyle w:val="slostrnky"/>
+        <w:rStyle w:val="PageNumber"/>
       </w:rPr>
       <w:fldChar w:fldCharType="begin"/>
     </w:r>
     <w:r>
       <w:rPr>
-        <w:rStyle w:val="slostrnky"/>
+        <w:rStyle w:val="PageNumber"/>
       </w:rPr>
       <w:instrText xml:space="preserve"> PAGE </w:instrText>
     </w:r>
     <w:r>
       <w:rPr>
-        <w:rStyle w:val="slostrnky"/>
+        <w:rStyle w:val="PageNumber"/>
       </w:rPr>
       <w:fldChar w:fldCharType="separate"/>
     </w:r>
     <w:r>
       <w:rPr>
-        <w:rStyle w:val="slostrnky"/>
+        <w:rStyle w:val="PageNumber"/>
         <w:noProof/>
       </w:rPr>
       <w:t>4</w:t>
     </w:r>
     <w:r>
       <w:rPr>
-        <w:rStyle w:val="slostrnky"/>
+        <w:rStyle w:val="PageNumber"/>
       </w:rPr>
       <w:fldChar w:fldCharType="end"/>
     </w:r>
@@ -4425,40 +4229,40 @@
 </file>
 
 <file path=word/footer2.xml><?xml version="1.0" encoding="utf-8"?>
-<w:ftr xmlns:wpc="http://schemas.microsoft.com/office/word/2010/wordprocessingCanvas" xmlns:cx="http://schemas.microsoft.com/office/drawing/2014/chartex" xmlns:cx1="http://schemas.microsoft.com/office/drawing/2015/9/8/chartex" xmlns:mc="http://schemas.openxmlformats.org/markup-compatibility/2006" xmlns:o="urn:schemas-microsoft-com:office:office" xmlns:r="http://schemas.openxmlformats.org/officeDocument/2006/relationships" xmlns:m="http://schemas.openxmlformats.org/officeDocument/2006/math" xmlns:v="urn:schemas-microsoft-com:vml" xmlns:wp14="http://schemas.microsoft.com/office/word/2010/wordprocessingDrawing" xmlns:wp="http://schemas.openxmlformats.org/drawingml/2006/wordprocessingDrawing" xmlns:w10="urn:schemas-microsoft-com:office:word" xmlns:w="http://schemas.openxmlformats.org/wordprocessingml/2006/main" xmlns:w14="http://schemas.microsoft.com/office/word/2010/wordml" xmlns:w15="http://schemas.microsoft.com/office/word/2012/wordml" xmlns:w16se="http://schemas.microsoft.com/office/word/2015/wordml/symex" xmlns:wpg="http://schemas.microsoft.com/office/word/2010/wordprocessingGroup" xmlns:wpi="http://schemas.microsoft.com/office/word/2010/wordprocessingInk" xmlns:wne="http://schemas.microsoft.com/office/word/2006/wordml" xmlns:wps="http://schemas.microsoft.com/office/word/2010/wordprocessingShape" mc:Ignorable="w14 w15 w16se wp14">
+<w:ftr xmlns:wpc="http://schemas.microsoft.com/office/word/2010/wordprocessingCanvas" xmlns:cx="http://schemas.microsoft.com/office/drawing/2014/chartex" xmlns:cx1="http://schemas.microsoft.com/office/drawing/2015/9/8/chartex" xmlns:cx2="http://schemas.microsoft.com/office/drawing/2015/10/21/chartex" xmlns:cx3="http://schemas.microsoft.com/office/drawing/2016/5/9/chartex" xmlns:cx4="http://schemas.microsoft.com/office/drawing/2016/5/10/chartex" xmlns:cx5="http://schemas.microsoft.com/office/drawing/2016/5/11/chartex" xmlns:cx6="http://schemas.microsoft.com/office/drawing/2016/5/12/chartex" xmlns:cx7="http://schemas.microsoft.com/office/drawing/2016/5/13/chartex" xmlns:cx8="http://schemas.microsoft.com/office/drawing/2016/5/14/chartex" xmlns:mc="http://schemas.openxmlformats.org/markup-compatibility/2006" xmlns:aink="http://schemas.microsoft.com/office/drawing/2016/ink" xmlns:am3d="http://schemas.microsoft.com/office/drawing/2017/model3d" xmlns:o="urn:schemas-microsoft-com:office:office" xmlns:oel="http://schemas.microsoft.com/office/2019/extlst" xmlns:r="http://schemas.openxmlformats.org/officeDocument/2006/relationships" xmlns:m="http://schemas.openxmlformats.org/officeDocument/2006/math" xmlns:v="urn:schemas-microsoft-com:vml" xmlns:wp14="http://schemas.microsoft.com/office/word/2010/wordprocessingDrawing" xmlns:wp="http://schemas.openxmlformats.org/drawingml/2006/wordprocessingDrawing" xmlns:w10="urn:schemas-microsoft-com:office:word" xmlns:w="http://schemas.openxmlformats.org/wordprocessingml/2006/main" xmlns:w14="http://schemas.microsoft.com/office/word/2010/wordml" xmlns:w15="http://schemas.microsoft.com/office/word/2012/wordml" xmlns:w16cex="http://schemas.microsoft.com/office/word/2018/wordml/cex" xmlns:w16cid="http://schemas.microsoft.com/office/word/2016/wordml/cid" xmlns:w16="http://schemas.microsoft.com/office/word/2018/wordml" xmlns:w16du="http://schemas.microsoft.com/office/word/2023/wordml/word16du" xmlns:w16sdtdh="http://schemas.microsoft.com/office/word/2020/wordml/sdtdatahash" xmlns:w16sdtfl="http://schemas.microsoft.com/office/word/2024/wordml/sdtformatlock" xmlns:w16se="http://schemas.microsoft.com/office/word/2015/wordml/symex" xmlns:wpg="http://schemas.microsoft.com/office/word/2010/wordprocessingGroup" xmlns:wpi="http://schemas.microsoft.com/office/word/2010/wordprocessingInk" xmlns:wne="http://schemas.microsoft.com/office/word/2006/wordml" xmlns:wps="http://schemas.microsoft.com/office/word/2010/wordprocessingShape" mc:Ignorable="w14 w15 w16se w16cid w16 w16cex w16sdtdh w16sdtfl w16du wp14">
   <w:p>
     <w:pPr>
-      <w:pStyle w:val="Zpat"/>
+      <w:pStyle w:val="Footer"/>
       <w:ind w:right="360" w:firstLine="360"/>
     </w:pPr>
     <w:r>
       <w:rPr>
-        <w:rStyle w:val="slostrnky"/>
+        <w:rStyle w:val="PageNumber"/>
       </w:rPr>
       <w:fldChar w:fldCharType="begin"/>
     </w:r>
     <w:r>
       <w:rPr>
-        <w:rStyle w:val="slostrnky"/>
+        <w:rStyle w:val="PageNumber"/>
       </w:rPr>
       <w:instrText xml:space="preserve"> PAGE </w:instrText>
     </w:r>
     <w:r>
       <w:rPr>
-        <w:rStyle w:val="slostrnky"/>
+        <w:rStyle w:val="PageNumber"/>
       </w:rPr>
       <w:fldChar w:fldCharType="separate"/>
     </w:r>
     <w:r>
       <w:rPr>
-        <w:rStyle w:val="slostrnky"/>
+        <w:rStyle w:val="PageNumber"/>
         <w:noProof/>
       </w:rPr>
       <w:t>5</w:t>
     </w:r>
     <w:r>
       <w:rPr>
-        <w:rStyle w:val="slostrnky"/>
+        <w:rStyle w:val="PageNumber"/>
       </w:rPr>
       <w:fldChar w:fldCharType="end"/>
     </w:r>
@@ -4467,39 +4271,39 @@
 </file>
 
 <file path=word/footer3.xml><?xml version="1.0" encoding="utf-8"?>
-<w:ftr xmlns:wpc="http://schemas.microsoft.com/office/word/2010/wordprocessingCanvas" xmlns:cx="http://schemas.microsoft.com/office/drawing/2014/chartex" xmlns:cx1="http://schemas.microsoft.com/office/drawing/2015/9/8/chartex" xmlns:mc="http://schemas.openxmlformats.org/markup-compatibility/2006" xmlns:o="urn:schemas-microsoft-com:office:office" xmlns:r="http://schemas.openxmlformats.org/officeDocument/2006/relationships" xmlns:m="http://schemas.openxmlformats.org/officeDocument/2006/math" xmlns:v="urn:schemas-microsoft-com:vml" xmlns:wp14="http://schemas.microsoft.com/office/word/2010/wordprocessingDrawing" xmlns:wp="http://schemas.openxmlformats.org/drawingml/2006/wordprocessingDrawing" xmlns:w10="urn:schemas-microsoft-com:office:word" xmlns:w="http://schemas.openxmlformats.org/wordprocessingml/2006/main" xmlns:w14="http://schemas.microsoft.com/office/word/2010/wordml" xmlns:w15="http://schemas.microsoft.com/office/word/2012/wordml" xmlns:w16se="http://schemas.microsoft.com/office/word/2015/wordml/symex" xmlns:wpg="http://schemas.microsoft.com/office/word/2010/wordprocessingGroup" xmlns:wpi="http://schemas.microsoft.com/office/word/2010/wordprocessingInk" xmlns:wne="http://schemas.microsoft.com/office/word/2006/wordml" xmlns:wps="http://schemas.microsoft.com/office/word/2010/wordprocessingShape" mc:Ignorable="w14 w15 w16se wp14">
+<w:ftr xmlns:wpc="http://schemas.microsoft.com/office/word/2010/wordprocessingCanvas" xmlns:cx="http://schemas.microsoft.com/office/drawing/2014/chartex" xmlns:cx1="http://schemas.microsoft.com/office/drawing/2015/9/8/chartex" xmlns:cx2="http://schemas.microsoft.com/office/drawing/2015/10/21/chartex" xmlns:cx3="http://schemas.microsoft.com/office/drawing/2016/5/9/chartex" xmlns:cx4="http://schemas.microsoft.com/office/drawing/2016/5/10/chartex" xmlns:cx5="http://schemas.microsoft.com/office/drawing/2016/5/11/chartex" xmlns:cx6="http://schemas.microsoft.com/office/drawing/2016/5/12/chartex" xmlns:cx7="http://schemas.microsoft.com/office/drawing/2016/5/13/chartex" xmlns:cx8="http://schemas.microsoft.com/office/drawing/2016/5/14/chartex" xmlns:mc="http://schemas.openxmlformats.org/markup-compatibility/2006" xmlns:aink="http://schemas.microsoft.com/office/drawing/2016/ink" xmlns:am3d="http://schemas.microsoft.com/office/drawing/2017/model3d" xmlns:o="urn:schemas-microsoft-com:office:office" xmlns:oel="http://schemas.microsoft.com/office/2019/extlst" xmlns:r="http://schemas.openxmlformats.org/officeDocument/2006/relationships" xmlns:m="http://schemas.openxmlformats.org/officeDocument/2006/math" xmlns:v="urn:schemas-microsoft-com:vml" xmlns:wp14="http://schemas.microsoft.com/office/word/2010/wordprocessingDrawing" xmlns:wp="http://schemas.openxmlformats.org/drawingml/2006/wordprocessingDrawing" xmlns:w10="urn:schemas-microsoft-com:office:word" xmlns:w="http://schemas.openxmlformats.org/wordprocessingml/2006/main" xmlns:w14="http://schemas.microsoft.com/office/word/2010/wordml" xmlns:w15="http://schemas.microsoft.com/office/word/2012/wordml" xmlns:w16cex="http://schemas.microsoft.com/office/word/2018/wordml/cex" xmlns:w16cid="http://schemas.microsoft.com/office/word/2016/wordml/cid" xmlns:w16="http://schemas.microsoft.com/office/word/2018/wordml" xmlns:w16du="http://schemas.microsoft.com/office/word/2023/wordml/word16du" xmlns:w16sdtdh="http://schemas.microsoft.com/office/word/2020/wordml/sdtdatahash" xmlns:w16sdtfl="http://schemas.microsoft.com/office/word/2024/wordml/sdtformatlock" xmlns:w16se="http://schemas.microsoft.com/office/word/2015/wordml/symex" xmlns:wpg="http://schemas.microsoft.com/office/word/2010/wordprocessingGroup" xmlns:wpi="http://schemas.microsoft.com/office/word/2010/wordprocessingInk" xmlns:wne="http://schemas.microsoft.com/office/word/2006/wordml" xmlns:wps="http://schemas.microsoft.com/office/word/2010/wordprocessingShape" mc:Ignorable="w14 w15 w16se w16cid w16 w16cex w16sdtdh w16sdtfl w16du wp14">
   <w:p>
     <w:pPr>
-      <w:pStyle w:val="Zpat"/>
+      <w:pStyle w:val="Footer"/>
     </w:pPr>
     <w:r>
       <w:rPr>
-        <w:rStyle w:val="slostrnky"/>
+        <w:rStyle w:val="PageNumber"/>
       </w:rPr>
       <w:fldChar w:fldCharType="begin"/>
     </w:r>
     <w:r>
       <w:rPr>
-        <w:rStyle w:val="slostrnky"/>
+        <w:rStyle w:val="PageNumber"/>
       </w:rPr>
       <w:instrText xml:space="preserve"> PAGE </w:instrText>
     </w:r>
     <w:r>
       <w:rPr>
-        <w:rStyle w:val="slostrnky"/>
+        <w:rStyle w:val="PageNumber"/>
       </w:rPr>
       <w:fldChar w:fldCharType="separate"/>
     </w:r>
     <w:r>
       <w:rPr>
-        <w:rStyle w:val="slostrnky"/>
+        <w:rStyle w:val="PageNumber"/>
         <w:noProof/>
       </w:rPr>
       <w:t>52</w:t>
     </w:r>
     <w:r>
       <w:rPr>
-        <w:rStyle w:val="slostrnky"/>
+        <w:rStyle w:val="PageNumber"/>
       </w:rPr>
       <w:fldChar w:fldCharType="end"/>
     </w:r>
@@ -4508,7 +4312,7 @@
 </file>
 
 <file path=word/footnotes.xml><?xml version="1.0" encoding="utf-8"?>
-<w:footnotes xmlns:wpc="http://schemas.microsoft.com/office/word/2010/wordprocessingCanvas" xmlns:cx="http://schemas.microsoft.com/office/drawing/2014/chartex" xmlns:cx1="http://schemas.microsoft.com/office/drawing/2015/9/8/chartex" xmlns:mc="http://schemas.openxmlformats.org/markup-compatibility/2006" xmlns:o="urn:schemas-microsoft-com:office:office" xmlns:r="http://schemas.openxmlformats.org/officeDocument/2006/relationships" xmlns:m="http://schemas.openxmlformats.org/officeDocument/2006/math" xmlns:v="urn:schemas-microsoft-com:vml" xmlns:wp14="http://schemas.microsoft.com/office/word/2010/wordprocessingDrawing" xmlns:wp="http://schemas.openxmlformats.org/drawingml/2006/wordprocessingDrawing" xmlns:w10="urn:schemas-microsoft-com:office:word" xmlns:w="http://schemas.openxmlformats.org/wordprocessingml/2006/main" xmlns:w14="http://schemas.microsoft.com/office/word/2010/wordml" xmlns:w15="http://schemas.microsoft.com/office/word/2012/wordml" xmlns:w16se="http://schemas.microsoft.com/office/word/2015/wordml/symex" xmlns:wpg="http://schemas.microsoft.com/office/word/2010/wordprocessingGroup" xmlns:wpi="http://schemas.microsoft.com/office/word/2010/wordprocessingInk" xmlns:wne="http://schemas.microsoft.com/office/word/2006/wordml" xmlns:wps="http://schemas.microsoft.com/office/word/2010/wordprocessingShape" mc:Ignorable="w14 w15 w16se wp14">
+<w:footnotes xmlns:wpc="http://schemas.microsoft.com/office/word/2010/wordprocessingCanvas" xmlns:cx="http://schemas.microsoft.com/office/drawing/2014/chartex" xmlns:cx1="http://schemas.microsoft.com/office/drawing/2015/9/8/chartex" xmlns:cx2="http://schemas.microsoft.com/office/drawing/2015/10/21/chartex" xmlns:cx3="http://schemas.microsoft.com/office/drawing/2016/5/9/chartex" xmlns:cx4="http://schemas.microsoft.com/office/drawing/2016/5/10/chartex" xmlns:cx5="http://schemas.microsoft.com/office/drawing/2016/5/11/chartex" xmlns:cx6="http://schemas.microsoft.com/office/drawing/2016/5/12/chartex" xmlns:cx7="http://schemas.microsoft.com/office/drawing/2016/5/13/chartex" xmlns:cx8="http://schemas.microsoft.com/office/drawing/2016/5/14/chartex" xmlns:mc="http://schemas.openxmlformats.org/markup-compatibility/2006" xmlns:aink="http://schemas.microsoft.com/office/drawing/2016/ink" xmlns:am3d="http://schemas.microsoft.com/office/drawing/2017/model3d" xmlns:o="urn:schemas-microsoft-com:office:office" xmlns:oel="http://schemas.microsoft.com/office/2019/extlst" xmlns:r="http://schemas.openxmlformats.org/officeDocument/2006/relationships" xmlns:m="http://schemas.openxmlformats.org/officeDocument/2006/math" xmlns:v="urn:schemas-microsoft-com:vml" xmlns:wp14="http://schemas.microsoft.com/office/word/2010/wordprocessingDrawing" xmlns:wp="http://schemas.openxmlformats.org/drawingml/2006/wordprocessingDrawing" xmlns:w10="urn:schemas-microsoft-com:office:word" xmlns:w="http://schemas.openxmlformats.org/wordprocessingml/2006/main" xmlns:w14="http://schemas.microsoft.com/office/word/2010/wordml" xmlns:w15="http://schemas.microsoft.com/office/word/2012/wordml" xmlns:w16cex="http://schemas.microsoft.com/office/word/2018/wordml/cex" xmlns:w16cid="http://schemas.microsoft.com/office/word/2016/wordml/cid" xmlns:w16="http://schemas.microsoft.com/office/word/2018/wordml" xmlns:w16du="http://schemas.microsoft.com/office/word/2023/wordml/word16du" xmlns:w16sdtdh="http://schemas.microsoft.com/office/word/2020/wordml/sdtdatahash" xmlns:w16sdtfl="http://schemas.microsoft.com/office/word/2024/wordml/sdtformatlock" xmlns:w16se="http://schemas.microsoft.com/office/word/2015/wordml/symex" xmlns:wpg="http://schemas.microsoft.com/office/word/2010/wordprocessingGroup" xmlns:wpi="http://schemas.microsoft.com/office/word/2010/wordprocessingInk" xmlns:wne="http://schemas.microsoft.com/office/word/2006/wordml" xmlns:wps="http://schemas.microsoft.com/office/word/2010/wordprocessingShape" mc:Ignorable="w14 w15 w16se w16cid w16 w16cex w16sdtdh w16sdtfl w16du wp14">
   <w:footnote w:type="separator" w:id="-1">
     <w:p>
       <w:r>
@@ -4527,27 +4331,27 @@
 </file>
 
 <file path=word/header1.xml><?xml version="1.0" encoding="utf-8"?>
-<w:hdr xmlns:wpc="http://schemas.microsoft.com/office/word/2010/wordprocessingCanvas" xmlns:cx="http://schemas.microsoft.com/office/drawing/2014/chartex" xmlns:cx1="http://schemas.microsoft.com/office/drawing/2015/9/8/chartex" xmlns:mc="http://schemas.openxmlformats.org/markup-compatibility/2006" xmlns:o="urn:schemas-microsoft-com:office:office" xmlns:r="http://schemas.openxmlformats.org/officeDocument/2006/relationships" xmlns:m="http://schemas.openxmlformats.org/officeDocument/2006/math" xmlns:v="urn:schemas-microsoft-com:vml" xmlns:wp14="http://schemas.microsoft.com/office/word/2010/wordprocessingDrawing" xmlns:wp="http://schemas.openxmlformats.org/drawingml/2006/wordprocessingDrawing" xmlns:w10="urn:schemas-microsoft-com:office:word" xmlns:w="http://schemas.openxmlformats.org/wordprocessingml/2006/main" xmlns:w14="http://schemas.microsoft.com/office/word/2010/wordml" xmlns:w15="http://schemas.microsoft.com/office/word/2012/wordml" xmlns:w16se="http://schemas.microsoft.com/office/word/2015/wordml/symex" xmlns:wpg="http://schemas.microsoft.com/office/word/2010/wordprocessingGroup" xmlns:wpi="http://schemas.microsoft.com/office/word/2010/wordprocessingInk" xmlns:wne="http://schemas.microsoft.com/office/word/2006/wordml" xmlns:wps="http://schemas.microsoft.com/office/word/2010/wordprocessingShape" mc:Ignorable="w14 w15 w16se wp14">
+<w:hdr xmlns:wpc="http://schemas.microsoft.com/office/word/2010/wordprocessingCanvas" xmlns:cx="http://schemas.microsoft.com/office/drawing/2014/chartex" xmlns:cx1="http://schemas.microsoft.com/office/drawing/2015/9/8/chartex" xmlns:cx2="http://schemas.microsoft.com/office/drawing/2015/10/21/chartex" xmlns:cx3="http://schemas.microsoft.com/office/drawing/2016/5/9/chartex" xmlns:cx4="http://schemas.microsoft.com/office/drawing/2016/5/10/chartex" xmlns:cx5="http://schemas.microsoft.com/office/drawing/2016/5/11/chartex" xmlns:cx6="http://schemas.microsoft.com/office/drawing/2016/5/12/chartex" xmlns:cx7="http://schemas.microsoft.com/office/drawing/2016/5/13/chartex" xmlns:cx8="http://schemas.microsoft.com/office/drawing/2016/5/14/chartex" xmlns:mc="http://schemas.openxmlformats.org/markup-compatibility/2006" xmlns:aink="http://schemas.microsoft.com/office/drawing/2016/ink" xmlns:am3d="http://schemas.microsoft.com/office/drawing/2017/model3d" xmlns:o="urn:schemas-microsoft-com:office:office" xmlns:oel="http://schemas.microsoft.com/office/2019/extlst" xmlns:r="http://schemas.openxmlformats.org/officeDocument/2006/relationships" xmlns:m="http://schemas.openxmlformats.org/officeDocument/2006/math" xmlns:v="urn:schemas-microsoft-com:vml" xmlns:wp14="http://schemas.microsoft.com/office/word/2010/wordprocessingDrawing" xmlns:wp="http://schemas.openxmlformats.org/drawingml/2006/wordprocessingDrawing" xmlns:w10="urn:schemas-microsoft-com:office:word" xmlns:w="http://schemas.openxmlformats.org/wordprocessingml/2006/main" xmlns:w14="http://schemas.microsoft.com/office/word/2010/wordml" xmlns:w15="http://schemas.microsoft.com/office/word/2012/wordml" xmlns:w16cex="http://schemas.microsoft.com/office/word/2018/wordml/cex" xmlns:w16cid="http://schemas.microsoft.com/office/word/2016/wordml/cid" xmlns:w16="http://schemas.microsoft.com/office/word/2018/wordml" xmlns:w16du="http://schemas.microsoft.com/office/word/2023/wordml/word16du" xmlns:w16sdtdh="http://schemas.microsoft.com/office/word/2020/wordml/sdtdatahash" xmlns:w16sdtfl="http://schemas.microsoft.com/office/word/2024/wordml/sdtformatlock" xmlns:w16se="http://schemas.microsoft.com/office/word/2015/wordml/symex" xmlns:wpg="http://schemas.microsoft.com/office/word/2010/wordprocessingGroup" xmlns:wpi="http://schemas.microsoft.com/office/word/2010/wordprocessingInk" xmlns:wne="http://schemas.microsoft.com/office/word/2006/wordml" xmlns:wps="http://schemas.microsoft.com/office/word/2010/wordprocessingShape" mc:Ignorable="w14 w15 w16se w16cid w16 w16cex w16sdtdh w16sdtfl w16du wp14">
   <w:p>
     <w:pPr>
-      <w:pStyle w:val="Zhlav"/>
+      <w:pStyle w:val="Header"/>
     </w:pPr>
   </w:p>
 </w:hdr>
 </file>
 
 <file path=word/header2.xml><?xml version="1.0" encoding="utf-8"?>
-<w:hdr xmlns:wpc="http://schemas.microsoft.com/office/word/2010/wordprocessingCanvas" xmlns:cx="http://schemas.microsoft.com/office/drawing/2014/chartex" xmlns:cx1="http://schemas.microsoft.com/office/drawing/2015/9/8/chartex" xmlns:mc="http://schemas.openxmlformats.org/markup-compatibility/2006" xmlns:o="urn:schemas-microsoft-com:office:office" xmlns:r="http://schemas.openxmlformats.org/officeDocument/2006/relationships" xmlns:m="http://schemas.openxmlformats.org/officeDocument/2006/math" xmlns:v="urn:schemas-microsoft-com:vml" xmlns:wp14="http://schemas.microsoft.com/office/word/2010/wordprocessingDrawing" xmlns:wp="http://schemas.openxmlformats.org/drawingml/2006/wordprocessingDrawing" xmlns:w10="urn:schemas-microsoft-com:office:word" xmlns:w="http://schemas.openxmlformats.org/wordprocessingml/2006/main" xmlns:w14="http://schemas.microsoft.com/office/word/2010/wordml" xmlns:w15="http://schemas.microsoft.com/office/word/2012/wordml" xmlns:w16se="http://schemas.microsoft.com/office/word/2015/wordml/symex" xmlns:wpg="http://schemas.microsoft.com/office/word/2010/wordprocessingGroup" xmlns:wpi="http://schemas.microsoft.com/office/word/2010/wordprocessingInk" xmlns:wne="http://schemas.microsoft.com/office/word/2006/wordml" xmlns:wps="http://schemas.microsoft.com/office/word/2010/wordprocessingShape" mc:Ignorable="w14 w15 w16se wp14">
+<w:hdr xmlns:wpc="http://schemas.microsoft.com/office/word/2010/wordprocessingCanvas" xmlns:cx="http://schemas.microsoft.com/office/drawing/2014/chartex" xmlns:cx1="http://schemas.microsoft.com/office/drawing/2015/9/8/chartex" xmlns:cx2="http://schemas.microsoft.com/office/drawing/2015/10/21/chartex" xmlns:cx3="http://schemas.microsoft.com/office/drawing/2016/5/9/chartex" xmlns:cx4="http://schemas.microsoft.com/office/drawing/2016/5/10/chartex" xmlns:cx5="http://schemas.microsoft.com/office/drawing/2016/5/11/chartex" xmlns:cx6="http://schemas.microsoft.com/office/drawing/2016/5/12/chartex" xmlns:cx7="http://schemas.microsoft.com/office/drawing/2016/5/13/chartex" xmlns:cx8="http://schemas.microsoft.com/office/drawing/2016/5/14/chartex" xmlns:mc="http://schemas.openxmlformats.org/markup-compatibility/2006" xmlns:aink="http://schemas.microsoft.com/office/drawing/2016/ink" xmlns:am3d="http://schemas.microsoft.com/office/drawing/2017/model3d" xmlns:o="urn:schemas-microsoft-com:office:office" xmlns:oel="http://schemas.microsoft.com/office/2019/extlst" xmlns:r="http://schemas.openxmlformats.org/officeDocument/2006/relationships" xmlns:m="http://schemas.openxmlformats.org/officeDocument/2006/math" xmlns:v="urn:schemas-microsoft-com:vml" xmlns:wp14="http://schemas.microsoft.com/office/word/2010/wordprocessingDrawing" xmlns:wp="http://schemas.openxmlformats.org/drawingml/2006/wordprocessingDrawing" xmlns:w10="urn:schemas-microsoft-com:office:word" xmlns:w="http://schemas.openxmlformats.org/wordprocessingml/2006/main" xmlns:w14="http://schemas.microsoft.com/office/word/2010/wordml" xmlns:w15="http://schemas.microsoft.com/office/word/2012/wordml" xmlns:w16cex="http://schemas.microsoft.com/office/word/2018/wordml/cex" xmlns:w16cid="http://schemas.microsoft.com/office/word/2016/wordml/cid" xmlns:w16="http://schemas.microsoft.com/office/word/2018/wordml" xmlns:w16du="http://schemas.microsoft.com/office/word/2023/wordml/word16du" xmlns:w16sdtdh="http://schemas.microsoft.com/office/word/2020/wordml/sdtdatahash" xmlns:w16sdtfl="http://schemas.microsoft.com/office/word/2024/wordml/sdtformatlock" xmlns:w16se="http://schemas.microsoft.com/office/word/2015/wordml/symex" xmlns:wpg="http://schemas.microsoft.com/office/word/2010/wordprocessingGroup" xmlns:wpi="http://schemas.microsoft.com/office/word/2010/wordprocessingInk" xmlns:wne="http://schemas.microsoft.com/office/word/2006/wordml" xmlns:wps="http://schemas.microsoft.com/office/word/2010/wordprocessingShape" mc:Ignorable="w14 w15 w16se w16cid w16 w16cex w16sdtdh w16sdtfl w16du wp14">
   <w:p>
     <w:pPr>
-      <w:pStyle w:val="Zhlav"/>
+      <w:pStyle w:val="Header"/>
     </w:pPr>
   </w:p>
 </w:hdr>
 </file>
 
 <file path=word/numbering.xml><?xml version="1.0" encoding="utf-8"?>
-<w:numbering xmlns:wpc="http://schemas.microsoft.com/office/word/2010/wordprocessingCanvas" xmlns:cx="http://schemas.microsoft.com/office/drawing/2014/chartex" xmlns:cx1="http://schemas.microsoft.com/office/drawing/2015/9/8/chartex" xmlns:mc="http://schemas.openxmlformats.org/markup-compatibility/2006" xmlns:o="urn:schemas-microsoft-com:office:office" xmlns:r="http://schemas.openxmlformats.org/officeDocument/2006/relationships" xmlns:m="http://schemas.openxmlformats.org/officeDocument/2006/math" xmlns:v="urn:schemas-microsoft-com:vml" xmlns:wp14="http://schemas.microsoft.com/office/word/2010/wordprocessingDrawing" xmlns:wp="http://schemas.openxmlformats.org/drawingml/2006/wordprocessingDrawing" xmlns:w10="urn:schemas-microsoft-com:office:word" xmlns:w="http://schemas.openxmlformats.org/wordprocessingml/2006/main" xmlns:w14="http://schemas.microsoft.com/office/word/2010/wordml" xmlns:w15="http://schemas.microsoft.com/office/word/2012/wordml" xmlns:w16se="http://schemas.microsoft.com/office/word/2015/wordml/symex" xmlns:wpg="http://schemas.microsoft.com/office/word/2010/wordprocessingGroup" xmlns:wpi="http://schemas.microsoft.com/office/word/2010/wordprocessingInk" xmlns:wne="http://schemas.microsoft.com/office/word/2006/wordml" xmlns:wps="http://schemas.microsoft.com/office/word/2010/wordprocessingShape" mc:Ignorable="w14 w15 w16se wp14">
+<w:numbering xmlns:wpc="http://schemas.microsoft.com/office/word/2010/wordprocessingCanvas" xmlns:cx="http://schemas.microsoft.com/office/drawing/2014/chartex" xmlns:cx1="http://schemas.microsoft.com/office/drawing/2015/9/8/chartex" xmlns:cx2="http://schemas.microsoft.com/office/drawing/2015/10/21/chartex" xmlns:cx3="http://schemas.microsoft.com/office/drawing/2016/5/9/chartex" xmlns:cx4="http://schemas.microsoft.com/office/drawing/2016/5/10/chartex" xmlns:cx5="http://schemas.microsoft.com/office/drawing/2016/5/11/chartex" xmlns:cx6="http://schemas.microsoft.com/office/drawing/2016/5/12/chartex" xmlns:cx7="http://schemas.microsoft.com/office/drawing/2016/5/13/chartex" xmlns:cx8="http://schemas.microsoft.com/office/drawing/2016/5/14/chartex" xmlns:mc="http://schemas.openxmlformats.org/markup-compatibility/2006" xmlns:aink="http://schemas.microsoft.com/office/drawing/2016/ink" xmlns:am3d="http://schemas.microsoft.com/office/drawing/2017/model3d" xmlns:o="urn:schemas-microsoft-com:office:office" xmlns:oel="http://schemas.microsoft.com/office/2019/extlst" xmlns:r="http://schemas.openxmlformats.org/officeDocument/2006/relationships" xmlns:m="http://schemas.openxmlformats.org/officeDocument/2006/math" xmlns:v="urn:schemas-microsoft-com:vml" xmlns:wp14="http://schemas.microsoft.com/office/word/2010/wordprocessingDrawing" xmlns:wp="http://schemas.openxmlformats.org/drawingml/2006/wordprocessingDrawing" xmlns:w10="urn:schemas-microsoft-com:office:word" xmlns:w="http://schemas.openxmlformats.org/wordprocessingml/2006/main" xmlns:w14="http://schemas.microsoft.com/office/word/2010/wordml" xmlns:w15="http://schemas.microsoft.com/office/word/2012/wordml" xmlns:w16cex="http://schemas.microsoft.com/office/word/2018/wordml/cex" xmlns:w16cid="http://schemas.microsoft.com/office/word/2016/wordml/cid" xmlns:w16="http://schemas.microsoft.com/office/word/2018/wordml" xmlns:w16du="http://schemas.microsoft.com/office/word/2023/wordml/word16du" xmlns:w16sdtdh="http://schemas.microsoft.com/office/word/2020/wordml/sdtdatahash" xmlns:w16sdtfl="http://schemas.microsoft.com/office/word/2024/wordml/sdtformatlock" xmlns:w16se="http://schemas.microsoft.com/office/word/2015/wordml/symex" xmlns:wpg="http://schemas.microsoft.com/office/word/2010/wordprocessingGroup" xmlns:wpi="http://schemas.microsoft.com/office/word/2010/wordprocessingInk" xmlns:wne="http://schemas.microsoft.com/office/word/2006/wordml" xmlns:wps="http://schemas.microsoft.com/office/word/2010/wordprocessingShape" mc:Ignorable="w14 w15 w16se w16cid w16 w16cex w16sdtdh w16sdtfl w16du wp14">
   <w:abstractNum w:abstractNumId="0" w15:restartNumberingAfterBreak="0">
     <w:nsid w:val="FFFFFF7C"/>
     <w:multiLevelType w:val="singleLevel"/>
@@ -4555,7 +4359,7 @@
     <w:lvl w:ilvl="0">
       <w:start w:val="1"/>
       <w:numFmt w:val="decimal"/>
-      <w:pStyle w:val="slovanseznam5"/>
+      <w:pStyle w:val="ListNumber5"/>
       <w:lvlText w:val="%1."/>
       <w:lvlJc w:val="left"/>
       <w:pPr>
@@ -4573,7 +4377,7 @@
     <w:lvl w:ilvl="0">
       <w:start w:val="1"/>
       <w:numFmt w:val="decimal"/>
-      <w:pStyle w:val="slovanseznam4"/>
+      <w:pStyle w:val="ListNumber4"/>
       <w:lvlText w:val="%1."/>
       <w:lvlJc w:val="left"/>
       <w:pPr>
@@ -4591,7 +4395,7 @@
     <w:lvl w:ilvl="0">
       <w:start w:val="1"/>
       <w:numFmt w:val="decimal"/>
-      <w:pStyle w:val="slovanseznam3"/>
+      <w:pStyle w:val="ListNumber3"/>
       <w:lvlText w:val="%1."/>
       <w:lvlJc w:val="left"/>
       <w:pPr>
@@ -4609,7 +4413,7 @@
     <w:lvl w:ilvl="0">
       <w:start w:val="1"/>
       <w:numFmt w:val="decimal"/>
-      <w:pStyle w:val="slovanseznam2"/>
+      <w:pStyle w:val="ListNumber2"/>
       <w:lvlText w:val="%1."/>
       <w:lvlJc w:val="left"/>
       <w:pPr>
@@ -4627,7 +4431,7 @@
     <w:lvl w:ilvl="0">
       <w:start w:val="1"/>
       <w:numFmt w:val="bullet"/>
-      <w:pStyle w:val="Seznamsodrkami5"/>
+      <w:pStyle w:val="ListBullet5"/>
       <w:lvlText w:val=""/>
       <w:lvlJc w:val="left"/>
       <w:pPr>
@@ -4648,7 +4452,7 @@
     <w:lvl w:ilvl="0">
       <w:start w:val="1"/>
       <w:numFmt w:val="bullet"/>
-      <w:pStyle w:val="Seznamsodrkami4"/>
+      <w:pStyle w:val="ListBullet4"/>
       <w:lvlText w:val=""/>
       <w:lvlJc w:val="left"/>
       <w:pPr>
@@ -4669,7 +4473,7 @@
     <w:lvl w:ilvl="0">
       <w:start w:val="1"/>
       <w:numFmt w:val="bullet"/>
-      <w:pStyle w:val="Seznamsodrkami3"/>
+      <w:pStyle w:val="ListBullet3"/>
       <w:lvlText w:val=""/>
       <w:lvlJc w:val="left"/>
       <w:pPr>
@@ -4690,7 +4494,7 @@
     <w:lvl w:ilvl="0">
       <w:start w:val="1"/>
       <w:numFmt w:val="bullet"/>
-      <w:pStyle w:val="Seznamsodrkami2"/>
+      <w:pStyle w:val="ListBullet2"/>
       <w:lvlText w:val=""/>
       <w:lvlJc w:val="left"/>
       <w:pPr>
@@ -4711,7 +4515,7 @@
     <w:lvl w:ilvl="0">
       <w:start w:val="1"/>
       <w:numFmt w:val="bullet"/>
-      <w:pStyle w:val="Seznamsodrkami"/>
+      <w:pStyle w:val="ListBullet"/>
       <w:lvlText w:val=""/>
       <w:lvlJc w:val="left"/>
       <w:pPr>
@@ -4747,6 +4551,119 @@
     </w:lvl>
   </w:abstractNum>
   <w:abstractNum w:abstractNumId="10" w15:restartNumberingAfterBreak="0">
+    <w:nsid w:val="073E18B7"/>
+    <w:multiLevelType w:val="hybridMultilevel"/>
+    <w:tmpl w:val="BA6073E8"/>
+    <w:lvl w:ilvl="0" w:tplc="08090001">
+      <w:start w:val="1"/>
+      <w:numFmt w:val="bullet"/>
+      <w:lvlText w:val=""/>
+      <w:lvlJc w:val="left"/>
+      <w:pPr>
+        <w:ind w:left="720" w:hanging="360"/>
+      </w:pPr>
+      <w:rPr>
+        <w:rFonts w:ascii="Symbol" w:hAnsi="Symbol" w:hint="default"/>
+      </w:rPr>
+    </w:lvl>
+    <w:lvl w:ilvl="1" w:tplc="08090003" w:tentative="1">
+      <w:start w:val="1"/>
+      <w:numFmt w:val="bullet"/>
+      <w:lvlText w:val="o"/>
+      <w:lvlJc w:val="left"/>
+      <w:pPr>
+        <w:ind w:left="1440" w:hanging="360"/>
+      </w:pPr>
+      <w:rPr>
+        <w:rFonts w:ascii="Courier New" w:hAnsi="Courier New" w:cs="Courier New" w:hint="default"/>
+      </w:rPr>
+    </w:lvl>
+    <w:lvl w:ilvl="2" w:tplc="08090005" w:tentative="1">
+      <w:start w:val="1"/>
+      <w:numFmt w:val="bullet"/>
+      <w:lvlText w:val=""/>
+      <w:lvlJc w:val="left"/>
+      <w:pPr>
+        <w:ind w:left="2160" w:hanging="360"/>
+      </w:pPr>
+      <w:rPr>
+        <w:rFonts w:ascii="Wingdings" w:hAnsi="Wingdings" w:hint="default"/>
+      </w:rPr>
+    </w:lvl>
+    <w:lvl w:ilvl="3" w:tplc="08090001" w:tentative="1">
+      <w:start w:val="1"/>
+      <w:numFmt w:val="bullet"/>
+      <w:lvlText w:val=""/>
+      <w:lvlJc w:val="left"/>
+      <w:pPr>
+        <w:ind w:left="2880" w:hanging="360"/>
+      </w:pPr>
+      <w:rPr>
+        <w:rFonts w:ascii="Symbol" w:hAnsi="Symbol" w:hint="default"/>
+      </w:rPr>
+    </w:lvl>
+    <w:lvl w:ilvl="4" w:tplc="08090003" w:tentative="1">
+      <w:start w:val="1"/>
+      <w:numFmt w:val="bullet"/>
+      <w:lvlText w:val="o"/>
+      <w:lvlJc w:val="left"/>
+      <w:pPr>
+        <w:ind w:left="3600" w:hanging="360"/>
+      </w:pPr>
+      <w:rPr>
+        <w:rFonts w:ascii="Courier New" w:hAnsi="Courier New" w:cs="Courier New" w:hint="default"/>
+      </w:rPr>
+    </w:lvl>
+    <w:lvl w:ilvl="5" w:tplc="08090005" w:tentative="1">
+      <w:start w:val="1"/>
+      <w:numFmt w:val="bullet"/>
+      <w:lvlText w:val=""/>
+      <w:lvlJc w:val="left"/>
+      <w:pPr>
+        <w:ind w:left="4320" w:hanging="360"/>
+      </w:pPr>
+      <w:rPr>
+        <w:rFonts w:ascii="Wingdings" w:hAnsi="Wingdings" w:hint="default"/>
+      </w:rPr>
+    </w:lvl>
+    <w:lvl w:ilvl="6" w:tplc="08090001" w:tentative="1">
+      <w:start w:val="1"/>
+      <w:numFmt w:val="bullet"/>
+      <w:lvlText w:val=""/>
+      <w:lvlJc w:val="left"/>
+      <w:pPr>
+        <w:ind w:left="5040" w:hanging="360"/>
+      </w:pPr>
+      <w:rPr>
+        <w:rFonts w:ascii="Symbol" w:hAnsi="Symbol" w:hint="default"/>
+      </w:rPr>
+    </w:lvl>
+    <w:lvl w:ilvl="7" w:tplc="08090003" w:tentative="1">
+      <w:start w:val="1"/>
+      <w:numFmt w:val="bullet"/>
+      <w:lvlText w:val="o"/>
+      <w:lvlJc w:val="left"/>
+      <w:pPr>
+        <w:ind w:left="5760" w:hanging="360"/>
+      </w:pPr>
+      <w:rPr>
+        <w:rFonts w:ascii="Courier New" w:hAnsi="Courier New" w:cs="Courier New" w:hint="default"/>
+      </w:rPr>
+    </w:lvl>
+    <w:lvl w:ilvl="8" w:tplc="08090005" w:tentative="1">
+      <w:start w:val="1"/>
+      <w:numFmt w:val="bullet"/>
+      <w:lvlText w:val=""/>
+      <w:lvlJc w:val="left"/>
+      <w:pPr>
+        <w:ind w:left="6480" w:hanging="360"/>
+      </w:pPr>
+      <w:rPr>
+        <w:rFonts w:ascii="Wingdings" w:hAnsi="Wingdings" w:hint="default"/>
+      </w:rPr>
+    </w:lvl>
+  </w:abstractNum>
+  <w:abstractNum w:abstractNumId="11" w15:restartNumberingAfterBreak="0">
     <w:nsid w:val="089561A9"/>
     <w:multiLevelType w:val="singleLevel"/>
     <w:tmpl w:val="FA08913A"/>
@@ -4764,7 +4681,7 @@
       </w:pPr>
     </w:lvl>
   </w:abstractNum>
-  <w:abstractNum w:abstractNumId="11" w15:restartNumberingAfterBreak="0">
+  <w:abstractNum w:abstractNumId="12" w15:restartNumberingAfterBreak="0">
     <w:nsid w:val="0A0C0D87"/>
     <w:multiLevelType w:val="singleLevel"/>
     <w:tmpl w:val="476C6820"/>
@@ -4782,7 +4699,7 @@
       </w:pPr>
     </w:lvl>
   </w:abstractNum>
-  <w:abstractNum w:abstractNumId="12" w15:restartNumberingAfterBreak="0">
+  <w:abstractNum w:abstractNumId="13" w15:restartNumberingAfterBreak="0">
     <w:nsid w:val="0E3F2CF0"/>
     <w:multiLevelType w:val="singleLevel"/>
     <w:tmpl w:val="6802948C"/>
@@ -4794,7 +4711,120 @@
       <w:lvlJc w:val="left"/>
     </w:lvl>
   </w:abstractNum>
-  <w:abstractNum w:abstractNumId="13" w15:restartNumberingAfterBreak="0">
+  <w:abstractNum w:abstractNumId="14" w15:restartNumberingAfterBreak="0">
+    <w:nsid w:val="11BA47CE"/>
+    <w:multiLevelType w:val="hybridMultilevel"/>
+    <w:tmpl w:val="C2FE27F6"/>
+    <w:lvl w:ilvl="0" w:tplc="08090001">
+      <w:start w:val="1"/>
+      <w:numFmt w:val="bullet"/>
+      <w:lvlText w:val=""/>
+      <w:lvlJc w:val="left"/>
+      <w:pPr>
+        <w:ind w:left="720" w:hanging="360"/>
+      </w:pPr>
+      <w:rPr>
+        <w:rFonts w:ascii="Symbol" w:hAnsi="Symbol" w:hint="default"/>
+      </w:rPr>
+    </w:lvl>
+    <w:lvl w:ilvl="1" w:tplc="08090003" w:tentative="1">
+      <w:start w:val="1"/>
+      <w:numFmt w:val="bullet"/>
+      <w:lvlText w:val="o"/>
+      <w:lvlJc w:val="left"/>
+      <w:pPr>
+        <w:ind w:left="1440" w:hanging="360"/>
+      </w:pPr>
+      <w:rPr>
+        <w:rFonts w:ascii="Courier New" w:hAnsi="Courier New" w:cs="Courier New" w:hint="default"/>
+      </w:rPr>
+    </w:lvl>
+    <w:lvl w:ilvl="2" w:tplc="08090005" w:tentative="1">
+      <w:start w:val="1"/>
+      <w:numFmt w:val="bullet"/>
+      <w:lvlText w:val=""/>
+      <w:lvlJc w:val="left"/>
+      <w:pPr>
+        <w:ind w:left="2160" w:hanging="360"/>
+      </w:pPr>
+      <w:rPr>
+        <w:rFonts w:ascii="Wingdings" w:hAnsi="Wingdings" w:hint="default"/>
+      </w:rPr>
+    </w:lvl>
+    <w:lvl w:ilvl="3" w:tplc="08090001" w:tentative="1">
+      <w:start w:val="1"/>
+      <w:numFmt w:val="bullet"/>
+      <w:lvlText w:val=""/>
+      <w:lvlJc w:val="left"/>
+      <w:pPr>
+        <w:ind w:left="2880" w:hanging="360"/>
+      </w:pPr>
+      <w:rPr>
+        <w:rFonts w:ascii="Symbol" w:hAnsi="Symbol" w:hint="default"/>
+      </w:rPr>
+    </w:lvl>
+    <w:lvl w:ilvl="4" w:tplc="08090003" w:tentative="1">
+      <w:start w:val="1"/>
+      <w:numFmt w:val="bullet"/>
+      <w:lvlText w:val="o"/>
+      <w:lvlJc w:val="left"/>
+      <w:pPr>
+        <w:ind w:left="3600" w:hanging="360"/>
+      </w:pPr>
+      <w:rPr>
+        <w:rFonts w:ascii="Courier New" w:hAnsi="Courier New" w:cs="Courier New" w:hint="default"/>
+      </w:rPr>
+    </w:lvl>
+    <w:lvl w:ilvl="5" w:tplc="08090005" w:tentative="1">
+      <w:start w:val="1"/>
+      <w:numFmt w:val="bullet"/>
+      <w:lvlText w:val=""/>
+      <w:lvlJc w:val="left"/>
+      <w:pPr>
+        <w:ind w:left="4320" w:hanging="360"/>
+      </w:pPr>
+      <w:rPr>
+        <w:rFonts w:ascii="Wingdings" w:hAnsi="Wingdings" w:hint="default"/>
+      </w:rPr>
+    </w:lvl>
+    <w:lvl w:ilvl="6" w:tplc="08090001" w:tentative="1">
+      <w:start w:val="1"/>
+      <w:numFmt w:val="bullet"/>
+      <w:lvlText w:val=""/>
+      <w:lvlJc w:val="left"/>
+      <w:pPr>
+        <w:ind w:left="5040" w:hanging="360"/>
+      </w:pPr>
+      <w:rPr>
+        <w:rFonts w:ascii="Symbol" w:hAnsi="Symbol" w:hint="default"/>
+      </w:rPr>
+    </w:lvl>
+    <w:lvl w:ilvl="7" w:tplc="08090003" w:tentative="1">
+      <w:start w:val="1"/>
+      <w:numFmt w:val="bullet"/>
+      <w:lvlText w:val="o"/>
+      <w:lvlJc w:val="left"/>
+      <w:pPr>
+        <w:ind w:left="5760" w:hanging="360"/>
+      </w:pPr>
+      <w:rPr>
+        <w:rFonts w:ascii="Courier New" w:hAnsi="Courier New" w:cs="Courier New" w:hint="default"/>
+      </w:rPr>
+    </w:lvl>
+    <w:lvl w:ilvl="8" w:tplc="08090005" w:tentative="1">
+      <w:start w:val="1"/>
+      <w:numFmt w:val="bullet"/>
+      <w:lvlText w:val=""/>
+      <w:lvlJc w:val="left"/>
+      <w:pPr>
+        <w:ind w:left="6480" w:hanging="360"/>
+      </w:pPr>
+      <w:rPr>
+        <w:rFonts w:ascii="Wingdings" w:hAnsi="Wingdings" w:hint="default"/>
+      </w:rPr>
+    </w:lvl>
+  </w:abstractNum>
+  <w:abstractNum w:abstractNumId="15" w15:restartNumberingAfterBreak="0">
     <w:nsid w:val="120928D5"/>
     <w:multiLevelType w:val="hybridMultilevel"/>
     <w:tmpl w:val="6600676C"/>
@@ -4907,7 +4937,7 @@
       </w:rPr>
     </w:lvl>
   </w:abstractNum>
-  <w:abstractNum w:abstractNumId="14" w15:restartNumberingAfterBreak="0">
+  <w:abstractNum w:abstractNumId="16" w15:restartNumberingAfterBreak="0">
     <w:nsid w:val="16EF71FE"/>
     <w:multiLevelType w:val="hybridMultilevel"/>
     <w:tmpl w:val="B8C03D26"/>
@@ -5020,7 +5050,7 @@
       </w:rPr>
     </w:lvl>
   </w:abstractNum>
-  <w:abstractNum w:abstractNumId="15" w15:restartNumberingAfterBreak="0">
+  <w:abstractNum w:abstractNumId="17" w15:restartNumberingAfterBreak="0">
     <w:nsid w:val="21EE5F55"/>
     <w:multiLevelType w:val="hybridMultilevel"/>
     <w:tmpl w:val="F7E0097A"/>
@@ -5133,7 +5163,7 @@
       </w:rPr>
     </w:lvl>
   </w:abstractNum>
-  <w:abstractNum w:abstractNumId="16" w15:restartNumberingAfterBreak="0">
+  <w:abstractNum w:abstractNumId="18" w15:restartNumberingAfterBreak="0">
     <w:nsid w:val="316D5F79"/>
     <w:multiLevelType w:val="hybridMultilevel"/>
     <w:tmpl w:val="D48A4D58"/>
@@ -5246,7 +5276,7 @@
       </w:rPr>
     </w:lvl>
   </w:abstractNum>
-  <w:abstractNum w:abstractNumId="17" w15:restartNumberingAfterBreak="0">
+  <w:abstractNum w:abstractNumId="19" w15:restartNumberingAfterBreak="0">
     <w:nsid w:val="31D902CC"/>
     <w:multiLevelType w:val="hybridMultilevel"/>
     <w:tmpl w:val="16704BF0"/>
@@ -5359,7 +5389,7 @@
       </w:rPr>
     </w:lvl>
   </w:abstractNum>
-  <w:abstractNum w:abstractNumId="18" w15:restartNumberingAfterBreak="0">
+  <w:abstractNum w:abstractNumId="20" w15:restartNumberingAfterBreak="0">
     <w:nsid w:val="3A05102E"/>
     <w:multiLevelType w:val="singleLevel"/>
     <w:tmpl w:val="6802948C"/>
@@ -5371,7 +5401,120 @@
       <w:lvlJc w:val="left"/>
     </w:lvl>
   </w:abstractNum>
-  <w:abstractNum w:abstractNumId="19" w15:restartNumberingAfterBreak="0">
+  <w:abstractNum w:abstractNumId="21" w15:restartNumberingAfterBreak="0">
+    <w:nsid w:val="3AA763DB"/>
+    <w:multiLevelType w:val="hybridMultilevel"/>
+    <w:tmpl w:val="0708000A"/>
+    <w:lvl w:ilvl="0" w:tplc="08090001">
+      <w:start w:val="1"/>
+      <w:numFmt w:val="bullet"/>
+      <w:lvlText w:val=""/>
+      <w:lvlJc w:val="left"/>
+      <w:pPr>
+        <w:ind w:left="720" w:hanging="360"/>
+      </w:pPr>
+      <w:rPr>
+        <w:rFonts w:ascii="Symbol" w:hAnsi="Symbol" w:hint="default"/>
+      </w:rPr>
+    </w:lvl>
+    <w:lvl w:ilvl="1" w:tplc="08090003" w:tentative="1">
+      <w:start w:val="1"/>
+      <w:numFmt w:val="bullet"/>
+      <w:lvlText w:val="o"/>
+      <w:lvlJc w:val="left"/>
+      <w:pPr>
+        <w:ind w:left="1440" w:hanging="360"/>
+      </w:pPr>
+      <w:rPr>
+        <w:rFonts w:ascii="Courier New" w:hAnsi="Courier New" w:cs="Courier New" w:hint="default"/>
+      </w:rPr>
+    </w:lvl>
+    <w:lvl w:ilvl="2" w:tplc="08090005" w:tentative="1">
+      <w:start w:val="1"/>
+      <w:numFmt w:val="bullet"/>
+      <w:lvlText w:val=""/>
+      <w:lvlJc w:val="left"/>
+      <w:pPr>
+        <w:ind w:left="2160" w:hanging="360"/>
+      </w:pPr>
+      <w:rPr>
+        <w:rFonts w:ascii="Wingdings" w:hAnsi="Wingdings" w:hint="default"/>
+      </w:rPr>
+    </w:lvl>
+    <w:lvl w:ilvl="3" w:tplc="08090001" w:tentative="1">
+      <w:start w:val="1"/>
+      <w:numFmt w:val="bullet"/>
+      <w:lvlText w:val=""/>
+      <w:lvlJc w:val="left"/>
+      <w:pPr>
+        <w:ind w:left="2880" w:hanging="360"/>
+      </w:pPr>
+      <w:rPr>
+        <w:rFonts w:ascii="Symbol" w:hAnsi="Symbol" w:hint="default"/>
+      </w:rPr>
+    </w:lvl>
+    <w:lvl w:ilvl="4" w:tplc="08090003" w:tentative="1">
+      <w:start w:val="1"/>
+      <w:numFmt w:val="bullet"/>
+      <w:lvlText w:val="o"/>
+      <w:lvlJc w:val="left"/>
+      <w:pPr>
+        <w:ind w:left="3600" w:hanging="360"/>
+      </w:pPr>
+      <w:rPr>
+        <w:rFonts w:ascii="Courier New" w:hAnsi="Courier New" w:cs="Courier New" w:hint="default"/>
+      </w:rPr>
+    </w:lvl>
+    <w:lvl w:ilvl="5" w:tplc="08090005" w:tentative="1">
+      <w:start w:val="1"/>
+      <w:numFmt w:val="bullet"/>
+      <w:lvlText w:val=""/>
+      <w:lvlJc w:val="left"/>
+      <w:pPr>
+        <w:ind w:left="4320" w:hanging="360"/>
+      </w:pPr>
+      <w:rPr>
+        <w:rFonts w:ascii="Wingdings" w:hAnsi="Wingdings" w:hint="default"/>
+      </w:rPr>
+    </w:lvl>
+    <w:lvl w:ilvl="6" w:tplc="08090001" w:tentative="1">
+      <w:start w:val="1"/>
+      <w:numFmt w:val="bullet"/>
+      <w:lvlText w:val=""/>
+      <w:lvlJc w:val="left"/>
+      <w:pPr>
+        <w:ind w:left="5040" w:hanging="360"/>
+      </w:pPr>
+      <w:rPr>
+        <w:rFonts w:ascii="Symbol" w:hAnsi="Symbol" w:hint="default"/>
+      </w:rPr>
+    </w:lvl>
+    <w:lvl w:ilvl="7" w:tplc="08090003" w:tentative="1">
+      <w:start w:val="1"/>
+      <w:numFmt w:val="bullet"/>
+      <w:lvlText w:val="o"/>
+      <w:lvlJc w:val="left"/>
+      <w:pPr>
+        <w:ind w:left="5760" w:hanging="360"/>
+      </w:pPr>
+      <w:rPr>
+        <w:rFonts w:ascii="Courier New" w:hAnsi="Courier New" w:cs="Courier New" w:hint="default"/>
+      </w:rPr>
+    </w:lvl>
+    <w:lvl w:ilvl="8" w:tplc="08090005" w:tentative="1">
+      <w:start w:val="1"/>
+      <w:numFmt w:val="bullet"/>
+      <w:lvlText w:val=""/>
+      <w:lvlJc w:val="left"/>
+      <w:pPr>
+        <w:ind w:left="6480" w:hanging="360"/>
+      </w:pPr>
+      <w:rPr>
+        <w:rFonts w:ascii="Wingdings" w:hAnsi="Wingdings" w:hint="default"/>
+      </w:rPr>
+    </w:lvl>
+  </w:abstractNum>
+  <w:abstractNum w:abstractNumId="22" w15:restartNumberingAfterBreak="0">
     <w:nsid w:val="3B4E64E9"/>
     <w:multiLevelType w:val="hybridMultilevel"/>
     <w:tmpl w:val="16B8FC22"/>
@@ -5484,7 +5627,7 @@
       </w:rPr>
     </w:lvl>
   </w:abstractNum>
-  <w:abstractNum w:abstractNumId="20" w15:restartNumberingAfterBreak="0">
+  <w:abstractNum w:abstractNumId="23" w15:restartNumberingAfterBreak="0">
     <w:nsid w:val="3CD46365"/>
     <w:multiLevelType w:val="hybridMultilevel"/>
     <w:tmpl w:val="ABCC5092"/>
@@ -5597,11 +5740,11 @@
       </w:rPr>
     </w:lvl>
   </w:abstractNum>
-  <w:abstractNum w:abstractNumId="21" w15:restartNumberingAfterBreak="0">
+  <w:abstractNum w:abstractNumId="24" w15:restartNumberingAfterBreak="0">
     <w:nsid w:val="40036746"/>
     <w:multiLevelType w:val="multilevel"/>
     <w:tmpl w:val="04050023"/>
-    <w:styleLink w:val="lnekoddl"/>
+    <w:styleLink w:val="ArticleSection"/>
     <w:lvl w:ilvl="0">
       <w:start w:val="1"/>
       <w:numFmt w:val="upperRoman"/>
@@ -5712,7 +5855,7 @@
       </w:pPr>
     </w:lvl>
   </w:abstractNum>
-  <w:abstractNum w:abstractNumId="22" w15:restartNumberingAfterBreak="0">
+  <w:abstractNum w:abstractNumId="25" w15:restartNumberingAfterBreak="0">
     <w:nsid w:val="45033A0A"/>
     <w:multiLevelType w:val="multilevel"/>
     <w:tmpl w:val="0405001D"/>
@@ -5826,14 +5969,14 @@
       </w:pPr>
     </w:lvl>
   </w:abstractNum>
-  <w:abstractNum w:abstractNumId="23" w15:restartNumberingAfterBreak="0">
+  <w:abstractNum w:abstractNumId="26" w15:restartNumberingAfterBreak="0">
     <w:nsid w:val="46166F52"/>
     <w:multiLevelType w:val="singleLevel"/>
     <w:tmpl w:val="04882B2A"/>
     <w:lvl w:ilvl="0">
       <w:start w:val="1"/>
       <w:numFmt w:val="decimal"/>
-      <w:pStyle w:val="slovanseznam"/>
+      <w:pStyle w:val="ListNumber"/>
       <w:lvlText w:val="%1."/>
       <w:legacy w:legacy="1" w:legacySpace="0" w:legacyIndent="283"/>
       <w:lvlJc w:val="left"/>
@@ -5842,7 +5985,7 @@
       </w:pPr>
     </w:lvl>
   </w:abstractNum>
-  <w:abstractNum w:abstractNumId="24" w15:restartNumberingAfterBreak="0">
+  <w:abstractNum w:abstractNumId="27" w15:restartNumberingAfterBreak="0">
     <w:nsid w:val="49266AB7"/>
     <w:multiLevelType w:val="singleLevel"/>
     <w:tmpl w:val="67E67A1E"/>
@@ -5860,7 +6003,7 @@
       </w:pPr>
     </w:lvl>
   </w:abstractNum>
-  <w:abstractNum w:abstractNumId="25" w15:restartNumberingAfterBreak="0">
+  <w:abstractNum w:abstractNumId="28" w15:restartNumberingAfterBreak="0">
     <w:nsid w:val="50FC12F7"/>
     <w:multiLevelType w:val="multilevel"/>
     <w:tmpl w:val="0405001F"/>
@@ -5974,7 +6117,7 @@
       </w:pPr>
     </w:lvl>
   </w:abstractNum>
-  <w:abstractNum w:abstractNumId="26" w15:restartNumberingAfterBreak="0">
+  <w:abstractNum w:abstractNumId="29" w15:restartNumberingAfterBreak="0">
     <w:nsid w:val="53177262"/>
     <w:multiLevelType w:val="singleLevel"/>
     <w:tmpl w:val="17569860"/>
@@ -5992,7 +6135,7 @@
       </w:pPr>
     </w:lvl>
   </w:abstractNum>
-  <w:abstractNum w:abstractNumId="27" w15:restartNumberingAfterBreak="0">
+  <w:abstractNum w:abstractNumId="30" w15:restartNumberingAfterBreak="0">
     <w:nsid w:val="54191877"/>
     <w:multiLevelType w:val="hybridMultilevel"/>
     <w:tmpl w:val="76DC55EA"/>
@@ -6105,7 +6248,7 @@
       </w:rPr>
     </w:lvl>
   </w:abstractNum>
-  <w:abstractNum w:abstractNumId="28" w15:restartNumberingAfterBreak="0">
+  <w:abstractNum w:abstractNumId="31" w15:restartNumberingAfterBreak="0">
     <w:nsid w:val="589359FD"/>
     <w:multiLevelType w:val="hybridMultilevel"/>
     <w:tmpl w:val="A19EC994"/>
@@ -6194,7 +6337,7 @@
       </w:pPr>
     </w:lvl>
   </w:abstractNum>
-  <w:abstractNum w:abstractNumId="29" w15:restartNumberingAfterBreak="0">
+  <w:abstractNum w:abstractNumId="32" w15:restartNumberingAfterBreak="0">
     <w:nsid w:val="5B621240"/>
     <w:multiLevelType w:val="hybridMultilevel"/>
     <w:tmpl w:val="B2EC75D0"/>
@@ -6307,7 +6450,120 @@
       </w:rPr>
     </w:lvl>
   </w:abstractNum>
-  <w:abstractNum w:abstractNumId="30" w15:restartNumberingAfterBreak="0">
+  <w:abstractNum w:abstractNumId="33" w15:restartNumberingAfterBreak="0">
+    <w:nsid w:val="5F045B3E"/>
+    <w:multiLevelType w:val="hybridMultilevel"/>
+    <w:tmpl w:val="4468DA4E"/>
+    <w:lvl w:ilvl="0" w:tplc="08090001">
+      <w:start w:val="1"/>
+      <w:numFmt w:val="bullet"/>
+      <w:lvlText w:val=""/>
+      <w:lvlJc w:val="left"/>
+      <w:pPr>
+        <w:ind w:left="720" w:hanging="360"/>
+      </w:pPr>
+      <w:rPr>
+        <w:rFonts w:ascii="Symbol" w:hAnsi="Symbol" w:hint="default"/>
+      </w:rPr>
+    </w:lvl>
+    <w:lvl w:ilvl="1" w:tplc="08090003" w:tentative="1">
+      <w:start w:val="1"/>
+      <w:numFmt w:val="bullet"/>
+      <w:lvlText w:val="o"/>
+      <w:lvlJc w:val="left"/>
+      <w:pPr>
+        <w:ind w:left="1440" w:hanging="360"/>
+      </w:pPr>
+      <w:rPr>
+        <w:rFonts w:ascii="Courier New" w:hAnsi="Courier New" w:cs="Courier New" w:hint="default"/>
+      </w:rPr>
+    </w:lvl>
+    <w:lvl w:ilvl="2" w:tplc="08090005" w:tentative="1">
+      <w:start w:val="1"/>
+      <w:numFmt w:val="bullet"/>
+      <w:lvlText w:val=""/>
+      <w:lvlJc w:val="left"/>
+      <w:pPr>
+        <w:ind w:left="2160" w:hanging="360"/>
+      </w:pPr>
+      <w:rPr>
+        <w:rFonts w:ascii="Wingdings" w:hAnsi="Wingdings" w:hint="default"/>
+      </w:rPr>
+    </w:lvl>
+    <w:lvl w:ilvl="3" w:tplc="08090001" w:tentative="1">
+      <w:start w:val="1"/>
+      <w:numFmt w:val="bullet"/>
+      <w:lvlText w:val=""/>
+      <w:lvlJc w:val="left"/>
+      <w:pPr>
+        <w:ind w:left="2880" w:hanging="360"/>
+      </w:pPr>
+      <w:rPr>
+        <w:rFonts w:ascii="Symbol" w:hAnsi="Symbol" w:hint="default"/>
+      </w:rPr>
+    </w:lvl>
+    <w:lvl w:ilvl="4" w:tplc="08090003" w:tentative="1">
+      <w:start w:val="1"/>
+      <w:numFmt w:val="bullet"/>
+      <w:lvlText w:val="o"/>
+      <w:lvlJc w:val="left"/>
+      <w:pPr>
+        <w:ind w:left="3600" w:hanging="360"/>
+      </w:pPr>
+      <w:rPr>
+        <w:rFonts w:ascii="Courier New" w:hAnsi="Courier New" w:cs="Courier New" w:hint="default"/>
+      </w:rPr>
+    </w:lvl>
+    <w:lvl w:ilvl="5" w:tplc="08090005" w:tentative="1">
+      <w:start w:val="1"/>
+      <w:numFmt w:val="bullet"/>
+      <w:lvlText w:val=""/>
+      <w:lvlJc w:val="left"/>
+      <w:pPr>
+        <w:ind w:left="4320" w:hanging="360"/>
+      </w:pPr>
+      <w:rPr>
+        <w:rFonts w:ascii="Wingdings" w:hAnsi="Wingdings" w:hint="default"/>
+      </w:rPr>
+    </w:lvl>
+    <w:lvl w:ilvl="6" w:tplc="08090001" w:tentative="1">
+      <w:start w:val="1"/>
+      <w:numFmt w:val="bullet"/>
+      <w:lvlText w:val=""/>
+      <w:lvlJc w:val="left"/>
+      <w:pPr>
+        <w:ind w:left="5040" w:hanging="360"/>
+      </w:pPr>
+      <w:rPr>
+        <w:rFonts w:ascii="Symbol" w:hAnsi="Symbol" w:hint="default"/>
+      </w:rPr>
+    </w:lvl>
+    <w:lvl w:ilvl="7" w:tplc="08090003" w:tentative="1">
+      <w:start w:val="1"/>
+      <w:numFmt w:val="bullet"/>
+      <w:lvlText w:val="o"/>
+      <w:lvlJc w:val="left"/>
+      <w:pPr>
+        <w:ind w:left="5760" w:hanging="360"/>
+      </w:pPr>
+      <w:rPr>
+        <w:rFonts w:ascii="Courier New" w:hAnsi="Courier New" w:cs="Courier New" w:hint="default"/>
+      </w:rPr>
+    </w:lvl>
+    <w:lvl w:ilvl="8" w:tplc="08090005" w:tentative="1">
+      <w:start w:val="1"/>
+      <w:numFmt w:val="bullet"/>
+      <w:lvlText w:val=""/>
+      <w:lvlJc w:val="left"/>
+      <w:pPr>
+        <w:ind w:left="6480" w:hanging="360"/>
+      </w:pPr>
+      <w:rPr>
+        <w:rFonts w:ascii="Wingdings" w:hAnsi="Wingdings" w:hint="default"/>
+      </w:rPr>
+    </w:lvl>
+  </w:abstractNum>
+  <w:abstractNum w:abstractNumId="34" w15:restartNumberingAfterBreak="0">
     <w:nsid w:val="6B2F3DE0"/>
     <w:multiLevelType w:val="hybridMultilevel"/>
     <w:tmpl w:val="D742935A"/>
@@ -6420,7 +6676,7 @@
       </w:rPr>
     </w:lvl>
   </w:abstractNum>
-  <w:abstractNum w:abstractNumId="31" w15:restartNumberingAfterBreak="0">
+  <w:abstractNum w:abstractNumId="35" w15:restartNumberingAfterBreak="0">
     <w:nsid w:val="6CD60D5E"/>
     <w:multiLevelType w:val="multilevel"/>
     <w:tmpl w:val="E190E346"/>
@@ -6533,7 +6789,7 @@
       </w:rPr>
     </w:lvl>
   </w:abstractNum>
-  <w:abstractNum w:abstractNumId="32" w15:restartNumberingAfterBreak="0">
+  <w:abstractNum w:abstractNumId="36" w15:restartNumberingAfterBreak="0">
     <w:nsid w:val="769166A8"/>
     <w:multiLevelType w:val="singleLevel"/>
     <w:tmpl w:val="6802948C"/>
@@ -6545,7 +6801,7 @@
       <w:lvlJc w:val="left"/>
     </w:lvl>
   </w:abstractNum>
-  <w:abstractNum w:abstractNumId="33" w15:restartNumberingAfterBreak="0">
+  <w:abstractNum w:abstractNumId="37" w15:restartNumberingAfterBreak="0">
     <w:nsid w:val="788F68D3"/>
     <w:multiLevelType w:val="multilevel"/>
     <w:tmpl w:val="43DA87E2"/>
@@ -6685,7 +6941,7 @@
       </w:rPr>
     </w:lvl>
   </w:abstractNum>
-  <w:abstractNum w:abstractNumId="34" w15:restartNumberingAfterBreak="0">
+  <w:abstractNum w:abstractNumId="38" w15:restartNumberingAfterBreak="0">
     <w:nsid w:val="7D3C38DE"/>
     <w:multiLevelType w:val="singleLevel"/>
     <w:tmpl w:val="AA88CE04"/>
@@ -6701,138 +6957,150 @@
       </w:pPr>
     </w:lvl>
   </w:abstractNum>
-  <w:num w:numId="1">
+  <w:num w:numId="1" w16cid:durableId="39983619">
     <w:abstractNumId w:val="9"/>
   </w:num>
-  <w:num w:numId="2">
+  <w:num w:numId="2" w16cid:durableId="520971843">
+    <w:abstractNumId w:val="27"/>
+  </w:num>
+  <w:num w:numId="3" w16cid:durableId="417140580">
+    <w:abstractNumId w:val="29"/>
+  </w:num>
+  <w:num w:numId="4" w16cid:durableId="1893423009">
+    <w:abstractNumId w:val="26"/>
+  </w:num>
+  <w:num w:numId="5" w16cid:durableId="791826842">
+    <w:abstractNumId w:val="11"/>
+  </w:num>
+  <w:num w:numId="6" w16cid:durableId="1612282087">
+    <w:abstractNumId w:val="28"/>
+  </w:num>
+  <w:num w:numId="7" w16cid:durableId="769810584">
+    <w:abstractNumId w:val="25"/>
+  </w:num>
+  <w:num w:numId="8" w16cid:durableId="2106994306">
+    <w:abstractNumId w:val="3"/>
+  </w:num>
+  <w:num w:numId="9" w16cid:durableId="528565403">
+    <w:abstractNumId w:val="2"/>
+  </w:num>
+  <w:num w:numId="10" w16cid:durableId="2142653960">
+    <w:abstractNumId w:val="1"/>
+  </w:num>
+  <w:num w:numId="11" w16cid:durableId="1128935087">
+    <w:abstractNumId w:val="0"/>
+  </w:num>
+  <w:num w:numId="12" w16cid:durableId="314722098">
     <w:abstractNumId w:val="24"/>
   </w:num>
-  <w:num w:numId="3">
-    <w:abstractNumId w:val="26"/>
-  </w:num>
-  <w:num w:numId="4">
-    <w:abstractNumId w:val="23"/>
-  </w:num>
-  <w:num w:numId="5">
-    <w:abstractNumId w:val="10"/>
-  </w:num>
-  <w:num w:numId="6">
-    <w:abstractNumId w:val="25"/>
-  </w:num>
-  <w:num w:numId="7">
-    <w:abstractNumId w:val="22"/>
-  </w:num>
-  <w:num w:numId="8">
-    <w:abstractNumId w:val="3"/>
-  </w:num>
-  <w:num w:numId="9">
-    <w:abstractNumId w:val="2"/>
-  </w:num>
-  <w:num w:numId="10">
-    <w:abstractNumId w:val="1"/>
-  </w:num>
-  <w:num w:numId="11">
-    <w:abstractNumId w:val="0"/>
-  </w:num>
-  <w:num w:numId="12">
-    <w:abstractNumId w:val="21"/>
-  </w:num>
-  <w:num w:numId="13">
+  <w:num w:numId="13" w16cid:durableId="27919669">
     <w:abstractNumId w:val="8"/>
   </w:num>
-  <w:num w:numId="14">
+  <w:num w:numId="14" w16cid:durableId="216091023">
     <w:abstractNumId w:val="7"/>
   </w:num>
-  <w:num w:numId="15">
+  <w:num w:numId="15" w16cid:durableId="1151869670">
     <w:abstractNumId w:val="6"/>
   </w:num>
-  <w:num w:numId="16">
+  <w:num w:numId="16" w16cid:durableId="1545555051">
     <w:abstractNumId w:val="5"/>
   </w:num>
-  <w:num w:numId="17">
+  <w:num w:numId="17" w16cid:durableId="905652817">
     <w:abstractNumId w:val="4"/>
   </w:num>
-  <w:num w:numId="18">
-    <w:abstractNumId w:val="34"/>
+  <w:num w:numId="18" w16cid:durableId="404257708">
+    <w:abstractNumId w:val="38"/>
     <w:lvlOverride w:ilvl="0">
       <w:startOverride w:val="1"/>
     </w:lvlOverride>
   </w:num>
-  <w:num w:numId="19">
-    <w:abstractNumId w:val="11"/>
+  <w:num w:numId="19" w16cid:durableId="66153563">
+    <w:abstractNumId w:val="12"/>
   </w:num>
-  <w:num w:numId="20">
-    <w:abstractNumId w:val="15"/>
+  <w:num w:numId="20" w16cid:durableId="1899855676">
+    <w:abstractNumId w:val="17"/>
   </w:num>
-  <w:num w:numId="21">
-    <w:abstractNumId w:val="26"/>
+  <w:num w:numId="21" w16cid:durableId="835807011">
+    <w:abstractNumId w:val="29"/>
     <w:lvlOverride w:ilvl="0">
       <w:startOverride w:val="1"/>
     </w:lvlOverride>
   </w:num>
-  <w:num w:numId="22">
-    <w:abstractNumId w:val="26"/>
+  <w:num w:numId="22" w16cid:durableId="1173186534">
+    <w:abstractNumId w:val="29"/>
     <w:lvlOverride w:ilvl="0">
       <w:startOverride w:val="1"/>
     </w:lvlOverride>
   </w:num>
-  <w:num w:numId="23">
-    <w:abstractNumId w:val="26"/>
+  <w:num w:numId="23" w16cid:durableId="1571886478">
+    <w:abstractNumId w:val="29"/>
     <w:lvlOverride w:ilvl="0">
       <w:startOverride w:val="1"/>
     </w:lvlOverride>
   </w:num>
-  <w:num w:numId="24">
-    <w:abstractNumId w:val="28"/>
+  <w:num w:numId="24" w16cid:durableId="130173883">
+    <w:abstractNumId w:val="31"/>
   </w:num>
-  <w:num w:numId="25">
-    <w:abstractNumId w:val="12"/>
+  <w:num w:numId="25" w16cid:durableId="444231097">
+    <w:abstractNumId w:val="13"/>
   </w:num>
-  <w:num w:numId="26">
+  <w:num w:numId="26" w16cid:durableId="654842664">
+    <w:abstractNumId w:val="37"/>
+  </w:num>
+  <w:num w:numId="27" w16cid:durableId="661471374">
+    <w:abstractNumId w:val="35"/>
+  </w:num>
+  <w:num w:numId="28" w16cid:durableId="1620799822">
+    <w:abstractNumId w:val="36"/>
+  </w:num>
+  <w:num w:numId="29" w16cid:durableId="714041937">
+    <w:abstractNumId w:val="20"/>
+  </w:num>
+  <w:num w:numId="30" w16cid:durableId="1144616597">
+    <w:abstractNumId w:val="30"/>
+  </w:num>
+  <w:num w:numId="31" w16cid:durableId="502549291">
+    <w:abstractNumId w:val="18"/>
+  </w:num>
+  <w:num w:numId="32" w16cid:durableId="1883592130">
+    <w:abstractNumId w:val="34"/>
+  </w:num>
+  <w:num w:numId="33" w16cid:durableId="789779917">
+    <w:abstractNumId w:val="15"/>
+  </w:num>
+  <w:num w:numId="34" w16cid:durableId="34283081">
+    <w:abstractNumId w:val="16"/>
+  </w:num>
+  <w:num w:numId="35" w16cid:durableId="83650535">
+    <w:abstractNumId w:val="32"/>
+  </w:num>
+  <w:num w:numId="36" w16cid:durableId="718941261">
+    <w:abstractNumId w:val="19"/>
+  </w:num>
+  <w:num w:numId="37" w16cid:durableId="1736007347">
+    <w:abstractNumId w:val="22"/>
+  </w:num>
+  <w:num w:numId="38" w16cid:durableId="2085176622">
+    <w:abstractNumId w:val="23"/>
+  </w:num>
+  <w:num w:numId="39" w16cid:durableId="220481085">
     <w:abstractNumId w:val="33"/>
   </w:num>
-  <w:num w:numId="27">
-    <w:abstractNumId w:val="31"/>
-  </w:num>
-  <w:num w:numId="28">
-    <w:abstractNumId w:val="32"/>
-  </w:num>
-  <w:num w:numId="29">
-    <w:abstractNumId w:val="18"/>
-  </w:num>
-  <w:num w:numId="30">
-    <w:abstractNumId w:val="27"/>
-  </w:num>
-  <w:num w:numId="31">
-    <w:abstractNumId w:val="16"/>
-  </w:num>
-  <w:num w:numId="32">
-    <w:abstractNumId w:val="30"/>
-  </w:num>
-  <w:num w:numId="33">
-    <w:abstractNumId w:val="13"/>
-  </w:num>
-  <w:num w:numId="34">
+  <w:num w:numId="40" w16cid:durableId="4292009">
     <w:abstractNumId w:val="14"/>
   </w:num>
-  <w:num w:numId="35">
-    <w:abstractNumId w:val="29"/>
+  <w:num w:numId="41" w16cid:durableId="1470628131">
+    <w:abstractNumId w:val="21"/>
   </w:num>
-  <w:num w:numId="36">
-    <w:abstractNumId w:val="17"/>
-  </w:num>
-  <w:num w:numId="37">
-    <w:abstractNumId w:val="19"/>
-  </w:num>
-  <w:num w:numId="38">
-    <w:abstractNumId w:val="20"/>
+  <w:num w:numId="42" w16cid:durableId="1319919495">
+    <w:abstractNumId w:val="10"/>
   </w:num>
   <w:numIdMacAtCleanup w:val="25"/>
 </w:numbering>
 </file>
 
 <file path=word/styles.xml><?xml version="1.0" encoding="utf-8"?>
-<w:styles xmlns:mc="http://schemas.openxmlformats.org/markup-compatibility/2006" xmlns:r="http://schemas.openxmlformats.org/officeDocument/2006/relationships" xmlns:w="http://schemas.openxmlformats.org/wordprocessingml/2006/main" xmlns:w14="http://schemas.microsoft.com/office/word/2010/wordml" xmlns:w15="http://schemas.microsoft.com/office/word/2012/wordml" xmlns:w16se="http://schemas.microsoft.com/office/word/2015/wordml/symex" mc:Ignorable="w14 w15 w16se">
+<w:styles xmlns:mc="http://schemas.openxmlformats.org/markup-compatibility/2006" xmlns:r="http://schemas.openxmlformats.org/officeDocument/2006/relationships" xmlns:w="http://schemas.openxmlformats.org/wordprocessingml/2006/main" xmlns:w14="http://schemas.microsoft.com/office/word/2010/wordml" xmlns:w15="http://schemas.microsoft.com/office/word/2012/wordml" xmlns:w16cex="http://schemas.microsoft.com/office/word/2018/wordml/cex" xmlns:w16cid="http://schemas.microsoft.com/office/word/2016/wordml/cid" xmlns:w16="http://schemas.microsoft.com/office/word/2018/wordml" xmlns:w16du="http://schemas.microsoft.com/office/word/2023/wordml/word16du" xmlns:w16sdtdh="http://schemas.microsoft.com/office/word/2020/wordml/sdtdatahash" xmlns:w16sdtfl="http://schemas.microsoft.com/office/word/2024/wordml/sdtformatlock" xmlns:w16se="http://schemas.microsoft.com/office/word/2015/wordml/symex" mc:Ignorable="w14 w15 w16se w16cid w16 w16cex w16sdtdh w16sdtfl w16du">
   <w:docDefaults>
     <w:rPrDefault>
       <w:rPr>
@@ -6842,7 +7110,7 @@
     </w:rPrDefault>
     <w:pPrDefault/>
   </w:docDefaults>
-  <w:latentStyles w:defLockedState="0" w:defUIPriority="0" w:defSemiHidden="0" w:defUnhideWhenUsed="0" w:defQFormat="0" w:count="371">
+  <w:latentStyles w:defLockedState="0" w:defUIPriority="0" w:defSemiHidden="0" w:defUnhideWhenUsed="0" w:defQFormat="0" w:count="376">
     <w:lsdException w:name="Normal" w:qFormat="1"/>
     <w:lsdException w:name="heading 1" w:uiPriority="99" w:qFormat="1"/>
     <w:lsdException w:name="heading 2" w:qFormat="1"/>
@@ -7122,8 +7390,13 @@
     <w:lsdException w:name="List Table 5 Dark Accent 6" w:uiPriority="50"/>
     <w:lsdException w:name="List Table 6 Colorful Accent 6" w:uiPriority="51"/>
     <w:lsdException w:name="List Table 7 Colorful Accent 6" w:uiPriority="52"/>
+    <w:lsdException w:name="Mention" w:semiHidden="1" w:uiPriority="99" w:unhideWhenUsed="1"/>
+    <w:lsdException w:name="Smart Hyperlink" w:semiHidden="1" w:uiPriority="99" w:unhideWhenUsed="1"/>
+    <w:lsdException w:name="Hashtag" w:semiHidden="1" w:uiPriority="99" w:unhideWhenUsed="1"/>
+    <w:lsdException w:name="Unresolved Mention" w:semiHidden="1" w:uiPriority="99" w:unhideWhenUsed="1"/>
+    <w:lsdException w:name="Smart Link" w:semiHidden="1" w:uiPriority="99" w:unhideWhenUsed="1"/>
   </w:latentStyles>
-  <w:style w:type="paragraph" w:default="1" w:styleId="Normln">
+  <w:style w:type="paragraph" w:default="1" w:styleId="Normal">
     <w:name w:val="Normal"/>
     <w:qFormat/>
     <w:rsid w:val="006B184D"/>
@@ -7131,11 +7404,11 @@
       <w:rFonts w:ascii="Arial" w:hAnsi="Arial"/>
     </w:rPr>
   </w:style>
-  <w:style w:type="paragraph" w:styleId="Nadpis1">
+  <w:style w:type="paragraph" w:styleId="Heading1">
     <w:name w:val="heading 1"/>
     <w:basedOn w:val="Nadpiskapitoly"/>
     <w:next w:val="Textnormy"/>
-    <w:link w:val="Nadpis1Char"/>
+    <w:link w:val="Heading1Char"/>
     <w:uiPriority w:val="99"/>
     <w:qFormat/>
     <w:rsid w:val="003E28A9"/>
@@ -7151,11 +7424,11 @@
       <w:lang w:val="en-GB"/>
     </w:rPr>
   </w:style>
-  <w:style w:type="paragraph" w:styleId="Nadpis2">
+  <w:style w:type="paragraph" w:styleId="Heading2">
     <w:name w:val="heading 2"/>
     <w:basedOn w:val="Nadpislnku"/>
     <w:next w:val="Textnormy"/>
-    <w:link w:val="Nadpis2Char"/>
+    <w:link w:val="Heading2Char"/>
     <w:qFormat/>
     <w:rsid w:val="0002770A"/>
     <w:pPr>
@@ -7167,94 +7440,93 @@
       <w:lang w:val="en-GB"/>
     </w:rPr>
   </w:style>
-  <w:style w:type="paragraph" w:styleId="Nadpis3">
+  <w:style w:type="paragraph" w:styleId="Heading3">
     <w:name w:val="heading 3"/>
     <w:basedOn w:val="Nadpislnku"/>
     <w:next w:val="Textnormy"/>
-    <w:link w:val="Nadpis3Char"/>
+    <w:link w:val="Heading3Char"/>
     <w:qFormat/>
     <w:rsid w:val="006B184D"/>
     <w:pPr>
       <w:outlineLvl w:val="2"/>
     </w:pPr>
   </w:style>
-  <w:style w:type="paragraph" w:styleId="Nadpis4">
+  <w:style w:type="paragraph" w:styleId="Heading4">
     <w:name w:val="heading 4"/>
     <w:basedOn w:val="Nadpislnku"/>
     <w:next w:val="Textnormy"/>
-    <w:link w:val="Nadpis4Char"/>
+    <w:link w:val="Heading4Char"/>
     <w:qFormat/>
     <w:rsid w:val="006B184D"/>
     <w:pPr>
       <w:outlineLvl w:val="3"/>
     </w:pPr>
   </w:style>
-  <w:style w:type="paragraph" w:styleId="Nadpis5">
+  <w:style w:type="paragraph" w:styleId="Heading5">
     <w:name w:val="heading 5"/>
     <w:basedOn w:val="Nadpislnku"/>
     <w:next w:val="Textnormy"/>
-    <w:link w:val="Nadpis5Char"/>
+    <w:link w:val="Heading5Char"/>
     <w:qFormat/>
     <w:rsid w:val="006B184D"/>
     <w:pPr>
       <w:outlineLvl w:val="4"/>
     </w:pPr>
   </w:style>
-  <w:style w:type="paragraph" w:styleId="Nadpis6">
+  <w:style w:type="paragraph" w:styleId="Heading6">
     <w:name w:val="heading 6"/>
     <w:basedOn w:val="Nadpislnku"/>
     <w:next w:val="Textnormy"/>
-    <w:link w:val="Nadpis6Char"/>
+    <w:link w:val="Heading6Char"/>
     <w:qFormat/>
     <w:rsid w:val="006B184D"/>
     <w:pPr>
       <w:outlineLvl w:val="5"/>
     </w:pPr>
   </w:style>
-  <w:style w:type="paragraph" w:styleId="Nadpis7">
+  <w:style w:type="paragraph" w:styleId="Heading7">
     <w:name w:val="heading 7"/>
     <w:aliases w:val="not to be used 7"/>
     <w:basedOn w:val="Nadpislnku"/>
     <w:next w:val="Textnormy"/>
-    <w:link w:val="Nadpis7Char"/>
+    <w:link w:val="Heading7Char"/>
     <w:qFormat/>
     <w:rsid w:val="006B184D"/>
     <w:pPr>
       <w:outlineLvl w:val="6"/>
     </w:pPr>
   </w:style>
-  <w:style w:type="paragraph" w:styleId="Nadpis8">
+  <w:style w:type="paragraph" w:styleId="Heading8">
     <w:name w:val="heading 8"/>
     <w:aliases w:val="not to be used 8"/>
     <w:basedOn w:val="Nadpislnku"/>
     <w:next w:val="Textnormy"/>
-    <w:link w:val="Nadpis8Char"/>
+    <w:link w:val="Heading8Char"/>
     <w:qFormat/>
     <w:rsid w:val="006B184D"/>
     <w:pPr>
       <w:outlineLvl w:val="7"/>
     </w:pPr>
   </w:style>
-  <w:style w:type="paragraph" w:styleId="Nadpis9">
+  <w:style w:type="paragraph" w:styleId="Heading9">
     <w:name w:val="heading 9"/>
     <w:aliases w:val="not to be used 9"/>
     <w:basedOn w:val="Nadpislnku"/>
     <w:next w:val="Textnormy"/>
-    <w:link w:val="Nadpis9Char"/>
+    <w:link w:val="Heading9Char"/>
     <w:qFormat/>
     <w:rsid w:val="006B184D"/>
     <w:pPr>
       <w:outlineLvl w:val="8"/>
     </w:pPr>
   </w:style>
-  <w:style w:type="character" w:default="1" w:styleId="Standardnpsmoodstavce">
+  <w:style w:type="character" w:default="1" w:styleId="DefaultParagraphFont">
     <w:name w:val="Default Paragraph Font"/>
     <w:uiPriority w:val="1"/>
     <w:semiHidden/>
     <w:unhideWhenUsed/>
-    <w:rsid w:val="006B184D"/>
-  </w:style>
-  <w:style w:type="table" w:default="1" w:styleId="Normlntabulka">
+  </w:style>
+  <w:style w:type="table" w:default="1" w:styleId="TableNormal">
     <w:name w:val="Normal Table"/>
     <w:uiPriority w:val="99"/>
     <w:semiHidden/>
@@ -7269,12 +7541,11 @@
       </w:tblCellMar>
     </w:tblPr>
   </w:style>
-  <w:style w:type="numbering" w:default="1" w:styleId="Bezseznamu">
+  <w:style w:type="numbering" w:default="1" w:styleId="NoList">
     <w:name w:val="No List"/>
     <w:uiPriority w:val="99"/>
     <w:semiHidden/>
     <w:unhideWhenUsed/>
-    <w:rsid w:val="006B184D"/>
   </w:style>
   <w:style w:type="paragraph" w:customStyle="1" w:styleId="Nadpiskapitoly">
     <w:name w:val="Nadpis kapitoly"/>
@@ -7369,7 +7640,7 @@
       <w:lang w:val="en-GB"/>
     </w:rPr>
   </w:style>
-  <w:style w:type="paragraph" w:styleId="slovanseznam">
+  <w:style w:type="paragraph" w:styleId="ListNumber">
     <w:name w:val="List Number"/>
     <w:basedOn w:val="Textnormy"/>
     <w:rsid w:val="006B184D"/>
@@ -7380,7 +7651,7 @@
       <w:ind w:left="284" w:hanging="284"/>
     </w:pPr>
   </w:style>
-  <w:style w:type="paragraph" w:styleId="Rejstk1">
+  <w:style w:type="paragraph" w:styleId="Index1">
     <w:name w:val="index 1"/>
     <w:basedOn w:val="Textnormy"/>
     <w:next w:val="Textnormy"/>
@@ -7415,7 +7686,7 @@
       <w:sz w:val="28"/>
     </w:rPr>
   </w:style>
-  <w:style w:type="character" w:styleId="slostrnky">
+  <w:style w:type="character" w:styleId="PageNumber">
     <w:name w:val="page number"/>
     <w:rsid w:val="006B184D"/>
     <w:rPr>
@@ -7445,19 +7716,19 @@
       <w:ind w:left="284" w:hanging="284"/>
     </w:pPr>
   </w:style>
-  <w:style w:type="paragraph" w:styleId="Zhlav">
+  <w:style w:type="paragraph" w:styleId="Header">
     <w:name w:val="header"/>
     <w:basedOn w:val="Textnormy"/>
-    <w:link w:val="ZhlavChar"/>
+    <w:link w:val="HeaderChar"/>
     <w:rsid w:val="006B184D"/>
     <w:rPr>
       <w:sz w:val="18"/>
     </w:rPr>
   </w:style>
-  <w:style w:type="paragraph" w:styleId="Zpat">
+  <w:style w:type="paragraph" w:styleId="Footer">
     <w:name w:val="footer"/>
     <w:basedOn w:val="Textnormy"/>
-    <w:link w:val="ZpatChar"/>
+    <w:link w:val="FooterChar"/>
     <w:rsid w:val="006B184D"/>
     <w:pPr>
       <w:jc w:val="center"/>
@@ -7466,23 +7737,23 @@
       <w:sz w:val="18"/>
     </w:rPr>
   </w:style>
-  <w:style w:type="paragraph" w:styleId="Zkladntext">
+  <w:style w:type="paragraph" w:styleId="BodyText">
     <w:name w:val="Body Text"/>
-    <w:basedOn w:val="Normln"/>
-    <w:link w:val="ZkladntextChar"/>
+    <w:basedOn w:val="Normal"/>
+    <w:link w:val="BodyTextChar"/>
     <w:rsid w:val="006B184D"/>
     <w:pPr>
       <w:spacing w:after="120"/>
     </w:pPr>
   </w:style>
-  <w:style w:type="paragraph" w:styleId="Obsah2">
+  <w:style w:type="paragraph" w:styleId="TOC2">
     <w:name w:val="toc 2"/>
-    <w:basedOn w:val="Obsah1"/>
+    <w:basedOn w:val="TOC1"/>
     <w:next w:val="Textnormy"/>
     <w:uiPriority w:val="39"/>
     <w:rsid w:val="006B184D"/>
   </w:style>
-  <w:style w:type="paragraph" w:styleId="Obsah1">
+  <w:style w:type="paragraph" w:styleId="TOC1">
     <w:name w:val="toc 1"/>
     <w:basedOn w:val="Textnormy"/>
     <w:next w:val="Textnormy"/>
@@ -7501,49 +7772,49 @@
       <w:sz w:val="18"/>
     </w:rPr>
   </w:style>
-  <w:style w:type="paragraph" w:styleId="Obsah5">
+  <w:style w:type="paragraph" w:styleId="TOC5">
     <w:name w:val="toc 5"/>
-    <w:basedOn w:val="Obsah1"/>
+    <w:basedOn w:val="TOC1"/>
     <w:next w:val="Textnormy"/>
     <w:semiHidden/>
     <w:rsid w:val="006B184D"/>
   </w:style>
-  <w:style w:type="paragraph" w:styleId="Obsah3">
+  <w:style w:type="paragraph" w:styleId="TOC3">
     <w:name w:val="toc 3"/>
-    <w:basedOn w:val="Obsah1"/>
+    <w:basedOn w:val="TOC1"/>
     <w:next w:val="Textnormy"/>
     <w:rsid w:val="006B184D"/>
   </w:style>
-  <w:style w:type="paragraph" w:styleId="Obsah4">
+  <w:style w:type="paragraph" w:styleId="TOC4">
     <w:name w:val="toc 4"/>
-    <w:basedOn w:val="Obsah1"/>
+    <w:basedOn w:val="TOC1"/>
     <w:next w:val="Textnormy"/>
     <w:rsid w:val="006B184D"/>
   </w:style>
-  <w:style w:type="paragraph" w:styleId="Obsah6">
+  <w:style w:type="paragraph" w:styleId="TOC6">
     <w:name w:val="toc 6"/>
-    <w:basedOn w:val="Obsah1"/>
+    <w:basedOn w:val="TOC1"/>
     <w:next w:val="Textnormy"/>
     <w:rsid w:val="006B184D"/>
   </w:style>
-  <w:style w:type="paragraph" w:styleId="Obsah7">
+  <w:style w:type="paragraph" w:styleId="TOC7">
     <w:name w:val="toc 7"/>
-    <w:basedOn w:val="Obsah1"/>
+    <w:basedOn w:val="TOC1"/>
     <w:next w:val="Textnormy"/>
     <w:semiHidden/>
     <w:rsid w:val="006B184D"/>
   </w:style>
-  <w:style w:type="paragraph" w:styleId="Obsah8">
+  <w:style w:type="paragraph" w:styleId="TOC8">
     <w:name w:val="toc 8"/>
-    <w:basedOn w:val="Obsah1"/>
+    <w:basedOn w:val="TOC1"/>
     <w:next w:val="Textnormy"/>
     <w:semiHidden/>
     <w:rsid w:val="006B184D"/>
   </w:style>
-  <w:style w:type="paragraph" w:styleId="Obsah9">
+  <w:style w:type="paragraph" w:styleId="TOC9">
     <w:name w:val="toc 9"/>
-    <w:basedOn w:val="Normln"/>
-    <w:next w:val="Normln"/>
+    <w:basedOn w:val="Normal"/>
+    <w:next w:val="Normal"/>
     <w:autoRedefine/>
     <w:semiHidden/>
     <w:rsid w:val="006B184D"/>
@@ -7612,10 +7883,10 @@
       <w:jc w:val="center"/>
     </w:pPr>
   </w:style>
-  <w:style w:type="paragraph" w:styleId="Titulek">
+  <w:style w:type="paragraph" w:styleId="Caption">
     <w:name w:val="caption"/>
-    <w:basedOn w:val="Normln"/>
-    <w:next w:val="Normln"/>
+    <w:basedOn w:val="Normal"/>
+    <w:next w:val="Normal"/>
     <w:qFormat/>
     <w:rsid w:val="006B184D"/>
     <w:pPr>
@@ -7625,11 +7896,11 @@
       <w:b/>
     </w:rPr>
   </w:style>
-  <w:style w:type="paragraph" w:styleId="Textpoznpodarou">
+  <w:style w:type="paragraph" w:styleId="FootnoteText">
     <w:name w:val="footnote text"/>
     <w:aliases w:val="EPP16_Fußnotentext"/>
     <w:basedOn w:val="Poznmka"/>
-    <w:link w:val="TextpoznpodarouChar"/>
+    <w:link w:val="FootnoteTextChar"/>
     <w:rsid w:val="006B184D"/>
     <w:pPr>
       <w:spacing w:before="60" w:after="0"/>
@@ -7675,15 +7946,15 @@
       <w:sz w:val="28"/>
     </w:rPr>
   </w:style>
-  <w:style w:type="paragraph" w:styleId="Zptenadresanaoblku">
+  <w:style w:type="paragraph" w:styleId="EnvelopeReturn">
     <w:name w:val="envelope return"/>
-    <w:basedOn w:val="Normln"/>
-    <w:rsid w:val="006B184D"/>
-  </w:style>
-  <w:style w:type="paragraph" w:styleId="Hlavikarejstku">
+    <w:basedOn w:val="Normal"/>
+    <w:rsid w:val="006B184D"/>
+  </w:style>
+  <w:style w:type="paragraph" w:styleId="IndexHeading">
     <w:name w:val="index heading"/>
     <w:basedOn w:val="Textnormy"/>
-    <w:next w:val="Rejstk1"/>
+    <w:next w:val="Index1"/>
     <w:rsid w:val="006B184D"/>
     <w:pPr>
       <w:spacing w:before="120" w:after="60"/>
@@ -7709,7 +7980,7 @@
   </w:style>
   <w:style w:type="numbering" w:styleId="111111">
     <w:name w:val="Outline List 2"/>
-    <w:basedOn w:val="Bezseznamu"/>
+    <w:basedOn w:val="NoList"/>
     <w:semiHidden/>
     <w:rsid w:val="006B184D"/>
     <w:pPr>
@@ -7880,7 +8151,7 @@
       <w:noProof/>
     </w:rPr>
   </w:style>
-  <w:style w:type="character" w:styleId="Znakapoznpodarou">
+  <w:style w:type="character" w:styleId="FootnoteReference">
     <w:name w:val="footnote reference"/>
     <w:rsid w:val="006B184D"/>
     <w:rPr>
@@ -7899,7 +8170,7 @@
   </w:style>
   <w:style w:type="paragraph" w:customStyle="1" w:styleId="Tir">
     <w:name w:val="Tiráž"/>
-    <w:basedOn w:val="Normln"/>
+    <w:basedOn w:val="Normal"/>
     <w:rsid w:val="006B184D"/>
     <w:pPr>
       <w:framePr w:w="9356" w:hSpace="142" w:wrap="around" w:hAnchor="margin" w:yAlign="bottom" w:anchorLock="1"/>
@@ -7911,7 +8182,7 @@
   </w:style>
   <w:style w:type="paragraph" w:customStyle="1" w:styleId="1StrCopyright">
     <w:name w:val="1StrCopyright"/>
-    <w:basedOn w:val="Zpat"/>
+    <w:basedOn w:val="Footer"/>
     <w:rsid w:val="006B184D"/>
     <w:pPr>
       <w:tabs>
@@ -7958,7 +8229,7 @@
   </w:style>
   <w:style w:type="paragraph" w:customStyle="1" w:styleId="Upozornn">
     <w:name w:val="Upozornění"/>
-    <w:basedOn w:val="Normln"/>
+    <w:basedOn w:val="Normal"/>
     <w:rsid w:val="006B184D"/>
     <w:pPr>
       <w:framePr w:w="9356" w:hSpace="142" w:wrap="around" w:hAnchor="margin" w:yAlign="bottom" w:anchorLock="1"/>
@@ -7968,7 +8239,7 @@
       <w:sz w:val="18"/>
     </w:rPr>
   </w:style>
-  <w:style w:type="character" w:styleId="Hypertextovodkaz">
+  <w:style w:type="character" w:styleId="Hyperlink">
     <w:name w:val="Hyperlink"/>
     <w:uiPriority w:val="99"/>
     <w:rsid w:val="006B184D"/>
@@ -7979,7 +8250,7 @@
   </w:style>
   <w:style w:type="numbering" w:styleId="1ai">
     <w:name w:val="Outline List 1"/>
-    <w:basedOn w:val="Bezseznamu"/>
+    <w:basedOn w:val="NoList"/>
     <w:semiHidden/>
     <w:rsid w:val="006B184D"/>
     <w:pPr>
@@ -7988,9 +8259,9 @@
       </w:numPr>
     </w:pPr>
   </w:style>
-  <w:style w:type="paragraph" w:styleId="AdresaHTML">
+  <w:style w:type="paragraph" w:styleId="HTMLAddress">
     <w:name w:val="HTML Address"/>
-    <w:basedOn w:val="Normln"/>
+    <w:basedOn w:val="Normal"/>
     <w:semiHidden/>
     <w:rsid w:val="006B184D"/>
     <w:rPr>
@@ -7998,9 +8269,9 @@
       <w:iCs/>
     </w:rPr>
   </w:style>
-  <w:style w:type="paragraph" w:styleId="Adresanaoblku">
+  <w:style w:type="paragraph" w:styleId="EnvelopeAddress">
     <w:name w:val="envelope address"/>
-    <w:basedOn w:val="Normln"/>
+    <w:basedOn w:val="Normal"/>
     <w:semiHidden/>
     <w:rsid w:val="006B184D"/>
     <w:pPr>
@@ -8013,15 +8284,15 @@
       <w:szCs w:val="24"/>
     </w:rPr>
   </w:style>
-  <w:style w:type="character" w:styleId="AkronymHTML">
+  <w:style w:type="character" w:styleId="HTMLAcronym">
     <w:name w:val="HTML Acronym"/>
-    <w:basedOn w:val="Standardnpsmoodstavce"/>
+    <w:basedOn w:val="DefaultParagraphFont"/>
     <w:semiHidden/>
     <w:rsid w:val="006B184D"/>
   </w:style>
-  <w:style w:type="table" w:styleId="Barevntabulka1">
+  <w:style w:type="table" w:styleId="TableColourful1">
     <w:name w:val="Table Colorful 1"/>
-    <w:basedOn w:val="Normlntabulka"/>
+    <w:basedOn w:val="TableNormal"/>
     <w:semiHidden/>
     <w:rsid w:val="006B184D"/>
     <w:rPr>
@@ -8097,9 +8368,9 @@
       </w:tcPr>
     </w:tblStylePr>
   </w:style>
-  <w:style w:type="table" w:styleId="Barevntabulka2">
+  <w:style w:type="table" w:styleId="TableColourful2">
     <w:name w:val="Table Colorful 2"/>
-    <w:basedOn w:val="Normlntabulka"/>
+    <w:basedOn w:val="TableNormal"/>
     <w:semiHidden/>
     <w:rsid w:val="006B184D"/>
     <w:tblPr>
@@ -8169,9 +8440,9 @@
       </w:tcPr>
     </w:tblStylePr>
   </w:style>
-  <w:style w:type="table" w:styleId="Barevntabulka3">
+  <w:style w:type="table" w:styleId="TableColourful3">
     <w:name w:val="Table Colorful 3"/>
-    <w:basedOn w:val="Normlntabulka"/>
+    <w:basedOn w:val="TableNormal"/>
     <w:semiHidden/>
     <w:rsid w:val="006B184D"/>
     <w:tblPr>
@@ -8225,7 +8496,7 @@
       </w:tcPr>
     </w:tblStylePr>
   </w:style>
-  <w:style w:type="character" w:styleId="CittHTML">
+  <w:style w:type="character" w:styleId="HTMLCite">
     <w:name w:val="HTML Cite"/>
     <w:semiHidden/>
     <w:rsid w:val="006B184D"/>
@@ -8234,15 +8505,15 @@
       <w:iCs/>
     </w:rPr>
   </w:style>
-  <w:style w:type="character" w:styleId="slodku">
+  <w:style w:type="character" w:styleId="LineNumber">
     <w:name w:val="line number"/>
-    <w:basedOn w:val="Standardnpsmoodstavce"/>
+    <w:basedOn w:val="DefaultParagraphFont"/>
     <w:semiHidden/>
     <w:rsid w:val="006B184D"/>
   </w:style>
-  <w:style w:type="paragraph" w:styleId="slovanseznam2">
+  <w:style w:type="paragraph" w:styleId="ListNumber2">
     <w:name w:val="List Number 2"/>
-    <w:basedOn w:val="Normln"/>
+    <w:basedOn w:val="Normal"/>
     <w:rsid w:val="006B184D"/>
     <w:pPr>
       <w:numPr>
@@ -8250,9 +8521,9 @@
       </w:numPr>
     </w:pPr>
   </w:style>
-  <w:style w:type="paragraph" w:styleId="slovanseznam3">
+  <w:style w:type="paragraph" w:styleId="ListNumber3">
     <w:name w:val="List Number 3"/>
-    <w:basedOn w:val="Normln"/>
+    <w:basedOn w:val="Normal"/>
     <w:rsid w:val="006B184D"/>
     <w:pPr>
       <w:numPr>
@@ -8260,9 +8531,9 @@
       </w:numPr>
     </w:pPr>
   </w:style>
-  <w:style w:type="paragraph" w:styleId="slovanseznam4">
+  <w:style w:type="paragraph" w:styleId="ListNumber4">
     <w:name w:val="List Number 4"/>
-    <w:basedOn w:val="Normln"/>
+    <w:basedOn w:val="Normal"/>
     <w:rsid w:val="006B184D"/>
     <w:pPr>
       <w:numPr>
@@ -8270,9 +8541,9 @@
       </w:numPr>
     </w:pPr>
   </w:style>
-  <w:style w:type="paragraph" w:styleId="slovanseznam5">
+  <w:style w:type="paragraph" w:styleId="ListNumber5">
     <w:name w:val="List Number 5"/>
-    <w:basedOn w:val="Normln"/>
+    <w:basedOn w:val="Normal"/>
     <w:semiHidden/>
     <w:rsid w:val="006B184D"/>
     <w:pPr>
@@ -8281,9 +8552,9 @@
       </w:numPr>
     </w:pPr>
   </w:style>
-  <w:style w:type="numbering" w:styleId="lnekoddl">
+  <w:style w:type="numbering" w:styleId="ArticleSection">
     <w:name w:val="Outline List 3"/>
-    <w:basedOn w:val="Bezseznamu"/>
+    <w:basedOn w:val="NoList"/>
     <w:semiHidden/>
     <w:rsid w:val="006B184D"/>
     <w:pPr>
@@ -8292,14 +8563,14 @@
       </w:numPr>
     </w:pPr>
   </w:style>
-  <w:style w:type="paragraph" w:styleId="Datum">
+  <w:style w:type="paragraph" w:styleId="Date">
     <w:name w:val="Date"/>
-    <w:basedOn w:val="Normln"/>
-    <w:next w:val="Normln"/>
+    <w:basedOn w:val="Normal"/>
+    <w:next w:val="Normal"/>
     <w:semiHidden/>
     <w:rsid w:val="006B184D"/>
   </w:style>
-  <w:style w:type="character" w:styleId="DefiniceHTML">
+  <w:style w:type="character" w:styleId="HTMLDefinition">
     <w:name w:val="HTML Definition"/>
     <w:semiHidden/>
     <w:rsid w:val="006B184D"/>
@@ -8308,9 +8579,9 @@
       <w:iCs/>
     </w:rPr>
   </w:style>
-  <w:style w:type="table" w:styleId="Elegantntabulka">
+  <w:style w:type="table" w:styleId="TableElegant">
     <w:name w:val="Table Elegant"/>
-    <w:basedOn w:val="Normlntabulka"/>
+    <w:basedOn w:val="TableNormal"/>
     <w:semiHidden/>
     <w:rsid w:val="006B184D"/>
     <w:tblPr>
@@ -8340,18 +8611,18 @@
       </w:tcPr>
     </w:tblStylePr>
   </w:style>
-  <w:style w:type="paragraph" w:styleId="FormtovanvHTML">
+  <w:style w:type="paragraph" w:styleId="HTMLPreformatted">
     <w:name w:val="HTML Preformatted"/>
-    <w:basedOn w:val="Normln"/>
+    <w:basedOn w:val="Normal"/>
     <w:semiHidden/>
     <w:rsid w:val="006B184D"/>
     <w:rPr>
       <w:rFonts w:ascii="Courier New" w:hAnsi="Courier New" w:cs="Courier New"/>
     </w:rPr>
   </w:style>
-  <w:style w:type="table" w:styleId="Jednoduchtabulka1">
+  <w:style w:type="table" w:styleId="TableSimple1">
     <w:name w:val="Table Simple 1"/>
-    <w:basedOn w:val="Normlntabulka"/>
+    <w:basedOn w:val="TableNormal"/>
     <w:semiHidden/>
     <w:rsid w:val="006B184D"/>
     <w:tblPr>
@@ -8384,9 +8655,9 @@
       </w:tcPr>
     </w:tblStylePr>
   </w:style>
-  <w:style w:type="table" w:styleId="Jednoduchtabulka2">
+  <w:style w:type="table" w:styleId="TableSimple2">
     <w:name w:val="Table Simple 2"/>
-    <w:basedOn w:val="Normlntabulka"/>
+    <w:basedOn w:val="TableNormal"/>
     <w:semiHidden/>
     <w:rsid w:val="006B184D"/>
     <w:tblPr/>
@@ -8476,9 +8747,9 @@
       </w:tcPr>
     </w:tblStylePr>
   </w:style>
-  <w:style w:type="table" w:styleId="Jednoduchtabulka3">
+  <w:style w:type="table" w:styleId="TableSimple3">
     <w:name w:val="Table Simple 3"/>
-    <w:basedOn w:val="Normlntabulka"/>
+    <w:basedOn w:val="TableNormal"/>
     <w:semiHidden/>
     <w:rsid w:val="006B184D"/>
     <w:tblPr>
@@ -8508,9 +8779,9 @@
       </w:tcPr>
     </w:tblStylePr>
   </w:style>
-  <w:style w:type="table" w:styleId="Klasicktabulka1">
+  <w:style w:type="table" w:styleId="TableClassic1">
     <w:name w:val="Table Classic 1"/>
-    <w:basedOn w:val="Normlntabulka"/>
+    <w:basedOn w:val="TableNormal"/>
     <w:semiHidden/>
     <w:rsid w:val="006B184D"/>
     <w:tblPr>
@@ -8588,9 +8859,9 @@
       </w:tcPr>
     </w:tblStylePr>
   </w:style>
-  <w:style w:type="table" w:styleId="Klasicktabulka2">
+  <w:style w:type="table" w:styleId="TableClassic2">
     <w:name w:val="Table Classic 2"/>
-    <w:basedOn w:val="Normlntabulka"/>
+    <w:basedOn w:val="TableNormal"/>
     <w:semiHidden/>
     <w:rsid w:val="006B184D"/>
     <w:tblPr>
@@ -8676,9 +8947,9 @@
       </w:tcPr>
     </w:tblStylePr>
   </w:style>
-  <w:style w:type="table" w:styleId="Klasicktabulka3">
+  <w:style w:type="table" w:styleId="TableClassic3">
     <w:name w:val="Table Classic 3"/>
-    <w:basedOn w:val="Normlntabulka"/>
+    <w:basedOn w:val="TableNormal"/>
     <w:semiHidden/>
     <w:rsid w:val="006B184D"/>
     <w:rPr>
@@ -8742,9 +9013,9 @@
       </w:tcPr>
     </w:tblStylePr>
   </w:style>
-  <w:style w:type="table" w:styleId="Klasicktabulka4">
+  <w:style w:type="table" w:styleId="TableClassic4">
     <w:name w:val="Table Classic 4"/>
-    <w:basedOn w:val="Normlntabulka"/>
+    <w:basedOn w:val="TableNormal"/>
     <w:semiHidden/>
     <w:rsid w:val="006B184D"/>
     <w:tblPr>
@@ -8829,7 +9100,7 @@
       </w:tcPr>
     </w:tblStylePr>
   </w:style>
-  <w:style w:type="character" w:styleId="KlvesniceHTML">
+  <w:style w:type="character" w:styleId="HTMLKeyboard">
     <w:name w:val="HTML Keyboard"/>
     <w:semiHidden/>
     <w:rsid w:val="006B184D"/>
@@ -8839,7 +9110,7 @@
       <w:szCs w:val="20"/>
     </w:rPr>
   </w:style>
-  <w:style w:type="character" w:styleId="KdHTML">
+  <w:style w:type="character" w:styleId="HTMLCode">
     <w:name w:val="HTML Code"/>
     <w:semiHidden/>
     <w:rsid w:val="006B184D"/>
@@ -8849,9 +9120,9 @@
       <w:szCs w:val="20"/>
     </w:rPr>
   </w:style>
-  <w:style w:type="table" w:styleId="Moderntabulka">
+  <w:style w:type="table" w:styleId="TableContemporary">
     <w:name w:val="Table Contemporary"/>
-    <w:basedOn w:val="Normlntabulka"/>
+    <w:basedOn w:val="TableNormal"/>
     <w:semiHidden/>
     <w:rsid w:val="006B184D"/>
     <w:tblPr>
@@ -8903,9 +9174,9 @@
       </w:tcPr>
     </w:tblStylePr>
   </w:style>
-  <w:style w:type="table" w:styleId="Motivtabulky">
+  <w:style w:type="table" w:styleId="TableTheme">
     <w:name w:val="Table Theme"/>
-    <w:basedOn w:val="Normlntabulka"/>
+    <w:basedOn w:val="TableNormal"/>
     <w:semiHidden/>
     <w:rsid w:val="006B184D"/>
     <w:tblPr>
@@ -8919,9 +9190,9 @@
       </w:tblBorders>
     </w:tblPr>
   </w:style>
-  <w:style w:type="table" w:styleId="Mkatabulky">
+  <w:style w:type="table" w:styleId="TableGrid">
     <w:name w:val="Table Grid"/>
-    <w:basedOn w:val="Normlntabulka"/>
+    <w:basedOn w:val="TableNormal"/>
     <w:rsid w:val="006B184D"/>
     <w:tblPr>
       <w:tblBorders>
@@ -8934,9 +9205,9 @@
       </w:tblBorders>
     </w:tblPr>
   </w:style>
-  <w:style w:type="table" w:styleId="Mkatabulky1">
+  <w:style w:type="table" w:styleId="TableGrid1">
     <w:name w:val="Table Grid 1"/>
-    <w:basedOn w:val="Normlntabulka"/>
+    <w:basedOn w:val="TableNormal"/>
     <w:semiHidden/>
     <w:rsid w:val="006B184D"/>
     <w:tblPr>
@@ -8979,9 +9250,9 @@
       </w:tcPr>
     </w:tblStylePr>
   </w:style>
-  <w:style w:type="table" w:styleId="Mkatabulky2">
+  <w:style w:type="table" w:styleId="TableGrid2">
     <w:name w:val="Table Grid 2"/>
-    <w:basedOn w:val="Normlntabulka"/>
+    <w:basedOn w:val="TableNormal"/>
     <w:semiHidden/>
     <w:rsid w:val="006B184D"/>
     <w:tblPr>
@@ -9047,9 +9318,9 @@
       </w:tcPr>
     </w:tblStylePr>
   </w:style>
-  <w:style w:type="table" w:styleId="Mkatabulky4">
+  <w:style w:type="table" w:styleId="TableGrid4">
     <w:name w:val="Table Grid 4"/>
-    <w:basedOn w:val="Normlntabulka"/>
+    <w:basedOn w:val="TableNormal"/>
     <w:semiHidden/>
     <w:rsid w:val="006B184D"/>
     <w:tblPr>
@@ -9108,9 +9379,9 @@
       </w:tcPr>
     </w:tblStylePr>
   </w:style>
-  <w:style w:type="table" w:styleId="Mkatabulky5">
+  <w:style w:type="table" w:styleId="TableGrid5">
     <w:name w:val="Table Grid 5"/>
-    <w:basedOn w:val="Normlntabulka"/>
+    <w:basedOn w:val="TableNormal"/>
     <w:semiHidden/>
     <w:rsid w:val="006B184D"/>
     <w:tblPr>
@@ -9172,9 +9443,9 @@
       </w:tcPr>
     </w:tblStylePr>
   </w:style>
-  <w:style w:type="table" w:styleId="Mkatabulky6">
+  <w:style w:type="table" w:styleId="TableGrid6">
     <w:name w:val="Table Grid 6"/>
-    <w:basedOn w:val="Normlntabulka"/>
+    <w:basedOn w:val="TableNormal"/>
     <w:semiHidden/>
     <w:rsid w:val="006B184D"/>
     <w:tblPr>
@@ -9239,9 +9510,9 @@
       </w:tcPr>
     </w:tblStylePr>
   </w:style>
-  <w:style w:type="table" w:styleId="Mkatabulky7">
+  <w:style w:type="table" w:styleId="TableGrid7">
     <w:name w:val="Table Grid 7"/>
-    <w:basedOn w:val="Normlntabulka"/>
+    <w:basedOn w:val="TableNormal"/>
     <w:semiHidden/>
     <w:rsid w:val="006B184D"/>
     <w:rPr>
@@ -9325,9 +9596,9 @@
       </w:tcPr>
     </w:tblStylePr>
   </w:style>
-  <w:style w:type="table" w:styleId="Mkatabulky8">
+  <w:style w:type="table" w:styleId="TableGrid8">
     <w:name w:val="Table Grid 8"/>
-    <w:basedOn w:val="Normlntabulka"/>
+    <w:basedOn w:val="TableNormal"/>
     <w:semiHidden/>
     <w:rsid w:val="006B184D"/>
     <w:tblPr>
@@ -9387,17 +9658,17 @@
       </w:tcPr>
     </w:tblStylePr>
   </w:style>
-  <w:style w:type="paragraph" w:styleId="Nadpispoznmky">
+  <w:style w:type="paragraph" w:styleId="NoteHeading">
     <w:name w:val="Note Heading"/>
-    <w:basedOn w:val="Normln"/>
-    <w:next w:val="Normln"/>
+    <w:basedOn w:val="Normal"/>
+    <w:next w:val="Normal"/>
     <w:semiHidden/>
     <w:rsid w:val="006B184D"/>
   </w:style>
-  <w:style w:type="paragraph" w:styleId="Nzev">
+  <w:style w:type="paragraph" w:styleId="Title">
     <w:name w:val="Title"/>
-    <w:basedOn w:val="Normln"/>
-    <w:link w:val="NzevChar"/>
+    <w:basedOn w:val="Normal"/>
+    <w:link w:val="TitleChar"/>
     <w:qFormat/>
     <w:rsid w:val="006B184D"/>
     <w:pPr>
@@ -9414,9 +9685,9 @@
       <w:szCs w:val="32"/>
     </w:rPr>
   </w:style>
-  <w:style w:type="paragraph" w:styleId="Normlnweb">
+  <w:style w:type="paragraph" w:styleId="NormalWeb">
     <w:name w:val="Normal (Web)"/>
-    <w:basedOn w:val="Normln"/>
+    <w:basedOn w:val="Normal"/>
     <w:semiHidden/>
     <w:rsid w:val="006B184D"/>
     <w:rPr>
@@ -9425,40 +9696,40 @@
       <w:szCs w:val="24"/>
     </w:rPr>
   </w:style>
-  <w:style w:type="paragraph" w:styleId="Normlnodsazen">
+  <w:style w:type="paragraph" w:styleId="NormalIndent">
     <w:name w:val="Normal Indent"/>
-    <w:basedOn w:val="Normln"/>
+    <w:basedOn w:val="Normal"/>
     <w:semiHidden/>
     <w:rsid w:val="006B184D"/>
     <w:pPr>
       <w:ind w:left="708"/>
     </w:pPr>
   </w:style>
-  <w:style w:type="paragraph" w:styleId="Osloven">
+  <w:style w:type="paragraph" w:styleId="Salutation">
     <w:name w:val="Salutation"/>
-    <w:basedOn w:val="Normln"/>
-    <w:next w:val="Normln"/>
+    <w:basedOn w:val="Normal"/>
+    <w:next w:val="Normal"/>
     <w:semiHidden/>
     <w:rsid w:val="006B184D"/>
   </w:style>
-  <w:style w:type="paragraph" w:styleId="Podpis">
+  <w:style w:type="paragraph" w:styleId="Signature">
     <w:name w:val="Signature"/>
-    <w:basedOn w:val="Normln"/>
+    <w:basedOn w:val="Normal"/>
     <w:semiHidden/>
     <w:rsid w:val="006B184D"/>
     <w:pPr>
       <w:ind w:left="4252"/>
     </w:pPr>
   </w:style>
-  <w:style w:type="paragraph" w:styleId="Podpise-mailu">
+  <w:style w:type="paragraph" w:styleId="EmailSignature">
     <w:name w:val="E-mail Signature"/>
-    <w:basedOn w:val="Normln"/>
+    <w:basedOn w:val="Normal"/>
     <w:semiHidden/>
     <w:rsid w:val="006B184D"/>
   </w:style>
-  <w:style w:type="paragraph" w:styleId="Podnadpis">
+  <w:style w:type="paragraph" w:styleId="Subtitle">
     <w:name w:val="Subtitle"/>
-    <w:basedOn w:val="Normln"/>
+    <w:basedOn w:val="Normal"/>
     <w:qFormat/>
     <w:rsid w:val="006B184D"/>
     <w:pPr>
@@ -9472,45 +9743,45 @@
       <w:szCs w:val="24"/>
     </w:rPr>
   </w:style>
-  <w:style w:type="paragraph" w:styleId="Pokraovnseznamu">
+  <w:style w:type="paragraph" w:styleId="ListContinue">
     <w:name w:val="List Continue"/>
-    <w:basedOn w:val="Normln"/>
+    <w:basedOn w:val="Normal"/>
     <w:rsid w:val="006B184D"/>
     <w:pPr>
       <w:spacing w:after="120"/>
       <w:ind w:left="283"/>
     </w:pPr>
   </w:style>
-  <w:style w:type="paragraph" w:styleId="Pokraovnseznamu2">
+  <w:style w:type="paragraph" w:styleId="ListContinue2">
     <w:name w:val="List Continue 2"/>
-    <w:basedOn w:val="Normln"/>
+    <w:basedOn w:val="Normal"/>
     <w:rsid w:val="006B184D"/>
     <w:pPr>
       <w:spacing w:after="120"/>
       <w:ind w:left="566"/>
     </w:pPr>
   </w:style>
-  <w:style w:type="paragraph" w:styleId="Pokraovnseznamu3">
+  <w:style w:type="paragraph" w:styleId="ListContinue3">
     <w:name w:val="List Continue 3"/>
-    <w:basedOn w:val="Normln"/>
+    <w:basedOn w:val="Normal"/>
     <w:rsid w:val="006B184D"/>
     <w:pPr>
       <w:spacing w:after="120"/>
       <w:ind w:left="849"/>
     </w:pPr>
   </w:style>
-  <w:style w:type="paragraph" w:styleId="Pokraovnseznamu4">
+  <w:style w:type="paragraph" w:styleId="ListContinue4">
     <w:name w:val="List Continue 4"/>
-    <w:basedOn w:val="Normln"/>
+    <w:basedOn w:val="Normal"/>
     <w:rsid w:val="006B184D"/>
     <w:pPr>
       <w:spacing w:after="120"/>
       <w:ind w:left="1132"/>
     </w:pPr>
   </w:style>
-  <w:style w:type="paragraph" w:styleId="Pokraovnseznamu5">
+  <w:style w:type="paragraph" w:styleId="ListContinue5">
     <w:name w:val="List Continue 5"/>
-    <w:basedOn w:val="Normln"/>
+    <w:basedOn w:val="Normal"/>
     <w:semiHidden/>
     <w:rsid w:val="006B184D"/>
     <w:pPr>
@@ -9518,9 +9789,9 @@
       <w:ind w:left="1415"/>
     </w:pPr>
   </w:style>
-  <w:style w:type="table" w:styleId="Profesionlntabulka">
+  <w:style w:type="table" w:styleId="TableProfessional">
     <w:name w:val="Table Professional"/>
-    <w:basedOn w:val="Normlntabulka"/>
+    <w:basedOn w:val="TableNormal"/>
     <w:semiHidden/>
     <w:rsid w:val="006B184D"/>
     <w:tblPr>
@@ -9552,7 +9823,7 @@
       </w:tcPr>
     </w:tblStylePr>
   </w:style>
-  <w:style w:type="character" w:styleId="PromnnHTML">
+  <w:style w:type="character" w:styleId="HTMLVariable">
     <w:name w:val="HTML Variable"/>
     <w:semiHidden/>
     <w:rsid w:val="006B184D"/>
@@ -9561,16 +9832,16 @@
       <w:iCs/>
     </w:rPr>
   </w:style>
-  <w:style w:type="paragraph" w:styleId="Prosttext">
+  <w:style w:type="paragraph" w:styleId="PlainText">
     <w:name w:val="Plain Text"/>
-    <w:basedOn w:val="Normln"/>
+    <w:basedOn w:val="Normal"/>
     <w:semiHidden/>
     <w:rsid w:val="006B184D"/>
     <w:rPr>
       <w:rFonts w:ascii="Courier New" w:hAnsi="Courier New" w:cs="Courier New"/>
     </w:rPr>
   </w:style>
-  <w:style w:type="character" w:styleId="PsacstrojHTML">
+  <w:style w:type="character" w:styleId="HTMLTypewriter">
     <w:name w:val="HTML Typewriter"/>
     <w:semiHidden/>
     <w:rsid w:val="006B184D"/>
@@ -9580,54 +9851,54 @@
       <w:szCs w:val="20"/>
     </w:rPr>
   </w:style>
-  <w:style w:type="paragraph" w:styleId="Seznam">
+  <w:style w:type="paragraph" w:styleId="List">
     <w:name w:val="List"/>
-    <w:basedOn w:val="Normln"/>
+    <w:basedOn w:val="Normal"/>
     <w:semiHidden/>
     <w:rsid w:val="006B184D"/>
     <w:pPr>
       <w:ind w:left="283" w:hanging="283"/>
     </w:pPr>
   </w:style>
-  <w:style w:type="paragraph" w:styleId="Seznam2">
+  <w:style w:type="paragraph" w:styleId="List2">
     <w:name w:val="List 2"/>
-    <w:basedOn w:val="Normln"/>
+    <w:basedOn w:val="Normal"/>
     <w:semiHidden/>
     <w:rsid w:val="006B184D"/>
     <w:pPr>
       <w:ind w:left="566" w:hanging="283"/>
     </w:pPr>
   </w:style>
-  <w:style w:type="paragraph" w:styleId="Seznam3">
+  <w:style w:type="paragraph" w:styleId="List3">
     <w:name w:val="List 3"/>
-    <w:basedOn w:val="Normln"/>
+    <w:basedOn w:val="Normal"/>
     <w:semiHidden/>
     <w:rsid w:val="006B184D"/>
     <w:pPr>
       <w:ind w:left="849" w:hanging="283"/>
     </w:pPr>
   </w:style>
-  <w:style w:type="paragraph" w:styleId="Seznam4">
+  <w:style w:type="paragraph" w:styleId="List4">
     <w:name w:val="List 4"/>
-    <w:basedOn w:val="Normln"/>
+    <w:basedOn w:val="Normal"/>
     <w:semiHidden/>
     <w:rsid w:val="006B184D"/>
     <w:pPr>
       <w:ind w:left="1132" w:hanging="283"/>
     </w:pPr>
   </w:style>
-  <w:style w:type="paragraph" w:styleId="Seznam5">
+  <w:style w:type="paragraph" w:styleId="List5">
     <w:name w:val="List 5"/>
-    <w:basedOn w:val="Normln"/>
+    <w:basedOn w:val="Normal"/>
     <w:semiHidden/>
     <w:rsid w:val="006B184D"/>
     <w:pPr>
       <w:ind w:left="1415" w:hanging="283"/>
     </w:pPr>
   </w:style>
-  <w:style w:type="paragraph" w:styleId="Seznamsodrkami">
+  <w:style w:type="paragraph" w:styleId="ListBullet">
     <w:name w:val="List Bullet"/>
-    <w:basedOn w:val="Normln"/>
+    <w:basedOn w:val="Normal"/>
     <w:semiHidden/>
     <w:rsid w:val="006B184D"/>
     <w:pPr>
@@ -9636,9 +9907,9 @@
       </w:numPr>
     </w:pPr>
   </w:style>
-  <w:style w:type="paragraph" w:styleId="Seznamsodrkami2">
+  <w:style w:type="paragraph" w:styleId="ListBullet2">
     <w:name w:val="List Bullet 2"/>
-    <w:basedOn w:val="Normln"/>
+    <w:basedOn w:val="Normal"/>
     <w:semiHidden/>
     <w:rsid w:val="006B184D"/>
     <w:pPr>
@@ -9647,9 +9918,9 @@
       </w:numPr>
     </w:pPr>
   </w:style>
-  <w:style w:type="paragraph" w:styleId="Seznamsodrkami3">
+  <w:style w:type="paragraph" w:styleId="ListBullet3">
     <w:name w:val="List Bullet 3"/>
-    <w:basedOn w:val="Normln"/>
+    <w:basedOn w:val="Normal"/>
     <w:semiHidden/>
     <w:rsid w:val="006B184D"/>
     <w:pPr>
@@ -9658,9 +9929,9 @@
       </w:numPr>
     </w:pPr>
   </w:style>
-  <w:style w:type="paragraph" w:styleId="Seznamsodrkami4">
+  <w:style w:type="paragraph" w:styleId="ListBullet4">
     <w:name w:val="List Bullet 4"/>
-    <w:basedOn w:val="Normln"/>
+    <w:basedOn w:val="Normal"/>
     <w:autoRedefine/>
     <w:rsid w:val="006B184D"/>
     <w:pPr>
@@ -9672,9 +9943,9 @@
       <w:jc w:val="both"/>
     </w:pPr>
   </w:style>
-  <w:style w:type="paragraph" w:styleId="Seznamsodrkami5">
+  <w:style w:type="paragraph" w:styleId="ListBullet5">
     <w:name w:val="List Bullet 5"/>
-    <w:basedOn w:val="Normln"/>
+    <w:basedOn w:val="Normal"/>
     <w:semiHidden/>
     <w:rsid w:val="006B184D"/>
     <w:pPr>
@@ -9683,7 +9954,7 @@
       </w:numPr>
     </w:pPr>
   </w:style>
-  <w:style w:type="character" w:styleId="Siln">
+  <w:style w:type="character" w:styleId="Strong">
     <w:name w:val="Strong"/>
     <w:qFormat/>
     <w:rsid w:val="006B184D"/>
@@ -9692,7 +9963,7 @@
       <w:bCs/>
     </w:rPr>
   </w:style>
-  <w:style w:type="character" w:styleId="Sledovanodkaz">
+  <w:style w:type="character" w:styleId="FollowedHyperlink">
     <w:name w:val="FollowedHyperlink"/>
     <w:semiHidden/>
     <w:rsid w:val="006B184D"/>
@@ -9701,9 +9972,9 @@
       <w:u w:val="single"/>
     </w:rPr>
   </w:style>
-  <w:style w:type="table" w:styleId="Sloupcetabulky1">
+  <w:style w:type="table" w:styleId="TableColumns1">
     <w:name w:val="Table Columns 1"/>
-    <w:basedOn w:val="Normlntabulka"/>
+    <w:basedOn w:val="TableNormal"/>
     <w:semiHidden/>
     <w:rsid w:val="006B184D"/>
     <w:rPr>
@@ -9817,9 +10088,9 @@
       </w:tcPr>
     </w:tblStylePr>
   </w:style>
-  <w:style w:type="table" w:styleId="Sloupcetabulky2">
+  <w:style w:type="table" w:styleId="TableColumns2">
     <w:name w:val="Table Columns 2"/>
-    <w:basedOn w:val="Normlntabulka"/>
+    <w:basedOn w:val="TableNormal"/>
     <w:semiHidden/>
     <w:rsid w:val="006B184D"/>
     <w:rPr>
@@ -9927,9 +10198,9 @@
       </w:tcPr>
     </w:tblStylePr>
   </w:style>
-  <w:style w:type="table" w:styleId="Sloupcetabulky3">
+  <w:style w:type="table" w:styleId="TableColumns3">
     <w:name w:val="Table Columns 3"/>
-    <w:basedOn w:val="Normlntabulka"/>
+    <w:basedOn w:val="TableNormal"/>
     <w:semiHidden/>
     <w:rsid w:val="006B184D"/>
     <w:rPr>
@@ -10031,9 +10302,9 @@
       </w:tcPr>
     </w:tblStylePr>
   </w:style>
-  <w:style w:type="table" w:styleId="Sloupcetabulky4">
+  <w:style w:type="table" w:styleId="TableColumns4">
     <w:name w:val="Table Columns 4"/>
-    <w:basedOn w:val="Normlntabulka"/>
+    <w:basedOn w:val="TableNormal"/>
     <w:semiHidden/>
     <w:rsid w:val="006B184D"/>
     <w:tblPr>
@@ -10097,9 +10368,9 @@
       </w:tcPr>
     </w:tblStylePr>
   </w:style>
-  <w:style w:type="table" w:styleId="Sloupcetabulky5">
+  <w:style w:type="table" w:styleId="TableColumns5">
     <w:name w:val="Table Columns 5"/>
-    <w:basedOn w:val="Normlntabulka"/>
+    <w:basedOn w:val="TableNormal"/>
     <w:semiHidden/>
     <w:rsid w:val="006B184D"/>
     <w:tblPr>
@@ -10183,9 +10454,9 @@
       </w:rPr>
     </w:tblStylePr>
   </w:style>
-  <w:style w:type="table" w:styleId="Tabulkajakoseznam1">
+  <w:style w:type="table" w:styleId="TableList1">
     <w:name w:val="Table List 1"/>
-    <w:basedOn w:val="Normlntabulka"/>
+    <w:basedOn w:val="TableNormal"/>
     <w:semiHidden/>
     <w:rsid w:val="006B184D"/>
     <w:tblPr>
@@ -10264,9 +10535,9 @@
       </w:tcPr>
     </w:tblStylePr>
   </w:style>
-  <w:style w:type="table" w:styleId="Tabulkajakoseznam2">
+  <w:style w:type="table" w:styleId="TableList2">
     <w:name w:val="Table List 2"/>
-    <w:basedOn w:val="Normlntabulka"/>
+    <w:basedOn w:val="TableNormal"/>
     <w:semiHidden/>
     <w:rsid w:val="006B184D"/>
     <w:tblPr>
@@ -10340,9 +10611,9 @@
       </w:tcPr>
     </w:tblStylePr>
   </w:style>
-  <w:style w:type="table" w:styleId="Tabulkajakoseznam3">
+  <w:style w:type="table" w:styleId="TableList3">
     <w:name w:val="Table List 3"/>
-    <w:basedOn w:val="Normlntabulka"/>
+    <w:basedOn w:val="TableNormal"/>
     <w:semiHidden/>
     <w:rsid w:val="006B184D"/>
     <w:tblPr>
@@ -10395,9 +10666,9 @@
       </w:tcPr>
     </w:tblStylePr>
   </w:style>
-  <w:style w:type="table" w:styleId="Tabulkajakoseznam4">
+  <w:style w:type="table" w:styleId="TableList4">
     <w:name w:val="Table List 4"/>
-    <w:basedOn w:val="Normlntabulka"/>
+    <w:basedOn w:val="TableNormal"/>
     <w:semiHidden/>
     <w:rsid w:val="006B184D"/>
     <w:tblPr>
@@ -10429,9 +10700,9 @@
       </w:tcPr>
     </w:tblStylePr>
   </w:style>
-  <w:style w:type="table" w:styleId="Tabulkajakoseznam5">
+  <w:style w:type="table" w:styleId="TableList5">
     <w:name w:val="Table List 5"/>
-    <w:basedOn w:val="Normlntabulka"/>
+    <w:basedOn w:val="TableNormal"/>
     <w:semiHidden/>
     <w:rsid w:val="006B184D"/>
     <w:tblPr>
@@ -10474,9 +10745,9 @@
       </w:tcPr>
     </w:tblStylePr>
   </w:style>
-  <w:style w:type="table" w:styleId="Tabulkajakoseznam6">
+  <w:style w:type="table" w:styleId="TableList6">
     <w:name w:val="Table List 6"/>
-    <w:basedOn w:val="Normlntabulka"/>
+    <w:basedOn w:val="TableNormal"/>
     <w:semiHidden/>
     <w:rsid w:val="006B184D"/>
     <w:tblPr>
@@ -10530,9 +10801,9 @@
       </w:tcPr>
     </w:tblStylePr>
   </w:style>
-  <w:style w:type="table" w:styleId="Tabulkajakoseznam7">
+  <w:style w:type="table" w:styleId="TableList7">
     <w:name w:val="Table List 7"/>
-    <w:basedOn w:val="Normlntabulka"/>
+    <w:basedOn w:val="TableNormal"/>
     <w:semiHidden/>
     <w:rsid w:val="006B184D"/>
     <w:tblPr>
@@ -10624,9 +10895,9 @@
       </w:tcPr>
     </w:tblStylePr>
   </w:style>
-  <w:style w:type="table" w:styleId="Tabulkajakoseznam8">
+  <w:style w:type="table" w:styleId="TableList8">
     <w:name w:val="Table List 8"/>
-    <w:basedOn w:val="Normlntabulka"/>
+    <w:basedOn w:val="TableNormal"/>
     <w:semiHidden/>
     <w:rsid w:val="006B184D"/>
     <w:tblPr>
@@ -10720,9 +10991,9 @@
       </w:tcPr>
     </w:tblStylePr>
   </w:style>
-  <w:style w:type="table" w:styleId="Tabulkasprostorovmiefekty1">
+  <w:style w:type="table" w:styleId="Table3Deffects1">
     <w:name w:val="Table 3D effects 1"/>
-    <w:basedOn w:val="Normlntabulka"/>
+    <w:basedOn w:val="TableNormal"/>
     <w:semiHidden/>
     <w:rsid w:val="006B184D"/>
     <w:tblPr/>
@@ -10826,9 +11097,9 @@
       </w:tcPr>
     </w:tblStylePr>
   </w:style>
-  <w:style w:type="table" w:styleId="Tabulkasprostorovmiefekty2">
+  <w:style w:type="table" w:styleId="Table3Deffects2">
     <w:name w:val="Table 3D effects 2"/>
-    <w:basedOn w:val="Normlntabulka"/>
+    <w:basedOn w:val="TableNormal"/>
     <w:semiHidden/>
     <w:rsid w:val="006B184D"/>
     <w:tblPr>
@@ -10897,9 +11168,9 @@
       </w:tcPr>
     </w:tblStylePr>
   </w:style>
-  <w:style w:type="table" w:styleId="Tabulkasprostorovmiefekty3">
+  <w:style w:type="table" w:styleId="Table3Deffects3">
     <w:name w:val="Table 3D effects 3"/>
-    <w:basedOn w:val="Normlntabulka"/>
+    <w:basedOn w:val="TableNormal"/>
     <w:semiHidden/>
     <w:rsid w:val="006B184D"/>
     <w:tblPr>
@@ -10984,9 +11255,9 @@
       </w:tcPr>
     </w:tblStylePr>
   </w:style>
-  <w:style w:type="table" w:styleId="Tabulkastlumenmibarvami1">
+  <w:style w:type="table" w:styleId="TableSubtle1">
     <w:name w:val="Table Subtle 1"/>
-    <w:basedOn w:val="Normlntabulka"/>
+    <w:basedOn w:val="TableNormal"/>
     <w:semiHidden/>
     <w:rsid w:val="006B184D"/>
     <w:tblPr>
@@ -11072,9 +11343,9 @@
       </w:tcPr>
     </w:tblStylePr>
   </w:style>
-  <w:style w:type="table" w:styleId="Tabulkastlumenmibarvami2">
+  <w:style w:type="table" w:styleId="TableSubtle2">
     <w:name w:val="Table Subtle 2"/>
-    <w:basedOn w:val="Normlntabulka"/>
+    <w:basedOn w:val="TableNormal"/>
     <w:semiHidden/>
     <w:rsid w:val="006B184D"/>
     <w:tblPr>
@@ -11152,9 +11423,9 @@
       </w:tcPr>
     </w:tblStylePr>
   </w:style>
-  <w:style w:type="paragraph" w:styleId="Textvbloku">
+  <w:style w:type="paragraph" w:styleId="BlockText">
     <w:name w:val="Block Text"/>
-    <w:basedOn w:val="Normln"/>
+    <w:basedOn w:val="Normal"/>
     <w:semiHidden/>
     <w:rsid w:val="006B184D"/>
     <w:pPr>
@@ -11162,7 +11433,7 @@
       <w:ind w:left="1440" w:right="1440"/>
     </w:pPr>
   </w:style>
-  <w:style w:type="character" w:styleId="UkzkaHTML">
+  <w:style w:type="character" w:styleId="HTMLSample">
     <w:name w:val="HTML Sample"/>
     <w:semiHidden/>
     <w:rsid w:val="006B184D"/>
@@ -11170,9 +11441,9 @@
       <w:rFonts w:ascii="Courier New" w:hAnsi="Courier New" w:cs="Courier New"/>
     </w:rPr>
   </w:style>
-  <w:style w:type="table" w:styleId="Webovtabulka1">
+  <w:style w:type="table" w:styleId="TableWeb1">
     <w:name w:val="Table Web 1"/>
-    <w:basedOn w:val="Normlntabulka"/>
+    <w:basedOn w:val="TableNormal"/>
     <w:semiHidden/>
     <w:rsid w:val="006B184D"/>
     <w:tblPr>
@@ -11205,9 +11476,9 @@
       </w:tcPr>
     </w:tblStylePr>
   </w:style>
-  <w:style w:type="table" w:styleId="Webovtabulka2">
+  <w:style w:type="table" w:styleId="TableWeb2">
     <w:name w:val="Table Web 2"/>
-    <w:basedOn w:val="Normlntabulka"/>
+    <w:basedOn w:val="TableNormal"/>
     <w:semiHidden/>
     <w:rsid w:val="006B184D"/>
     <w:tblPr>
@@ -11240,9 +11511,9 @@
       </w:tcPr>
     </w:tblStylePr>
   </w:style>
-  <w:style w:type="table" w:styleId="Webovtabulka3">
+  <w:style w:type="table" w:styleId="TableWeb3">
     <w:name w:val="Table Web 3"/>
-    <w:basedOn w:val="Normlntabulka"/>
+    <w:basedOn w:val="TableNormal"/>
     <w:semiHidden/>
     <w:rsid w:val="006B184D"/>
     <w:tblPr>
@@ -11275,9 +11546,9 @@
       </w:tcPr>
     </w:tblStylePr>
   </w:style>
-  <w:style w:type="paragraph" w:styleId="Zhlavzprvy">
+  <w:style w:type="paragraph" w:styleId="MessageHeader">
     <w:name w:val="Message Header"/>
-    <w:basedOn w:val="Normln"/>
+    <w:basedOn w:val="Normal"/>
     <w:semiHidden/>
     <w:rsid w:val="006B184D"/>
     <w:pPr>
@@ -11296,18 +11567,18 @@
       <w:szCs w:val="24"/>
     </w:rPr>
   </w:style>
-  <w:style w:type="paragraph" w:styleId="Zkladntext-prvnodsazen">
+  <w:style w:type="paragraph" w:styleId="BodyTextFirstIndent">
     <w:name w:val="Body Text First Indent"/>
-    <w:basedOn w:val="Zkladntext"/>
+    <w:basedOn w:val="BodyText"/>
     <w:semiHidden/>
     <w:rsid w:val="006B184D"/>
     <w:pPr>
       <w:ind w:firstLine="210"/>
     </w:pPr>
   </w:style>
-  <w:style w:type="paragraph" w:styleId="Zkladntextodsazen">
+  <w:style w:type="paragraph" w:styleId="BodyTextIndent">
     <w:name w:val="Body Text Indent"/>
-    <w:basedOn w:val="Normln"/>
+    <w:basedOn w:val="Normal"/>
     <w:semiHidden/>
     <w:rsid w:val="006B184D"/>
     <w:pPr>
@@ -11315,27 +11586,27 @@
       <w:ind w:left="283"/>
     </w:pPr>
   </w:style>
-  <w:style w:type="paragraph" w:styleId="Zkladntext-prvnodsazen2">
+  <w:style w:type="paragraph" w:styleId="BodyTextFirstIndent2">
     <w:name w:val="Body Text First Indent 2"/>
-    <w:basedOn w:val="Zkladntextodsazen"/>
+    <w:basedOn w:val="BodyTextIndent"/>
     <w:semiHidden/>
     <w:rsid w:val="006B184D"/>
     <w:pPr>
       <w:ind w:firstLine="210"/>
     </w:pPr>
   </w:style>
-  <w:style w:type="paragraph" w:styleId="Zkladntext2">
+  <w:style w:type="paragraph" w:styleId="BodyText2">
     <w:name w:val="Body Text 2"/>
-    <w:basedOn w:val="Normln"/>
+    <w:basedOn w:val="Normal"/>
     <w:semiHidden/>
     <w:rsid w:val="006B184D"/>
     <w:pPr>
       <w:spacing w:after="120" w:line="480" w:lineRule="auto"/>
     </w:pPr>
   </w:style>
-  <w:style w:type="paragraph" w:styleId="Zkladntext3">
+  <w:style w:type="paragraph" w:styleId="BodyText3">
     <w:name w:val="Body Text 3"/>
-    <w:basedOn w:val="Normln"/>
+    <w:basedOn w:val="Normal"/>
     <w:semiHidden/>
     <w:rsid w:val="006B184D"/>
     <w:pPr>
@@ -11346,9 +11617,9 @@
       <w:szCs w:val="16"/>
     </w:rPr>
   </w:style>
-  <w:style w:type="paragraph" w:styleId="Zkladntextodsazen2">
+  <w:style w:type="paragraph" w:styleId="BodyTextIndent2">
     <w:name w:val="Body Text Indent 2"/>
-    <w:basedOn w:val="Normln"/>
+    <w:basedOn w:val="Normal"/>
     <w:semiHidden/>
     <w:rsid w:val="006B184D"/>
     <w:pPr>
@@ -11356,9 +11627,9 @@
       <w:ind w:left="283"/>
     </w:pPr>
   </w:style>
-  <w:style w:type="paragraph" w:styleId="Zkladntextodsazen3">
+  <w:style w:type="paragraph" w:styleId="BodyTextIndent3">
     <w:name w:val="Body Text Indent 3"/>
-    <w:basedOn w:val="Normln"/>
+    <w:basedOn w:val="Normal"/>
     <w:semiHidden/>
     <w:rsid w:val="006B184D"/>
     <w:pPr>
@@ -11370,16 +11641,16 @@
       <w:szCs w:val="16"/>
     </w:rPr>
   </w:style>
-  <w:style w:type="paragraph" w:styleId="Zvr">
+  <w:style w:type="paragraph" w:styleId="Closing">
     <w:name w:val="Closing"/>
-    <w:basedOn w:val="Normln"/>
+    <w:basedOn w:val="Normal"/>
     <w:semiHidden/>
     <w:rsid w:val="006B184D"/>
     <w:pPr>
       <w:ind w:left="4252"/>
     </w:pPr>
   </w:style>
-  <w:style w:type="character" w:styleId="Zdraznn">
+  <w:style w:type="character" w:styleId="Emphasis">
     <w:name w:val="Emphasis"/>
     <w:qFormat/>
     <w:rsid w:val="006B184D"/>
@@ -11405,10 +11676,10 @@
       <w:b/>
     </w:rPr>
   </w:style>
-  <w:style w:type="character" w:customStyle="1" w:styleId="Nadpis2Char">
-    <w:name w:val="Nadpis 2 Char"/>
+  <w:style w:type="character" w:customStyle="1" w:styleId="Heading2Char">
+    <w:name w:val="Heading 2 Char"/>
     <w:basedOn w:val="NadpislnkuChar"/>
-    <w:link w:val="Nadpis2"/>
+    <w:link w:val="Heading2"/>
     <w:qFormat/>
     <w:rsid w:val="0002770A"/>
     <w:rPr>
@@ -11442,7 +11713,7 @@
       <w:ind w:left="567" w:hanging="567"/>
     </w:pPr>
   </w:style>
-  <w:style w:type="character" w:styleId="Odkaznakoment">
+  <w:style w:type="character" w:styleId="CommentReference">
     <w:name w:val="annotation reference"/>
     <w:rsid w:val="006B184D"/>
     <w:rPr>
@@ -11450,34 +11721,34 @@
       <w:szCs w:val="16"/>
     </w:rPr>
   </w:style>
-  <w:style w:type="paragraph" w:styleId="Textkomente">
+  <w:style w:type="paragraph" w:styleId="CommentText">
     <w:name w:val="annotation text"/>
-    <w:basedOn w:val="Normln"/>
-    <w:link w:val="TextkomenteChar"/>
-    <w:rsid w:val="006B184D"/>
-  </w:style>
-  <w:style w:type="character" w:customStyle="1" w:styleId="TextkomenteChar">
-    <w:name w:val="Text komentáře Char"/>
-    <w:link w:val="Textkomente"/>
+    <w:basedOn w:val="Normal"/>
+    <w:link w:val="CommentTextChar"/>
+    <w:rsid w:val="006B184D"/>
+  </w:style>
+  <w:style w:type="character" w:customStyle="1" w:styleId="CommentTextChar">
+    <w:name w:val="Comment Text Char"/>
+    <w:link w:val="CommentText"/>
     <w:rsid w:val="006B184D"/>
     <w:rPr>
       <w:rFonts w:ascii="Arial" w:hAnsi="Arial"/>
     </w:rPr>
   </w:style>
-  <w:style w:type="paragraph" w:styleId="Pedmtkomente">
+  <w:style w:type="paragraph" w:styleId="CommentSubject">
     <w:name w:val="annotation subject"/>
-    <w:basedOn w:val="Textkomente"/>
-    <w:next w:val="Textkomente"/>
-    <w:link w:val="PedmtkomenteChar"/>
+    <w:basedOn w:val="CommentText"/>
+    <w:next w:val="CommentText"/>
+    <w:link w:val="CommentSubjectChar"/>
     <w:rsid w:val="006B184D"/>
     <w:rPr>
       <w:b/>
       <w:bCs/>
     </w:rPr>
   </w:style>
-  <w:style w:type="character" w:customStyle="1" w:styleId="PedmtkomenteChar">
-    <w:name w:val="Předmět komentáře Char"/>
-    <w:link w:val="Pedmtkomente"/>
+  <w:style w:type="character" w:customStyle="1" w:styleId="CommentSubjectChar">
+    <w:name w:val="Comment Subject Char"/>
+    <w:link w:val="CommentSubject"/>
     <w:rsid w:val="006B184D"/>
     <w:rPr>
       <w:rFonts w:ascii="Arial" w:hAnsi="Arial"/>
@@ -11485,10 +11756,10 @@
       <w:bCs/>
     </w:rPr>
   </w:style>
-  <w:style w:type="paragraph" w:styleId="Textbubliny">
+  <w:style w:type="paragraph" w:styleId="BalloonText">
     <w:name w:val="Balloon Text"/>
-    <w:basedOn w:val="Normln"/>
-    <w:link w:val="TextbublinyChar"/>
+    <w:basedOn w:val="Normal"/>
+    <w:link w:val="BalloonTextChar"/>
     <w:rsid w:val="006B184D"/>
     <w:rPr>
       <w:rFonts w:ascii="Tahoma" w:hAnsi="Tahoma" w:cs="Tahoma"/>
@@ -11496,9 +11767,9 @@
       <w:szCs w:val="16"/>
     </w:rPr>
   </w:style>
-  <w:style w:type="character" w:customStyle="1" w:styleId="TextbublinyChar">
-    <w:name w:val="Text bubliny Char"/>
-    <w:link w:val="Textbubliny"/>
+  <w:style w:type="character" w:customStyle="1" w:styleId="BalloonTextChar">
+    <w:name w:val="Balloon Text Char"/>
+    <w:link w:val="BalloonText"/>
     <w:rsid w:val="006B184D"/>
     <w:rPr>
       <w:rFonts w:ascii="Tahoma" w:hAnsi="Tahoma" w:cs="Tahoma"/>
@@ -11527,9 +11798,9 @@
       <w:sz w:val="28"/>
     </w:rPr>
   </w:style>
-  <w:style w:type="character" w:customStyle="1" w:styleId="Nadpis1Char">
-    <w:name w:val="Nadpis 1 Char"/>
-    <w:link w:val="Nadpis1"/>
+  <w:style w:type="character" w:customStyle="1" w:styleId="Heading1Char">
+    <w:name w:val="Heading 1 Char"/>
+    <w:link w:val="Heading1"/>
     <w:uiPriority w:val="99"/>
     <w:qFormat/>
     <w:rsid w:val="003E28A9"/>
@@ -11541,66 +11812,66 @@
       <w:lang w:val="en-GB"/>
     </w:rPr>
   </w:style>
-  <w:style w:type="character" w:customStyle="1" w:styleId="Nadpis3Char">
-    <w:name w:val="Nadpis 3 Char"/>
-    <w:link w:val="Nadpis3"/>
+  <w:style w:type="character" w:customStyle="1" w:styleId="Heading3Char">
+    <w:name w:val="Heading 3 Char"/>
+    <w:link w:val="Heading3"/>
     <w:rsid w:val="006B184D"/>
     <w:rPr>
       <w:rFonts w:ascii="Arial" w:hAnsi="Arial"/>
       <w:b/>
     </w:rPr>
   </w:style>
-  <w:style w:type="character" w:customStyle="1" w:styleId="Nadpis4Char">
-    <w:name w:val="Nadpis 4 Char"/>
-    <w:link w:val="Nadpis4"/>
+  <w:style w:type="character" w:customStyle="1" w:styleId="Heading4Char">
+    <w:name w:val="Heading 4 Char"/>
+    <w:link w:val="Heading4"/>
     <w:rsid w:val="006B184D"/>
     <w:rPr>
       <w:rFonts w:ascii="Arial" w:hAnsi="Arial"/>
       <w:b/>
     </w:rPr>
   </w:style>
-  <w:style w:type="character" w:customStyle="1" w:styleId="Nadpis5Char">
-    <w:name w:val="Nadpis 5 Char"/>
-    <w:link w:val="Nadpis5"/>
+  <w:style w:type="character" w:customStyle="1" w:styleId="Heading5Char">
+    <w:name w:val="Heading 5 Char"/>
+    <w:link w:val="Heading5"/>
     <w:rsid w:val="006B184D"/>
     <w:rPr>
       <w:rFonts w:ascii="Arial" w:hAnsi="Arial"/>
       <w:b/>
     </w:rPr>
   </w:style>
-  <w:style w:type="character" w:customStyle="1" w:styleId="Nadpis6Char">
-    <w:name w:val="Nadpis 6 Char"/>
-    <w:link w:val="Nadpis6"/>
+  <w:style w:type="character" w:customStyle="1" w:styleId="Heading6Char">
+    <w:name w:val="Heading 6 Char"/>
+    <w:link w:val="Heading6"/>
     <w:rsid w:val="006B184D"/>
     <w:rPr>
       <w:rFonts w:ascii="Arial" w:hAnsi="Arial"/>
       <w:b/>
     </w:rPr>
   </w:style>
-  <w:style w:type="character" w:customStyle="1" w:styleId="Nadpis7Char">
-    <w:name w:val="Nadpis 7 Char"/>
+  <w:style w:type="character" w:customStyle="1" w:styleId="Heading7Char">
+    <w:name w:val="Heading 7 Char"/>
     <w:aliases w:val="not to be used 7 Char"/>
-    <w:link w:val="Nadpis7"/>
+    <w:link w:val="Heading7"/>
     <w:rsid w:val="006B184D"/>
     <w:rPr>
       <w:rFonts w:ascii="Arial" w:hAnsi="Arial"/>
       <w:b/>
     </w:rPr>
   </w:style>
-  <w:style w:type="character" w:customStyle="1" w:styleId="Nadpis8Char">
-    <w:name w:val="Nadpis 8 Char"/>
+  <w:style w:type="character" w:customStyle="1" w:styleId="Heading8Char">
+    <w:name w:val="Heading 8 Char"/>
     <w:aliases w:val="not to be used 8 Char"/>
-    <w:link w:val="Nadpis8"/>
+    <w:link w:val="Heading8"/>
     <w:rsid w:val="006B184D"/>
     <w:rPr>
       <w:rFonts w:ascii="Arial" w:hAnsi="Arial"/>
       <w:b/>
     </w:rPr>
   </w:style>
-  <w:style w:type="character" w:customStyle="1" w:styleId="Nadpis9Char">
-    <w:name w:val="Nadpis 9 Char"/>
+  <w:style w:type="character" w:customStyle="1" w:styleId="Heading9Char">
+    <w:name w:val="Heading 9 Char"/>
     <w:aliases w:val="not to be used 9 Char"/>
-    <w:link w:val="Nadpis9"/>
+    <w:link w:val="Heading9"/>
     <w:rsid w:val="006B184D"/>
     <w:rPr>
       <w:rFonts w:ascii="Arial" w:hAnsi="Arial"/>
@@ -11617,36 +11888,36 @@
       <w:sz w:val="18"/>
     </w:rPr>
   </w:style>
-  <w:style w:type="character" w:customStyle="1" w:styleId="ZhlavChar">
-    <w:name w:val="Záhlaví Char"/>
-    <w:link w:val="Zhlav"/>
+  <w:style w:type="character" w:customStyle="1" w:styleId="HeaderChar">
+    <w:name w:val="Header Char"/>
+    <w:link w:val="Header"/>
     <w:rsid w:val="006B184D"/>
     <w:rPr>
       <w:rFonts w:ascii="Arial" w:hAnsi="Arial"/>
       <w:sz w:val="18"/>
     </w:rPr>
   </w:style>
-  <w:style w:type="character" w:customStyle="1" w:styleId="ZpatChar">
-    <w:name w:val="Zápatí Char"/>
-    <w:link w:val="Zpat"/>
+  <w:style w:type="character" w:customStyle="1" w:styleId="FooterChar">
+    <w:name w:val="Footer Char"/>
+    <w:link w:val="Footer"/>
     <w:rsid w:val="006B184D"/>
     <w:rPr>
       <w:rFonts w:ascii="Arial" w:hAnsi="Arial"/>
       <w:sz w:val="18"/>
     </w:rPr>
   </w:style>
-  <w:style w:type="character" w:customStyle="1" w:styleId="ZkladntextChar">
-    <w:name w:val="Základní text Char"/>
-    <w:link w:val="Zkladntext"/>
+  <w:style w:type="character" w:customStyle="1" w:styleId="BodyTextChar">
+    <w:name w:val="Body Text Char"/>
+    <w:link w:val="BodyText"/>
     <w:rsid w:val="006B184D"/>
     <w:rPr>
       <w:rFonts w:ascii="Arial" w:hAnsi="Arial"/>
     </w:rPr>
   </w:style>
-  <w:style w:type="character" w:customStyle="1" w:styleId="TextpoznpodarouChar">
-    <w:name w:val="Text pozn. pod čarou Char"/>
+  <w:style w:type="character" w:customStyle="1" w:styleId="FootnoteTextChar">
+    <w:name w:val="Footnote Text Char"/>
     <w:aliases w:val="EPP16_Fußnotentext Char"/>
-    <w:link w:val="Textpoznpodarou"/>
+    <w:link w:val="FootnoteText"/>
     <w:rsid w:val="006B184D"/>
     <w:rPr>
       <w:rFonts w:ascii="Arial" w:hAnsi="Arial"/>
@@ -11680,8 +11951,8 @@
   </w:style>
   <w:style w:type="paragraph" w:customStyle="1" w:styleId="zzLc5">
     <w:name w:val="zzLc5"/>
-    <w:basedOn w:val="Normln"/>
-    <w:next w:val="Normln"/>
+    <w:basedOn w:val="Normal"/>
+    <w:next w:val="Normal"/>
     <w:rsid w:val="006B184D"/>
     <w:pPr>
       <w:tabs>
@@ -11691,8 +11962,8 @@
   </w:style>
   <w:style w:type="paragraph" w:customStyle="1" w:styleId="zzLc6">
     <w:name w:val="zzLc6"/>
-    <w:basedOn w:val="Normln"/>
-    <w:next w:val="Normln"/>
+    <w:basedOn w:val="Normal"/>
+    <w:next w:val="Normal"/>
     <w:rsid w:val="006B184D"/>
     <w:pPr>
       <w:tabs>
@@ -11702,8 +11973,8 @@
   </w:style>
   <w:style w:type="paragraph" w:customStyle="1" w:styleId="Figuretitle">
     <w:name w:val="Figure title"/>
-    <w:basedOn w:val="Normln"/>
-    <w:next w:val="Normln"/>
+    <w:basedOn w:val="Normal"/>
+    <w:next w:val="Normal"/>
     <w:rsid w:val="006B184D"/>
     <w:pPr>
       <w:suppressAutoHyphens/>
@@ -11716,7 +11987,7 @@
   </w:style>
   <w:style w:type="paragraph" w:customStyle="1" w:styleId="Nadpis">
     <w:name w:val="Nadpis"/>
-    <w:basedOn w:val="Normln"/>
+    <w:basedOn w:val="Normal"/>
     <w:rsid w:val="006B184D"/>
     <w:rPr>
       <w:b/>
@@ -11726,8 +11997,8 @@
   </w:style>
   <w:style w:type="paragraph" w:customStyle="1" w:styleId="a2">
     <w:name w:val="a2"/>
-    <w:basedOn w:val="Nadpis2"/>
-    <w:next w:val="Normln"/>
+    <w:basedOn w:val="Heading2"/>
+    <w:next w:val="Normal"/>
     <w:rsid w:val="006B184D"/>
     <w:pPr>
       <w:keepLines w:val="0"/>
@@ -11746,8 +12017,8 @@
   </w:style>
   <w:style w:type="paragraph" w:customStyle="1" w:styleId="a3">
     <w:name w:val="a3"/>
-    <w:basedOn w:val="Nadpis3"/>
-    <w:next w:val="Normln"/>
+    <w:basedOn w:val="Heading3"/>
+    <w:next w:val="Normal"/>
     <w:rsid w:val="006B184D"/>
     <w:pPr>
       <w:keepLines w:val="0"/>
@@ -11766,8 +12037,8 @@
   </w:style>
   <w:style w:type="paragraph" w:customStyle="1" w:styleId="a4">
     <w:name w:val="a4"/>
-    <w:basedOn w:val="Nadpis4"/>
-    <w:next w:val="Normln"/>
+    <w:basedOn w:val="Heading4"/>
+    <w:next w:val="Normal"/>
     <w:rsid w:val="006B184D"/>
     <w:pPr>
       <w:keepLines w:val="0"/>
@@ -11784,8 +12055,8 @@
   </w:style>
   <w:style w:type="paragraph" w:customStyle="1" w:styleId="a5">
     <w:name w:val="a5"/>
-    <w:basedOn w:val="Nadpis5"/>
-    <w:next w:val="Normln"/>
+    <w:basedOn w:val="Heading5"/>
+    <w:next w:val="Normal"/>
     <w:rsid w:val="006B184D"/>
     <w:pPr>
       <w:keepLines w:val="0"/>
@@ -11803,8 +12074,8 @@
   </w:style>
   <w:style w:type="paragraph" w:customStyle="1" w:styleId="a6">
     <w:name w:val="a6"/>
-    <w:basedOn w:val="Nadpis6"/>
-    <w:next w:val="Normln"/>
+    <w:basedOn w:val="Heading6"/>
+    <w:next w:val="Normal"/>
     <w:rsid w:val="006B184D"/>
     <w:pPr>
       <w:keepLines w:val="0"/>
@@ -11822,8 +12093,8 @@
   </w:style>
   <w:style w:type="paragraph" w:customStyle="1" w:styleId="ANNEX">
     <w:name w:val="ANNEX"/>
-    <w:basedOn w:val="Normln"/>
-    <w:next w:val="Normln"/>
+    <w:basedOn w:val="Normal"/>
+    <w:next w:val="Normal"/>
     <w:rsid w:val="006B184D"/>
     <w:pPr>
       <w:keepNext/>
@@ -11839,14 +12110,14 @@
   </w:style>
   <w:style w:type="paragraph" w:customStyle="1" w:styleId="Definition">
     <w:name w:val="Definition"/>
-    <w:basedOn w:val="Normln"/>
-    <w:next w:val="Normln"/>
+    <w:basedOn w:val="Normal"/>
+    <w:next w:val="Normal"/>
     <w:rsid w:val="006B184D"/>
   </w:style>
   <w:style w:type="paragraph" w:customStyle="1" w:styleId="Note">
     <w:name w:val="Note"/>
-    <w:basedOn w:val="Normln"/>
-    <w:next w:val="Normln"/>
+    <w:basedOn w:val="Normal"/>
+    <w:next w:val="Normal"/>
     <w:rsid w:val="006B184D"/>
     <w:pPr>
       <w:tabs>
@@ -11860,7 +12131,7 @@
   </w:style>
   <w:style w:type="paragraph" w:customStyle="1" w:styleId="Terms">
     <w:name w:val="Term(s)"/>
-    <w:basedOn w:val="Normln"/>
+    <w:basedOn w:val="Normal"/>
     <w:next w:val="Definition"/>
     <w:rsid w:val="006B184D"/>
     <w:pPr>
@@ -11873,7 +12144,7 @@
   </w:style>
   <w:style w:type="paragraph" w:customStyle="1" w:styleId="TermNum">
     <w:name w:val="TermNum"/>
-    <w:basedOn w:val="Normln"/>
+    <w:basedOn w:val="Normal"/>
     <w:next w:val="Terms"/>
     <w:rsid w:val="006B184D"/>
     <w:pPr>
@@ -11885,8 +12156,8 @@
   </w:style>
   <w:style w:type="paragraph" w:customStyle="1" w:styleId="Tabletitle">
     <w:name w:val="Table title"/>
-    <w:basedOn w:val="Normln"/>
-    <w:next w:val="Normln"/>
+    <w:basedOn w:val="Normal"/>
+    <w:next w:val="Normal"/>
     <w:rsid w:val="006B184D"/>
     <w:pPr>
       <w:keepNext/>
@@ -11902,7 +12173,7 @@
   </w:style>
   <w:style w:type="paragraph" w:customStyle="1" w:styleId="Tabletext10">
     <w:name w:val="Table text (10)"/>
-    <w:basedOn w:val="Normln"/>
+    <w:basedOn w:val="Normal"/>
     <w:rsid w:val="006B184D"/>
     <w:pPr>
       <w:spacing w:before="60" w:after="60" w:line="230" w:lineRule="atLeast"/>
@@ -11925,7 +12196,7 @@
   </w:style>
   <w:style w:type="paragraph" w:customStyle="1" w:styleId="Tabelle">
     <w:name w:val="Tabelle"/>
-    <w:basedOn w:val="Zkladntext"/>
+    <w:basedOn w:val="BodyText"/>
     <w:rsid w:val="006B184D"/>
     <w:pPr>
       <w:tabs>
@@ -11940,7 +12211,7 @@
   </w:style>
   <w:style w:type="paragraph" w:customStyle="1" w:styleId="Tabletext8">
     <w:name w:val="Table text (8)"/>
-    <w:basedOn w:val="Normln"/>
+    <w:basedOn w:val="Normal"/>
     <w:rsid w:val="006B184D"/>
     <w:pPr>
       <w:spacing w:before="60" w:after="60" w:line="190" w:lineRule="atLeast"/>
@@ -11954,8 +12225,8 @@
   </w:style>
   <w:style w:type="paragraph" w:customStyle="1" w:styleId="zzLn5">
     <w:name w:val="zzLn5"/>
-    <w:basedOn w:val="Normln"/>
-    <w:next w:val="Normln"/>
+    <w:basedOn w:val="Normal"/>
+    <w:next w:val="Normal"/>
     <w:rsid w:val="006B184D"/>
     <w:pPr>
       <w:tabs>
@@ -11970,8 +12241,8 @@
   </w:style>
   <w:style w:type="paragraph" w:customStyle="1" w:styleId="zzLn6">
     <w:name w:val="zzLn6"/>
-    <w:basedOn w:val="Normln"/>
-    <w:next w:val="Normln"/>
+    <w:basedOn w:val="Normal"/>
+    <w:next w:val="Normal"/>
     <w:rsid w:val="006B184D"/>
     <w:pPr>
       <w:tabs>
@@ -11986,8 +12257,8 @@
   </w:style>
   <w:style w:type="paragraph" w:customStyle="1" w:styleId="Example">
     <w:name w:val="Example"/>
-    <w:basedOn w:val="Normln"/>
-    <w:next w:val="Normln"/>
+    <w:basedOn w:val="Normal"/>
+    <w:next w:val="Normal"/>
     <w:rsid w:val="006B184D"/>
     <w:pPr>
       <w:tabs>
@@ -12004,8 +12275,8 @@
   </w:style>
   <w:style w:type="paragraph" w:customStyle="1" w:styleId="H6">
     <w:name w:val="H6"/>
-    <w:basedOn w:val="Nadpis5"/>
-    <w:next w:val="Normln"/>
+    <w:basedOn w:val="Heading5"/>
+    <w:next w:val="Normal"/>
     <w:rsid w:val="006B184D"/>
     <w:pPr>
       <w:suppressAutoHyphens w:val="0"/>
@@ -12041,7 +12312,7 @@
   </w:style>
   <w:style w:type="paragraph" w:customStyle="1" w:styleId="TAL">
     <w:name w:val="TAL"/>
-    <w:basedOn w:val="Normln"/>
+    <w:basedOn w:val="Normal"/>
     <w:rsid w:val="006B184D"/>
     <w:pPr>
       <w:keepNext/>
@@ -12059,7 +12330,7 @@
   </w:style>
   <w:style w:type="paragraph" w:customStyle="1" w:styleId="Normal1">
     <w:name w:val="Normal1"/>
-    <w:basedOn w:val="Normln"/>
+    <w:basedOn w:val="Normal"/>
     <w:rsid w:val="006B184D"/>
     <w:pPr>
       <w:overflowPunct w:val="0"/>
@@ -12076,8 +12347,8 @@
   </w:style>
   <w:style w:type="paragraph" w:customStyle="1" w:styleId="TH">
     <w:name w:val="TH"/>
-    <w:basedOn w:val="Normln"/>
-    <w:next w:val="Normln"/>
+    <w:basedOn w:val="Normal"/>
+    <w:next w:val="Normal"/>
     <w:rsid w:val="006B184D"/>
     <w:pPr>
       <w:keepNext/>
@@ -12098,8 +12369,8 @@
   </w:style>
   <w:style w:type="paragraph" w:customStyle="1" w:styleId="zzBiblio">
     <w:name w:val="zzBiblio"/>
-    <w:basedOn w:val="Normln"/>
-    <w:next w:val="Normln"/>
+    <w:basedOn w:val="Normal"/>
+    <w:next w:val="Normal"/>
     <w:rsid w:val="006B184D"/>
     <w:pPr>
       <w:pageBreakBefore/>
@@ -12113,9 +12384,9 @@
       <w:lang w:val="en-GB" w:eastAsia="ja-JP"/>
     </w:rPr>
   </w:style>
-  <w:style w:type="character" w:customStyle="1" w:styleId="NzevChar">
-    <w:name w:val="Název Char"/>
-    <w:link w:val="Nzev"/>
+  <w:style w:type="character" w:customStyle="1" w:styleId="TitleChar">
+    <w:name w:val="Title Char"/>
+    <w:link w:val="Title"/>
     <w:rsid w:val="006B184D"/>
     <w:rPr>
       <w:rFonts w:ascii="Arial" w:hAnsi="Arial" w:cs="Arial"/>
@@ -12126,9 +12397,9 @@
       <w:szCs w:val="32"/>
     </w:rPr>
   </w:style>
-  <w:style w:type="character" w:customStyle="1" w:styleId="UnresolvedMention">
-    <w:name w:val="Unresolved Mention"/>
-    <w:basedOn w:val="Standardnpsmoodstavce"/>
+  <w:style w:type="character" w:customStyle="1" w:styleId="UnresolvedMention1">
+    <w:name w:val="Unresolved Mention1"/>
+    <w:basedOn w:val="DefaultParagraphFont"/>
     <w:uiPriority w:val="99"/>
     <w:semiHidden/>
     <w:unhideWhenUsed/>
@@ -12140,8 +12411,8 @@
   </w:style>
   <w:style w:type="paragraph" w:customStyle="1" w:styleId="FirstParagraph">
     <w:name w:val="First Paragraph"/>
-    <w:basedOn w:val="Zkladntext"/>
-    <w:next w:val="Zkladntext"/>
+    <w:basedOn w:val="BodyText"/>
+    <w:next w:val="BodyText"/>
     <w:qFormat/>
     <w:rsid w:val="00396CC5"/>
     <w:pPr>
@@ -12153,6 +12424,17 @@
       <w:szCs w:val="24"/>
       <w:lang w:val="en-US" w:eastAsia="en-US"/>
     </w:rPr>
+  </w:style>
+  <w:style w:type="paragraph" w:styleId="ListParagraph">
+    <w:name w:val="List Paragraph"/>
+    <w:basedOn w:val="Normal"/>
+    <w:uiPriority w:val="34"/>
+    <w:qFormat/>
+    <w:rsid w:val="00275C6F"/>
+    <w:pPr>
+      <w:ind w:left="720"/>
+      <w:contextualSpacing/>
+    </w:pPr>
   </w:style>
 </w:styles>
 </file>

</xml_diff>